<commit_message>
WIP: build support for Bhaktisiddhanta's anvaya and discrepancy report
Co-Authored-By: Claude Opus 5.5 <noreply@anthropic.com>
Claude-Session: https://claude.ai/code/session_01KGC2T1PiSRGJe48WTtGST9
</commit_message>
<xml_diff>
--- a/chaitanya-chandramrita/Chaitanya-Chandramrita-ru-full.docx
+++ b/chaitanya-chandramrita/Chaitanya-Chandramrita-ru-full.docx
@@ -257,7 +257,13 @@
         <w:br/>
       </w:r>
       <w:r>
-        <w:t>транслитерация IAST; пословный перевод (с опорой на пословный разбор Бхактисиддханты); перевод.</w:t>
+        <w:t>транслитерация IAST; пословный перевод — полный перевод анвайи (пословного разбора) Бхактисиддханты</w:t>
+      </w:r>
+      <w:r>
+        <w:br/>
+      </w:r>
+      <w:r>
+        <w:t>в его порядке слов (в квадратных скобках — подразумеваемые слова, добавленные им); перевод.</w:t>
       </w:r>
     </w:p>
     <w:p>

</xml_diff>

<commit_message>
Chaitanya-chandramrita: full edition uses Bhaktisiddhanta's anvaya; discrepancy report
Co-Authored-By: Claude Opus 5.5 <noreply@anthropic.com>
Claude-Session: https://claude.ai/code/session_01KGC2T1PiSRGJe48WTtGST9
</commit_message>
<xml_diff>
--- a/chaitanya-chandramrita/Chaitanya-Chandramrita-ru-full.docx
+++ b/chaitanya-chandramrita/Chaitanya-Chandramrita-ru-full.docx
@@ -1306,10 +1306,10 @@
           <w:b w:val="0"/>
           <w:i/>
         </w:rPr>
-        <w:t>Пословно:</w:t>
-      </w:r>
-      <w:r>
-        <w:t xml:space="preserve"> стумах — славим; там — того; чайтанья-акритим — имеющего облик Чайтаньи (личность по имени Шри Кришна Чайтанья); ати-вимарьяда-парама-адбхута-аударьям — чья щедрость безгранична и высшим образом удивительна; варьям — лучшего (B: лучшего из всех аватар); враджапати-кумарам — сыну владыки Враджа (B: самому себе, не отличному от сына Нанды); расайитум — чтобы дать вкусить; вишуддха-сва-према-унмада-мадхура-пиюша-лахарим — волны сладкого нектара своей чистой, опьяняющей любви (B: восторга и прочих состояний, рождённых чистой любовью); прадатум — чтобы даровать; ча — и; аньебхьях — другим; пара-пада-навадвипа-пракатам — явившегося в высшей обители Навадвипе (B: в Навадвипе — обители девяти видов бхакти).</w:t>
+        <w:t>Пословно (анвайя Бхактисиддханты):</w:t>
+      </w:r>
+      <w:r>
+        <w:t xml:space="preserve"> враджапати-кумарам — [дать вкусить] самому себе, неотличному от сына владыки Враджа; вишуддха-сва-премонмада-мадхура-пийуша-лахарим — сладкие нектарные волны в виде радости и прочих чувств, поднимающиеся из его собственной чистой премы; расайитум — чтобы дать вкусить; аньебхьях ча — и другим; прадатум — чтобы даровать; [ях — тот, кто]; парапада-навадвипа-пракатам — явился в высшей обители, называемой Навадвипа, — престоле девятеричной бхакти; там — того; варьям — лучшего из всех аватар; ативимарьяда-парамадбхута-аударьям — воплощение безграничной и в высшей степени удивительной милости; чайтанья-акритим — личность по имени Шри Кришна Чайтанья; [ваям — мы, гаудия-сампрадая]; стумах — славим.</w:t>
       </w:r>
     </w:p>
     <w:p>
@@ -1369,15 +1369,6 @@
         </w:rPr>
         <w:t>Чтобы дать вкусить самому себе, неотличному от сына владыки Враджа, нектарные волны сладостных чувств, таких как радость и прочие, поднимающихся из океана его собственной пречистой премы, и чтобы раздать их другим, он явился в высшей обители, называемой «Шри Навадвипа», — престоле девятеричной бхакти. Эту личность по имени Шри Кришна Чайтанья — лучшего из всех аватар, воплощение безграничной и в высшей степени удивительной милости — мы славим.</w:t>
       </w:r>
-      <w:r>
-        <w:br/>
-      </w:r>
-      <w:r>
-        <w:rPr>
-          <w:sz w:val="20"/>
-        </w:rPr>
-        <w:t>Из пословного толкования: «мы» — это гаудия-сампрадая.</w:t>
-      </w:r>
     </w:p>
     <w:p>
       <w:pPr>
@@ -1483,10 +1474,10 @@
           <w:b w:val="0"/>
           <w:i/>
         </w:rPr>
-        <w:t>Пословно:</w:t>
-      </w:r>
-      <w:r>
-        <w:t xml:space="preserve"> дхарма-асприштах — не тронутый дхармой (B: в ком нет и капли благочестия); сатата — всегда; парама-авиштах — глубоко погружённый; эва — именно; ати-адхарме — в величайшее беззаконие (B: в великий грех); дриштим — взгляда; праптах — получивший; на хи кхалу — ни разу не; сатам — святых; сриштишу — в обителях (B: в местах, где пребывают садху); квапи — где-либо; но — не; сан — бывший; ят-датта-шри-хари-раса-судха-асвада-маттах — опьянённый вкусом нектара расы Шри и Хари, дарованного им (B: Шри — Радха, Хари — Кришна); пранритьяти — пляшет; уччаих — громко; гаяти — поёт; атха — и; вилутхати — катается по земле; стауми — славлю; там — этого; канчит — неописуемого; ишам — Владыку.</w:t>
+        <w:t>Пословно (анвайя Бхактисиддханты):</w:t>
+      </w:r>
+      <w:r>
+        <w:t xml:space="preserve"> [ях джанах — тот человек, который]; дхарма-асприштах — не коснувшийся дхармы, то есть в ком нет и капли благочестия и прочего; атьядхарме — в великом грехе; сатата-парамавиштах эва — постоянно, всецело погружённый; на хи кхалу сатам дриштим праптах — о котором известно, что он не удостоился милостивого взгляда святых; самсриштишу квапи ча но сан — и не пребывал ни в одном месте, связанном [со святыми]; [тадриша джанах — даже такой человек]; яд-датта-шри-хари-раса-судха-асвада-маттах [сан] — опьянённый вкусом нектара любовной расы, дарованной им: «Шри» означает Шримати Радхику, источник всякой красоты, а «Хари» — [Шри Кришну]; опьянённый вкусом нектара их премы; пранритьяти — танцует в высшей степени; уччаих гаяти — громко поёт; атха вилутхати ча — и катается по земле; там канчит ишам — такую могущественную, неописуемую личность; штауми — я славлю.</w:t>
       </w:r>
     </w:p>
     <w:p>
@@ -1546,15 +1537,6 @@
         </w:rPr>
         <w:t>Того, кого дхарма никогда не касалась, то есть в ком нет и тени благочестия, кто всегда погружён в великий грех, кто ни разу не удостоился милостивого взгляда святых и ни разу не побывал ни в одном святом месте, утверждённом праведниками и недоступном для греха, — даже такого великого грешника, опьянённого вкусом нектара любовной расы Радхи и Кришны, которую тот даровал, заставляет громко танцевать, петь и кататься по земле. Эту могущественную, неописуемую личность я славлю.</w:t>
       </w:r>
-      <w:r>
-        <w:br/>
-      </w:r>
-      <w:r>
-        <w:rPr>
-          <w:sz w:val="20"/>
-        </w:rPr>
-        <w:t>Из пословного толкования: в слове «Шри-Хари-раса» «Шри» — это Шримати Радхика, источник всякой красоты, а «Хари» — Шри Кришна.</w:t>
-      </w:r>
     </w:p>
     <w:p>
       <w:pPr>
@@ -1660,10 +1642,10 @@
           <w:b w:val="0"/>
           <w:i/>
         </w:rPr>
-        <w:t>Пословно:</w:t>
-      </w:r>
-      <w:r>
-        <w:t xml:space="preserve"> ят — что; на — не; аптам — достигнуто; карма-ништхаих — преданными обрядам; на ча — и не; самадхигатам — постигнуто; ят — что; тапах-дхьяна-йогаих — подвижничеством, медитацией и йогой (B: аштанга-йогой); вайрагьяих — отречением; тьяга-таттва-стутибхих — отказом от деяний, знанием истины и хвалебными гимнами; апи — даже; на — не; ят — что; таркитам — постигнуто догадкой; ча апи — и даже; каишчит — кем-либо; говинда-према-бхаджам — любящих Говинду; апи — даже; на ча — и не; калитам — изведано; ят — которое; рахасьям — сокровенное (B: сокровенная према); свайам — само собою; тат — то; намна — через Имя (B: через нама-киртану); эва — лишь; прадурасит — явилось; аватарати — когда нисходит; парé — Всевышний; ятра — который; там — того; науми — славлю, склоняюсь; гаурам — Гауру.</w:t>
+        <w:t>Пословно (анвайя Бхактисиддханты):</w:t>
+      </w:r>
+      <w:r>
+        <w:t xml:space="preserve"> кармаништхаих джанаих — людьми, привязанными к карме, то есть [карми]; ят — то, что; на аптам — не достигается; тапо-дхьяна-йогаих ча — и подвижничеством, медитацией, йогой и прочим; ят на самадхигатам — то, что никто не может постичь; каишчит апи [джанаих] вайрагьяих тьяга-таттва-стутибхир апи ят на таркитам ча — то, что никто не может осознать посредством отречения, отказа от кармы, [знания истины], [чтения хвалебных гимнов] и прочего; говинда-према-бхаджам апи [джананам] — даже людей, исполненных любви к Шри Кришне; на ча ят калитам — то, что не обретается; тат рахасьям — эта сокровенная према; ятра паре аватарати [сати] — когда нисходит Всевышний, Шри Гауранга; намнаива — лишь через нама-санкиртану; свайам прадур асит — сама собой проявилась; там гаурам — этого Гаурасундара; науми — я славлю.</w:t>
       </w:r>
     </w:p>
     <w:p>
@@ -1828,10 +1810,10 @@
           <w:b w:val="0"/>
           <w:i/>
         </w:rPr>
-        <w:t>Пословно:</w:t>
-      </w:r>
-      <w:r>
-        <w:t xml:space="preserve"> дриштах — увиденный; спириштах — тронутый; киртитах — воспетый; самсмритах — вспомненный; ва — или; дура-стхаих — находящимися далеко; апи — даже; анатах — тот, кому поклонились; ва — или; адритах — почтённый; ва — или; премнах — любви; сарам — суть (B: випраламбха-расу); датум — дать; ишах — способный; ях — который; эках — единственный; шри-чайтаньям — Шри Чайтанью; науми — славлю; девам — Бога; даялум — милостивого.</w:t>
+        <w:t>Пословно (анвайя Бхактисиддханты):</w:t>
+      </w:r>
+      <w:r>
+        <w:t xml:space="preserve"> ях — тот, кто; дриштах сприштах киртитах [сан] — становясь предметом видения, прикосновения и воспевания; дурастхаир апи [джанаих] самсмритах анатах адритах ва — или становясь предметом памятования, поклона и великого почитания со стороны людей, находящихся далеко; премнах сарам датум еках ишах — единственно способен дать суть премы; [там] даялум — того милостивого; девам шри-чайтаньям — Шри Чайтанья-деву; науми — я славлю.</w:t>
       </w:r>
     </w:p>
     <w:p>
@@ -1996,10 +1978,10 @@
           <w:b w:val="0"/>
           <w:i/>
         </w:rPr>
-        <w:t>Пословно:</w:t>
-      </w:r>
-      <w:r>
-        <w:t xml:space="preserve"> кайвальям — кайвалья (B: слияние с Ишварой); наракаяте — становится подобна аду; тридаша-пух — град тридцати трёх богов, рай; акаша-пушпаяте — подобен небесному цветку (т. е. призрачен); дурданта-индрия-кала-сарпа-патали — свора неукротимых чувств, этих смертоносных змей; протхата-дамштраяте — подобна змеям с вырванными ядовитыми зубами; вишвам — вселенная; пурна-сукхаяте — становится полной счастья; видхи-махендра-адих — Брахма, великий Индра и прочие; ча — и; китаяте — подобны червям; ят-карунья-катакша-вайбхава-ватам — у тех, чьё богатство — его милостивый взгляд; там — того; гаурам — Гауру; эва — лишь; стумах — славим.</w:t>
+        <w:t>Пословно (анвайя Бхактисиддханты):</w:t>
+      </w:r>
+      <w:r>
+        <w:t xml:space="preserve"> ят-карунья-катакша-вайбхававатам — для тех, чьё богатство — его милость, то есть милостивый взгляд; кайвальям — освобождение в виде слияния с Ишварой; наракаяте — кажется подобным аду; тридаша-пух — город тридаш: «тридаша» — трижды десять плюс три, то есть число тридцать три; среди [богов] главные — двенадцать адитьев, одиннадцать рудр, восемь васу и два Ашвини-кумара, эти тридцать три бога и есть тридаши, их город, то есть сварга; акаша-пушпаяте — кажется призрачным, как небесный цветок; дурданта-индрия-кала-сарпа-патали — сонм чувств, подобных змеям: «дурданта» — неукротимые, «кала» — крайне гневные; протхата-дамштраяте — ведёт себя как змеи с вырванными ядовитыми зубами; вишвам пурна-сукхаяте — вселенная ощущается обителью полного счастья, то есть повсюду видится присутствие Бхагавана; видхи-махендрадиш ча — и Брахма, Индра и прочие боги; китаяте — кажутся подобными червям, то есть положения владычества Брахмы, владычества Индры и прочие кажутся ничтожными, как у червя; там — того; гаурам эва — лишь Гаурасундара; [ваям — мы]; стумах — славим.</w:t>
       </w:r>
     </w:p>
     <w:p>
@@ -2059,15 +2041,6 @@
         </w:rPr>
         <w:t>Для преданных Гауры, богатых сокровищем милостивого взгляда Гаурасундара, кайвалья, или слияние с Ишварой, достигаемое йогами, подобна аду; Амарапури (город богов) — желанный или уже обретённый плод тех, кто исполняет свою дхарму ради исполнения желаний, — призрачен, как небесный цветок; полчища неукротимых чувств, подобных чёрным змеям смерти, — словно змеи с вырванными ядовитыми зубами; весь мир кажется обителью полного счастья, то есть […]; а положение Брахмы, владыки богов и прочих кажется положением червя. Этого Шри Гаурасундара мы славим.</w:t>
       </w:r>
-      <w:r>
-        <w:br/>
-      </w:r>
-      <w:r>
-        <w:rPr>
-          <w:sz w:val="20"/>
-        </w:rPr>
-        <w:t>Из пословного толкования: «тридаша» — тридцать три главных бога: двенадцать адитьев, одиннадцать рудр, восемь васу и два Ашвини-кумара; их «пур» — рай; «кала» означает «крайне гневный» (змей); «мир полон счастья» — то есть повсюду видится присутствие (бхава) Бхагавана; положения Брахмы, Индры и прочих кажутся ничтожными, как червь.</w:t>
-      </w:r>
     </w:p>
     <w:p>
       <w:pPr>
@@ -2173,10 +2146,10 @@
           <w:b w:val="0"/>
           <w:i/>
         </w:rPr>
-        <w:t>Пословно:</w:t>
-      </w:r>
-      <w:r>
-        <w:t xml:space="preserve"> мадьянтах — опьянённые; парипия — испив; ясья — чьих; чарана-амбходжа-срават-проджджвала-према-ананда-мая-амрита-адбхута-расан — дивные нектарные соки ослепительной любви и блаженства, струящиеся с лотосных стоп; сарве — все (B: все преданные Гауры); супарва-идитах — почитаемые богами; брахма-адин — Брахму и прочих; ча — и; хасанти — осмеивают; на ати-баху манйанте — не слишком почитают; маха-вайшнаван — великих вайшнавов (B: не преданных Гауре); дхиккурванти — порицают; ча — и; брахма-йога-видушах — знатоков Брахмана и йоги; там — этого; гаура-чандрам — Гаурачандру; нумах — славим.</w:t>
+        <w:t>Пословно (анвайя Бхактисиддханты):</w:t>
+      </w:r>
+      <w:r>
+        <w:t xml:space="preserve"> супарвейдитах — почитаемые даже богами; сарве — все, то есть все преданные Гауры; ясья — того, то есть Гаурачандры; чарана-амбходжа-срават-проджджвала-премананда-мая-амрита-адбхута-расан — дивную нектарную расу, исполненную премы и блаженства, крайне сияющую, струящуюся с его лотосных стоп; парипия — испив; мадьянтах [сантах] — опьянённые питьём; брахмадин — над Брахмой и прочими; хасанти — смеются; махавайшнаван ча — и великих вайшнавов, махабхагават, преданных Вишну; атибаху на маньянте — не почитают слишком; брахма-йога-видушах — знатоков Брахмана, поклоняющихся по принципу «я есть Он» (аханграха-упасака), и йогов восьмиступенчатой йоги; дхик курванти — порицают; там гаурачандрам — этого Гаурачандру; [ваям — мы]; стумах — славим.</w:t>
       </w:r>
     </w:p>
     <w:p>
@@ -2236,15 +2209,6 @@
         </w:rPr>
         <w:t>Преданные Гауры, которых чтят все боги, до краёв упившись дивной нектарной расой, исполненной высочайше сияющей премы и блаженства и струящейся с его лотосных стоп, в упоении любовным безумием глядят даже на Брахму и прочих и сокрушаются: «Увы, увы! Они лишены мёда лотосных стоп Гаурасундара!»; они не особенно чтят даже великих вайшнавов, лишённых преданности Гауре, и порицают знатоков Брахмана и последователей восьмиступенчатой йоги за их [тщетные старания]. Этого Шри Гаурасундара мы славим.</w:t>
       </w:r>
-      <w:r>
-        <w:br/>
-      </w:r>
-      <w:r>
-        <w:rPr>
-          <w:sz w:val="20"/>
-        </w:rPr>
-        <w:t>Из пословного толкования: «знатоки Брахмана» — это гьяни, поклоняющиеся себе как Брахману (ахам-граха-упасака).</w:t>
-      </w:r>
     </w:p>
     <w:p>
       <w:pPr>
@@ -2350,10 +2314,10 @@
           <w:b w:val="0"/>
           <w:i/>
         </w:rPr>
-        <w:t>Пословно:</w:t>
-      </w:r>
-      <w:r>
-        <w:t xml:space="preserve"> ракшо-дайтья-кулам — род ракшасов и дайтьев; хатам — истреблён; кият — велико ли; идам — это; йога-ади-вартма-крия-маргах — путь практик йоги и прочего (B: явленный Капилой и др.); ва — или; пракатикритах — явлен; кият идам — велико ли это; сришти-адикам — сотворение и прочее (B: творение, поддержание и разрушение мира аватарами гун); ва — или; кият — велико ли; медини-уддхарана-адикам — спасение земли и прочее (B: Варахой); кият идам — велико ли это; према-удджвалаях — сияющей любовью; маха-бхактех — великой бхакти; вартма-карим — прокладывающий путь; парам — лишь; бхагаватах — Господа; чайтанья-муртим — облик Чайтаньи; стумах — славим.</w:t>
+        <w:t>Пословно (анвайя Бхактисиддханты):</w:t>
+      </w:r>
+      <w:r>
+        <w:t xml:space="preserve"> [рама-нрисимхадибхих — аватарами Рамой, Нрисимхой и прочими]; ракшо-дайтья-кулам — род ракшасов и дайтьев; хатам — был уничтожен; идам кият — что же в этом деянии такого важного?; [капиладевадибхих — Капиладевой и прочими]; йогади-вартма-крия-маргах — путь действия на путях йоги и прочего; ва пракатикритах — был явлен; идам кият — что же в этом такого великого?; [гунаватара-брахмадина критам — совершённое гуна-аватарами Брахмой и прочими]; сриштьядикам — творение, поддержание, разрушение и прочие деяния; ва кият — что же и в этом такого превосходного?; [шри-варахадина критам — совершённое Шри Варахой и другими аватарами]; мединй-уддхаранадикам — поднятие земли и прочие деяния; идам кият — что же и в этом такого?; [ваям ту — мы же]; бхагаватах — к Бхагавану; премоджджвалаях махабхактех — высшей (пара) бхакти, сияющей премой; вартма-карим — показывающий путь; чайтанья-муртим — облик Чайтаньи; парам стумах — единственно славим.</w:t>
       </w:r>
     </w:p>
     <w:p>
@@ -2486,10 +2450,10 @@
           <w:b w:val="0"/>
           <w:i/>
         </w:rPr>
-        <w:t>Пословно:</w:t>
-      </w:r>
-      <w:r>
-        <w:t xml:space="preserve"> намах — поклон; чайтанья-чандрая — Чайтанье-Луне; коти-чандра-анана-твише — чьё лицо сияет [прекраснее] миллионов лун; према-ананда-абдхи-чандрая — луне океана любви и блаженства; чару-чандра-амшу-хасине — чья улыбка — прекрасные лунные лучи.</w:t>
+        <w:t>Пословно (анвайя Бхактисиддханты):</w:t>
+      </w:r>
+      <w:r>
+        <w:t xml:space="preserve"> коти-чандранана-твише — тому, чьё сияние лица прекраснее даже миллионов лун; премананда-абдхи-чандрая — тому, кто подобен луне в океане блаженства, рождённого премой; чару-чандрамшу-хасине — тому, чья улыбка подобна прекрасным лунным лучам; чайтанья-чандрая — Чайтанья-чандре; намах — поклон.</w:t>
       </w:r>
     </w:p>
     <w:p>
@@ -2654,10 +2618,10 @@
           <w:b w:val="0"/>
           <w:i/>
         </w:rPr>
-        <w:t>Пословно:</w:t>
-      </w:r>
-      <w:r>
-        <w:t xml:space="preserve"> ясья — чьим; эва — лишь; пада-амбуджа-бхакти-лабхьях — достижимая преданностью лотосным стопам; према-абхидханах — называемая премой; парамах — высшая; пумартхах — цель человека; тасмаи — ему; джаган-мангала-мангалая — благу блага мира; чайтанья-чандрая — Чайтанье-Луне; намах — поклон; намах — поклон; те — тебе.</w:t>
+        <w:t>Пословно (анвайя Бхактисиддханты):</w:t>
+      </w:r>
+      <w:r>
+        <w:t xml:space="preserve"> према-абхидханах парамах пумартхах — высшая цель человека, называемая премой; ясья эва — лишь чьими; пада-амбуджа-бхакти-лабхьях — достижима преданностью лотосным стопам; [бхавати — является]; тасмай — тому; джаган-мангала-мангалая — тому, кто есть благо блага мира: благо мира — бхаджана Шри Кришны, а ещё более благая — высшая према, обретаемая от него; то есть тому, кто есть благо блага мира; чайтанья-чандрая те — тебе, Чайтанья-чандра; намах намах — поклон снова и снова.</w:t>
       </w:r>
     </w:p>
     <w:p>
@@ -2717,15 +2681,6 @@
         </w:rPr>
         <w:t>Лишь от безраздельной преданности твоим лотосным стопам обретается высшая цель человека — према. Ты — тот Чайтанья-чандра, благо даже для блага мира; тебе мы кланяемся снова и снова.</w:t>
       </w:r>
-      <w:r>
-        <w:br/>
-      </w:r>
-      <w:r>
-        <w:rPr>
-          <w:sz w:val="20"/>
-        </w:rPr>
-        <w:t>Из пословного толкования: благо мира — это служение Шри Кришне; ещё большее благо — высшая према, которую обретают от него; поэтому он — «благо блага мира».</w:t>
-      </w:r>
     </w:p>
     <w:p>
       <w:pPr>
@@ -2831,10 +2786,10 @@
           <w:b w:val="0"/>
           <w:i/>
         </w:rPr>
-        <w:t>Пословно:</w:t>
-      </w:r>
-      <w:r>
-        <w:t xml:space="preserve"> уччаих — сильно; аспхалаянтам — размахивающего (B: в упоении танца двигающего туда-сюда); кара-чаранам — руками и ногами; ахо — о!; хема-данда-пракандау — огромные, как золотые жезлы; баху — обе руки; проддхритья — вскинув; сат-тандава-тарала-танум — чьё тело колышется в прекрасном неистовом танце; пундарика-аята-акшам — с очами, продолговатыми, как лотосы; вишвасья — вселенной; амангала-гхнам — уничтожающего неблагое; кимапи — неописуемыми; хари-хари-ити — «Хари, Хари!»; унмада-ананда-надаих — возгласами безумного блаженства; ванде — славлю; там — этого; дева-чуда-маним — венец богов (B: венец всех аватар); атула-раса-авишта-чайтанья-чандрам — Чайтанью-Луну, погружённого в несравненную расу.</w:t>
+        <w:t>Пословно (анвайя Бхактисиддханты):</w:t>
+      </w:r>
+      <w:r>
+        <w:t xml:space="preserve"> хема-данда-праканда баху — огромные руки, подобные золотым столпам; проддхритья — подняв; ахо — ах!; кара-чаранам — руки и ноги; уччаих аспхалаянтам — того, кто в упоении танцем высоко взмахивает; сат-тандава-тарала-танум — того, чьё тело стало подвижным от прекрасного бурного танца: «сат» — сладостный, «тандавена» — бурным танцем, «тарала» — подвижным стало тело; то есть того, чьё тело колышется прекрасным бурным танцем; пундарика-аятакшам — того, чьи глаза широки, как лотосы; кимапи хари хари ити унмада-ананда-надаих — неописуемыми звуками блаженства премы, исходящими из слов «Хари, Хари»; вишвасья — вселенной; амангала-гхнам — того, кто уничтожает неблагое; дева-чудаманим — венец-украшение богов; там — того; атула-раса-авишта-чайтанья-чандрам — Чайтанья-чандру, погружённого в несравненную расу; [ахам — я]; ванде — поклоняюсь.</w:t>
       </w:r>
     </w:p>
     <w:p>
@@ -2999,10 +2954,10 @@
           <w:b w:val="0"/>
           <w:i/>
         </w:rPr>
-        <w:t>Пословно:</w:t>
-      </w:r>
-      <w:r>
-        <w:t xml:space="preserve"> ананда-лила-мая-виграхая — чьё тело соткано из игр блаженства; хема-абха-дивья-чхави-сундарая — прекрасному божественным сиянием, подобным золоту; тасмаи — ему; маха-према-раса-прадая — дарующему расу великой любви (B: невиданную прежде возвышенную уджвала-расу); чайтанья-чандрая — Чайтанье-Луне; намах намах — поклон, поклон; те — тебе.</w:t>
+        <w:t>Пословно (анвайя Бхактисиддханты):</w:t>
+      </w:r>
+      <w:r>
+        <w:t xml:space="preserve"> ананда-лила-мая-виграхая — тому, чьё тело соткано из игр блаженства; хемабха-дивья-ччхави-сундарая — прекрасному божественным, подобным золоту сиянием; маха-према-раса-прадая — дарующему расу высочайшей сияющей премы, никогда прежде не даруемой; тасмай чайтанья-чандрая те — тому, тебе, Чайтанья-чандре; намо намах — поклон снова и снова.</w:t>
       </w:r>
     </w:p>
     <w:p>
@@ -3167,10 +3122,10 @@
           <w:b w:val="0"/>
           <w:i/>
         </w:rPr>
-        <w:t>Пословно:</w:t>
-      </w:r>
-      <w:r>
-        <w:t xml:space="preserve"> правахаих — потоками; ашрунам — слёз; нава-джалада-коти — [подобные] миллионам новых туч; ива — как; дришау — глаза; дадханам — имеющего; према-риддхья — богатством любви; парама-пада-коти-прахасанам — насмехающегося над миллионами высших обителей (Вайкунтх); вамантам — изливающего; мадхурьяих — сладостью; амрита-нидхи-котих — миллионы океанов нектара; ива — словно; тану-чхатабхих — сиянием тела; там — этого; ванде — славлю; харим — Хари; ахаха — ах!; саннйаса-капатам — принявшего личину санньясина.</w:t>
+        <w:t>Пословно (анвайя Бхактисиддханты):</w:t>
+      </w:r>
+      <w:r>
+        <w:t xml:space="preserve"> ахаха — о!; ашрунам правахаих — потоками слёз; нава-джалада-коти ива дришау дадханам — того, у кого глаза подобны миллионам новых туч; премардхья — богатством премы; парама-пада-коти-прахасанам — того, кто насмехается над миллионами высших обителей, то есть над миллионами Вайкунтх; тану-ччхатабхих мадхурьяир ва — сиянием тела или сладостью красоты и прелести его тела; амрита-нидхи-котих ива вамантам — того, кто словно изливает миллионы океанов нектара; там саннъяса-капатам — того, кто под предлогом принял облик санньясина, то есть исполняет роль санньясина, чтобы распространить пример ачарьи; харим — Гаурахари; ванде — поклоняюсь.</w:t>
       </w:r>
     </w:p>
     <w:p>
@@ -3230,15 +3185,6 @@
         </w:rPr>
         <w:t>О! Тот, чьи глаза в потоках слёз подобны миллионам новых дождевых туч; чьё богатство премы выставляет даже миллионы высших обителей, то есть Вайкунтх, ничтожными, словно предмет насмешки; чья красота и сладость тела словно изливают миллионы и миллионы океанов нектара; кто (чтобы люди, видя его в облике санньяси и кланяясь ему, благодаря плоду неведомого благочестия (агьята-сукрити) обрели бхакти к Кришне) притворно принял облик санньяси, — этого Шри Гаурахари я славлю.</w:t>
       </w:r>
-      <w:r>
-        <w:br/>
-      </w:r>
-      <w:r>
-        <w:rPr>
-          <w:sz w:val="20"/>
-        </w:rPr>
-        <w:t>Из пословного толкования: «притворный санньяси» — то есть разыгрывающий игру санньясы ради распространения игр ачарьи.</w:t>
-      </w:r>
     </w:p>
     <w:p>
       <w:pPr>
@@ -3352,10 +3298,10 @@
           <w:b w:val="0"/>
           <w:i/>
         </w:rPr>
-        <w:t>Пословно:</w:t>
-      </w:r>
-      <w:r>
-        <w:t xml:space="preserve"> симха-скандхам — с львиными плечами (B: шеей, как у льва); мадхура-мадхура-смера-ганда-стхала-антам — у которого края щёк сладко-сладко улыбаются; дурвиджнея-удджвала-раса-мая-ашчарья-нана-викарам — с множеством дивных преображений, рождённых непостижимой уджвала-расой (B: напр. «черепаший облик»); бибхрат — носящее; кантим — сияние; викача-канака-амбходжа-гарбха-абхирамам — пленительное, как сердцевина (тычинки) распустившегося золотого лотоса; экибхутам — ставшее единым; вапух — тело; авату — да хранит; вах — вас; радхая — с Радхой; мадхавасья — Мадхавы.</w:t>
+        <w:t>Пословно (анвайя Бхактисиддханты):</w:t>
+      </w:r>
+      <w:r>
+        <w:t xml:space="preserve"> симха-скандхам — того, чьи плечи высоки, как у льва; мадхура-мадхура-смера-ганда-стхалантам — того, на краях щёк которого расцветает сладкая-сладкая улыбка; дурвиджнея-уджджвала-раса-мая-ашчарья-нана-викарам — «дурвиджнея» — трудно постижимый даже для поклоняющихся Бхагавану, «уджджвала-расамая» — исполненный шрингара-расы, «ашчарья-нана-викарам» — обладающий дивными преображениями чувств, такими как форма черепахи, вызванными вкушением расы; то есть обладающий удивительнейшими преображениями, такими как форма черепахи, вызванными вкушением высочайшей уджджвала-расы, трудно постижимой даже для поклоняющихся Бхагавану; викача-канака-амбходжа-гарбха-абхирамам кантим — сияние, пленительное, как тычинки распустившегося золотого лотоса; [ях — тот, кто]; бибхрат — носит; радхаях мадхавасья ча — Радхи и Мадхавы; экибхутам вапух — соединённое тело; вах — вас; авату — да хранит.</w:t>
       </w:r>
     </w:p>
     <w:p>
@@ -3415,15 +3361,6 @@
         </w:rPr>
         <w:t>Тот, чья шея высока, как шея льва; чьи щёки по краям озарены сладчайшей нежной улыбкой; кто (непостижимо даже для бхагават, поклоняющихся Шри Кришне — воплощению расы единения, самбхоги) от избытка расы разлуки (випраламбхи) являет удивительные преображения чувств, такие как облик черепахи; чьё сияние тела пленительнее тычинок распустившегося золотого лотоса, — да хранит вас этот Шри Гаурасундар, тело, в котором соединились Радха и Мадхава.</w:t>
       </w:r>
-      <w:r>
-        <w:br/>
-      </w:r>
-      <w:r>
-        <w:rPr>
-          <w:sz w:val="20"/>
-        </w:rPr>
-        <w:t>Из пословного толкования: «уджджвала-расамая» — исполненный шрингара-расы (любовной расы).</w:t>
-      </w:r>
     </w:p>
     <w:p>
       <w:pPr>
@@ -3616,10 +3553,10 @@
           <w:b w:val="0"/>
           <w:i/>
         </w:rPr>
-        <w:t>Пословно:</w:t>
-      </w:r>
-      <w:r>
-        <w:t xml:space="preserve"> дриштва — увидев; мадьяти — пьянеет; нутана-амбуда-чаям — скопление новых туч; самвикшья — увидев; бархам — павлинье перо; бхавет — становится; атьянтам — крайне; викалах — смятённым; вилокья — увидев; валитам — свитую кольцом; гунджа-авалим — нить гунджи; вепате — дрожит; дриште — когда увиден; шьяма-кишораке — смуглый юноша; апи — даже; чакитам — изумлённо; дхатте — принимает; чаматкаритам — состояние изумления (B: чудесную красу); иттхам — так; гаура-танух — в облике Гауры; прачарита-ниджа-према — распространивший собственную любовь; харих — Хари; пату — да хранит; вах — вас.</w:t>
+        <w:t>Пословно (анвайя Бхактисиддханты):</w:t>
+      </w:r>
+      <w:r>
+        <w:t xml:space="preserve"> [ях — тот, кто]; нутана-амбуда-чаям — скопление новых туч; дриштва — увидев; мадьяти — пьянеет; [яш ча — и кто]; бархам — павлинье перо; самвикшья — увидев; атьянтам викалах бхавет — становится крайне взволнован; валитам — свёрнутую кольцом, как браслет; гунджавалим — нить ягод гунджи; вилокья — увидев; вепате — дрожит; шьяма-кишораке дришта апи — даже увидев смуглого юношу; чакитам — вздрогнув; чаматкаритам — дивность; дхатте — обретает; иттхам — таким образом; прачарита-ниджа-према — тот, кто распространил собственную прему; гаура-танух харих — Гауранга Хари; вах — вас; пату — да хранит.</w:t>
       </w:r>
     </w:p>
     <w:p>
@@ -3784,10 +3721,10 @@
           <w:b w:val="0"/>
           <w:i/>
         </w:rPr>
-        <w:t>Пословно:</w:t>
-      </w:r>
-      <w:r>
-        <w:t xml:space="preserve"> крипа-синдхух — океан милости; сандхья-аруна-ручи-вичитра-амбара-дхарах — облачённый в дивную одежду цвета алой зари; удджвалах — сияющий; пурнах — полный; према-амрита-мая-маха-джьотих — великий свет, сотканный из нектара любви; амалах — чистый; шачи-гарбха-кшира-амбудхи-бхавах — рождённый в молочном океане лона Шачи; удара-адбхута-калах — с прекрасными и дивными калами (B: 64 искусствами-расами; для луны — фазами); каланатхах — владыка кал, луна (B: также — источник всех аватар); шриман — прекрасный (B: соединённый со Шримати Радхикой); удаяту — да взойдёт; тава — твоего; сванта-набхаси — на небе сердца.</w:t>
+        <w:t>Пословно (анвайя Бхактисиддханты):</w:t>
+      </w:r>
+      <w:r>
+        <w:t xml:space="preserve"> крипа-синдхух — океан милости; сандхья-аруна-ручи-вичитра-амбара-дхарах — носящий дивные одежды красного цвета, как солнце в час вечерних сумерек; уджджвалах пурнах према-амрита-мая-маха-джьотих — сияющий, неделимый, исполненный нектара премы, обладающий сиянием саттвика- и прочих бхав; амалах — чистый; шачи-гарбха-кширамбудхи-бхавах — рождённый из молочного океана — лона Шачи; удара-адбхута-калах — обладающий прекрасными и удивительными шестьюдесятью четырьмя искусствами расы, начиная с утончённой искусности (вайдагдхьи); шриман — тело, соединённое со Шримати Радхикой, исполненной высшей красоты, или: исполненный высшей красоты; каланатхах — луна, или в другом смысле: сам Бхагаван, источник даже аватар-частей, таких как Матсья; тава — твоём (здесь: вашем); сванта-набхаси — в небе сердца; удаяту — да взойдёт.</w:t>
       </w:r>
     </w:p>
     <w:p>
@@ -3847,15 +3784,6 @@
         </w:rPr>
         <w:t>Тот, кто — океан милости, кто носит прелестное одеяние алого цвета, как [солнце] на вечерней заре, — этот сияющий, совершенный, сотканный из нектара премы, озарённый сиянием саттвика-бхав и прочих, безупречный, пленительный и наделённый изумительными шестьюдесятью четырьмя искусствами расы, начиная с вайдагдхьи (изысканности), рождённый из молочного океана лона Шачи, прекраснейший Шри Чайтанья-чандра, — да взойдёт он на небе ваших сердец.</w:t>
       </w:r>
-      <w:r>
-        <w:br/>
-      </w:r>
-      <w:r>
-        <w:rPr>
-          <w:sz w:val="20"/>
-        </w:rPr>
-        <w:t>Из пословного толкования: «Шриман» — тело, соединённое с Шримати Радхикой, исполненной высшей красоты, либо просто «исполненный высшей красоты»; «Каланатха» — луна, а в другом смысле — Сам Бхагаван, источник аватар-частей, таких как Матсья; «твоего» здесь означает «вашего».</w:t>
-      </w:r>
     </w:p>
     <w:p>
       <w:pPr>
@@ -3961,10 +3889,10 @@
           <w:b w:val="0"/>
           <w:i/>
         </w:rPr>
-        <w:t>Пословно:</w:t>
-      </w:r>
-      <w:r>
-        <w:t xml:space="preserve"> бадхнан — завязывая; према-бхара-пракампита-карах — с рукой, дрожащей от избытка любви; грантхин — узелки; кати-доракаих — на поясном шнуре; санкхьятум — чтобы считать; ниджа-лока-мангала-харе-кришна-ити — «Харе Кришна», несущих благо его миру; намнам — имён; джапан — повторяя; ашру-сната-мукхах — с лицом, омытым слезами; свам — себя; эва хи — самого; джаганнатхам — Джаганнатху; дидрикшух — желающий увидеть; гата-ятаих — хождением туда и обратно; гаура-танух — в облике Гауры; вилочана-мудам — радость очей; танван — распространяющий; харих — Хари; пату — да хранит; вах — вас.</w:t>
+        <w:t>Пословно (анвайя Бхактисиддханты):</w:t>
+      </w:r>
+      <w:r>
+        <w:t xml:space="preserve"> ниджа-лока-мангала-харе-кришнети намнам — своих имён «Харе Кришна», являющихся благом мира; санкхьятум — чтобы вести счёт повторениям; кати-доракаих — поясным шнуром; грантхин — узелки; бадхнан — завязывая; джапан [ча] — и повторяя; према-бхара-пракампита-карах — тот, чьи руки дрожат от избытка премы; ашру-сната-мукхах — с лицом, омытым слезами премы; свам эва хи джаганнатхам — Джаганнатху, неотличного от себя самого; дидрикшух — желая увидеть; гатаятаих — хождением туда и обратно; вилочана-мудам — радость глаз; танван — распространяя; гаура-танух харих — Гауранга Шри Хари; вах — вас; пату — да хранит.</w:t>
       </w:r>
     </w:p>
     <w:p>
@@ -4140,10 +4068,10 @@
           <w:b w:val="0"/>
           <w:i/>
         </w:rPr>
-        <w:t>Пословно:</w:t>
-      </w:r>
-      <w:r>
-        <w:t xml:space="preserve"> антар-дхванта-чаям — скопление внутренней тьмы (B: тьмы неведения в сердцах); самаста-джагатам — всех миров; унмулаянти — вырывающее с корнем; хатхат — внезапно; према-ананда-раса-амбудхим — океан расы любви и блаженства; ниравадхи — без конца; проддвелаянти — заставляющее выходить из берегов; балат — силой; вишвам — вселенную; шиталаянти — охлаждающее; атива — крайне; викалам — измученную; тапа-траена — тремя страданиями; анишам — непрестанно; юшмакам — ваших; хридае — в сердце; чакасту — да сияет; сататам — всегда; чайтанья-чандра-чхата — сияние Чайтаньи-Луны.</w:t>
+        <w:t>Пословно (анвайя Бхактисиддханты):</w:t>
+      </w:r>
+      <w:r>
+        <w:t xml:space="preserve"> самаста-джагатам — всего мира; антар-дхванта-чаям — скопление тьмы невежества, пребывающей в сердце; хатхат — внезапно; унмулаянти — уничтожающее с корнем; балат — силой; премананда-раса-амбудхим — океан расы блаженства премы; ниравадхи — беспрерывно; продвелаянти — в высшей степени увеличивающее; тапа-траена — тремя страданиями; анишам — непрестанно; викалам — подавленную; вишвам — вселенную; атива — крайне; шиталаянти — освежающее, орошая нектаром премы; чайтанья-чандра-ччхата — сияние тела Чайтанья-чандры; юшмакам — ваших; хридае — в сердцах; сататам — всегда; чакасту — да сияет.</w:t>
       </w:r>
     </w:p>
     <w:p>
@@ -4366,10 +4294,10 @@
           <w:b w:val="0"/>
           <w:i/>
         </w:rPr>
-        <w:t>Пословно:</w:t>
-      </w:r>
-      <w:r>
-        <w:t xml:space="preserve"> бхрантам — блуждали, сбились с пути; ятра — на котором; муни-ишвараих — владыками мудрецов; апи — даже; пура — некогда; ясмин — в который; кшама-мандале — на всём круге земли; касья апи — ничей; правивеша — вошёл; на эва — вовсе не; дхишана — ум; ят — который; веда — знал; но — не; ва — даже; шуках — Шука; ят — который; на — не; квапи — нигде; крипамаена — милостивым; ча — и; ниджэ — своим; апи — даже; удгхатитам — раскрыт; шаурина — Шаури (Кришной); тасмин — на этом; удджвала-бхакти-вартмани — пути сияющей бхакти; сукхам — радостно; кхеланти — играют; гаура-прийях — любимцы Гауры.</w:t>
+        <w:t>Пословно (анвайя Бхактисиддханты):</w:t>
+      </w:r>
+      <w:r>
+        <w:t xml:space="preserve"> пура — в древности; мунишвараир апи — даже владыками мудрецов; ятра [бхакти-марге] — на каком пути бхакти; бхрантам — заблуждались; кшама-мандале — на всей земле; касьяпи — ничья; дхишана — мысль; ясмин — в который [путь бхакти]; на правивеша эва — вовсе не проникла; шуках ва — даже Шука; ят — который [путь]; на веда — не знал; крипамаена шаурина — милостивым Шри Кришной; квапи — никогда; нидже апи джане — даже своим преданным; на удгхатитам — не был открыт; гаура-прийах — преданные, дорогие Гауре; тасмин уджджвала-бхакти-вартмани — на этом сияющем пути бхакти; сукхам кхеланти — радостно играют.</w:t>
       </w:r>
     </w:p>
     <w:p>
@@ -4534,10 +4462,10 @@
           <w:b w:val="0"/>
           <w:i/>
         </w:rPr>
-        <w:t>Пословно:</w:t>
-      </w:r>
-      <w:r>
-        <w:t xml:space="preserve"> тават — лишь до тех пор; брахма-катха — речи о Брахмане (B: о безличном Брахмане); вимукти-падави — путь освобождения; тават — до тех пор; на — не; тиктибхавет — становится горьким; тават — до тех пор; ча апи — и также; вишринкхалатвам — расшатанности, ослабления; аяте — достигает; но — не; лока-веда-стхитих — приверженность мирским и ведийским устоям; тават — до тех пор; шастра-видам — знатоков шастр; митхах — взаимный; калакалах — шумный спор; нана-бахих-вартмасу — о многочисленных внешних путях; шри-чайтанья-пада-амбуджа-прия-джанах — тот, кому дороги лотосные стопы Шри Чайтаньи; яват — пока; на — не; дриг-гочарах — увиден.</w:t>
+        <w:t>Пословно (анвайя Бхактисиддханты):</w:t>
+      </w:r>
+      <w:r>
+        <w:t xml:space="preserve"> яват — пока; шри-чайтанья-падамбуджа-прия-джанах — тот, кто погружён в питьё нектара лотосных стоп Шри Чайтаньи, то есть близкий Гауры; на дриг-гочарах [бхавет] — не становится видимым; тават — лишь до тех пор; брахма-катха — рассуждения о безличном Брахмане; тават — до тех пор; вимукти-падави — путь освобождения; на тиктибхавет — не кажется горьким; тават ча — и до тех пор; лока-веда-стхитир апи — даже порядок мирских и ведических обязанностей; но вишринкхалатвам аяте — не приходит в расстройство, то есть не нарушаются соответствующие границы; иными словами, узнав в общении с людьми Гауры о в высшей степени дивной бхакти, сияющей премой, человек оставляет ум, утверждённый в мирском и ведическом; тават эва — лишь до тех пор, то есть лишь пока не увидит красоту сияния ногтей лотосных стоп людей Гауры; нана-бахир-вартмасу — на многочисленных ложных внешних путях, порождённых умствованием; шастра-видам — знатоков шастр, то есть считающих себя пандитами; митхах — между собой; калакалах [бхавет] — идут споры и раздоры.</w:t>
       </w:r>
     </w:p>
     <w:p>
@@ -4597,15 +4525,6 @@
         </w:rPr>
         <w:t>Пока не попадёт в поле зрения близкий спутник Шри Чайтаньи — пчела, пьющая нектар его лотосных стоп, — лишь до тех пор рассуждения о безличном Брахмане и пути освобождения, такие как слияние с Ишварой, не кажутся горькими; лишь до тех пор мирские и ведические нормы не приходят в расстройство, то есть не оставляется «ум, утверждённый в мирском и ведическом»; лишь до тех пор неизбежны споры и раздоры о разнообразных путях, отвращённых от Господа, то есть […].</w:t>
       </w:r>
-      <w:r>
-        <w:br/>
-      </w:r>
-      <w:r>
-        <w:rPr>
-          <w:sz w:val="20"/>
-        </w:rPr>
-        <w:t>Из пословного толкования: узнав в общении с преданными Гауры о в высшей степени дивной бхакти, сияющей премой, человек оставляет «ум, утверждённый в мирском и ведическом»; «лишь до тех пор» — то есть пока не увидишь красоту сияния ногтей лотосных стоп преданных Гауры; «знатоки шастр» — люди, мнящие себя пандитами; «внешние пути» — порождённые умом ложные пути.</w:t>
-      </w:r>
     </w:p>
     <w:p>
       <w:pPr>
@@ -4711,10 +4630,10 @@
           <w:b w:val="0"/>
           <w:i/>
         </w:rPr>
-        <w:t>Пословно:</w:t>
-      </w:r>
-      <w:r>
-        <w:t xml:space="preserve"> ква — где; тават — такое; вайрагьям — отречение; ква — где; ча — и; вишая-вартасу — к разговорам о мирском; наракешу — к адам; ива — словно; удвегах — отвращение; ква — где; асау — та; винаябхара-апурья-лахари — волна, переполненная обилием смирения; ква — где; тават — такая; теджах — сила; алаукикам — неземная; атха — и; маха-бхакти-падави — путь великой бхакти; ква — где; са — тот; ва — же; самбхавья — возможен; ят — что; авакалитам — видится; гаура-гатишу — у тех, чьё прибежище — Гаура.</w:t>
+        <w:t>Пословно (анвайя Бхактисиддханты):</w:t>
+      </w:r>
+      <w:r>
+        <w:t xml:space="preserve"> гаура-гатишу — среди тех, чья «гати», то есть прибежище или цель, — Гаурахари; яд авакалитам — то [отречение и прочее], что видится, то есть ощущается; тават вайрагьям — такое отречение, то есть юкта-вайрагья, или привязанность к Бхагавану; ква — где?; ква ча — и где; таван — такая; вишая-вартасу — к разговорам о чувственных предметах; наракешу ива — как к аду; удвегах — тревога; ква ча — и где; асау винаябхара-апурья-лахари — эта переполняющая волна избытка смирения; тават алаукикам теджах ва — такое неземное могущество; ква — где?; атха са маха-бхакти-падави ва — и этот дивный путь бхакти, исполненный махабхавы; ква самбхавья — где возможен?</w:t>
       </w:r>
     </w:p>
     <w:p>
@@ -4774,15 +4693,6 @@
         </w:rPr>
         <w:t>У тех, для кого единственное прибежище — Гаурахари, видно беспричинное отречение, или привязанность к Бхагавану, — где ещё найти такое отречение? Где ещё такой страх, как перед падением в ад, при мирских разговорах или деревенских толках? Где ещё такая волна совершенной красоты смирения и кротости? Где ещё такое неземное могущество? И где ещё возможен такой дивный путь бхакти, исполненный махабхавы?</w:t>
       </w:r>
-      <w:r>
-        <w:br/>
-      </w:r>
-      <w:r>
-        <w:rPr>
-          <w:sz w:val="20"/>
-        </w:rPr>
-        <w:t>Из пословного толкования: «гаура-гати» — те, для кого Гаурахари — «гати», то есть прибежище или цель; их отречение — юкта-вайрагья.</w:t>
-      </w:r>
     </w:p>
     <w:p>
       <w:pPr>
@@ -4888,10 +4798,10 @@
           <w:b w:val="0"/>
           <w:i/>
         </w:rPr>
-        <w:t>Пословно:</w:t>
-      </w:r>
-      <w:r>
-        <w:t xml:space="preserve"> сакрит — однажды; наяна-гочари-крита-тад-ашру-дхара-акула-прапхулла-камала-икшана-пранайя-катара-шри-мукхах — тот, чьим глазам открылось его прекрасное, робкое от любви лицо с глазами-распустившимися лотосами, полными потоков слёз; на — не; гаура-чаранам — стопы Гауры; джихасати — хочет оставить; кадапи — когда-либо; локоттара-спхуран-мадхурима-арнавам — океан неземной, сверкающей сладости; нава-нава-анурага-унмадах — опьянённый всё новой и новой страстью.</w:t>
+        <w:t>Пословно (анвайя Бхактисиддханты):</w:t>
+      </w:r>
+      <w:r>
+        <w:t xml:space="preserve"> [ях — тот, кто]; сакрин-наяна-гочарикрита-тад-ашру-дхара-акула-прапхулла-камалекшана-пранная-катара-шри-мукхах — «пранная-катара» — охваченное любовью, «шри» — высшая красота, лицо, наделённое ею; каково оно? — «ашру-дхара-акула» — полное потоков слёз, с глазами, подобными распустившимся лотосам; оно «сакрит» — хоть раз — стало предметом его взора; то есть тот, кто хоть раз увидел прекрасное лицо, охваченное любовью, с глазами-лотосами, распустившимися и полными потоков слёз; нава-нава-анурага-унмадах [сан] — исполненный преображений чувств, таких как радость, гордость и прочие, рождённых всё новой и новой анурагой; локоттара-спхуран-мадхурима-арнавам — океан сладости, проявленной неземным образом; гаура-чаранам — стопы Гауры; кадапи — никогда; на джихасати — не желает оставить.</w:t>
       </w:r>
     </w:p>
     <w:p>
@@ -5056,10 +4966,10 @@
           <w:b w:val="0"/>
           <w:i/>
         </w:rPr>
-        <w:t>Пословно:</w:t>
-      </w:r>
-      <w:r>
-        <w:t xml:space="preserve"> ачарья — исполнив; дхармам — дхарму (B: варнашрамы); паричарья — послужив; вишнум — Вишну; вичарья — обойдя; тиртхани — святые места; вичарья — изучив; ведан — Веды; вина — без; на — не; гаура-прия-пада-севам — служения стопам любимцев Гауры; веда-ади-душпрапья-падам — обитель, недоступную даже Ведам и пр. (B: Шри Вриндавана-дхаму); виданти — познают.</w:t>
+        <w:t>Пословно (анвайя Бхактисиддханты):</w:t>
+      </w:r>
+      <w:r>
+        <w:t xml:space="preserve"> гаура-прия-пада-севам — служение стопам гаура-прия: тех, кому дорог Гаурасундар, или тех, кто дорог Гаурахари; вина — без; дхармам — дхарму варнашрамы и прочее; ачарья [апи] — даже исполнив, должным образом соблюдая; вишнум — вишну-таттву: Раму, Нараяну, Нрисимху и других; паричарья [апи] — даже превосходно поклоняясь; тиртхани — сотни святых мест: Каши, Канчи, Гаю и прочие; вичарья [апи] — даже обойдя или совершив парикраму; ведан — все Веды и шастры; вичарья [апи] — даже изучив; веда-ади-душпрапья-падам — обитель, труднодостижимую посредством Вед и прочего, или: описанную в Ведах и прочем очень сокровенно и потому непостижимую для обычных людей, — это сокровенное место, подножие Шри Радха-Говинды, Шри-дхаму Вриндавану; [ко'пи — никто]; на виданти — не может узнать.</w:t>
       </w:r>
     </w:p>
     <w:p>
@@ -5119,15 +5029,6 @@
         </w:rPr>
         <w:t>Даже исполняя дхарму варнашрамы, поклоняясь Вишну, обходя сотни святых мест, изучая все Веды и шастры и прочее, без служения лотосным стопам любимцев Гауры никто не может узнать обитель, труднодостижимую для Вед и прочего (не может найти Шри-дхаму Вриндаван — поле духовных игр Шри Радха-Говинды).</w:t>
       </w:r>
-      <w:r>
-        <w:br/>
-      </w:r>
-      <w:r>
-        <w:rPr>
-          <w:sz w:val="20"/>
-        </w:rPr>
-        <w:t>Из пословного толкования: «гаура-прия» — те, кому дорог Гаурасундар, или те, кто дорог Гаурахари; «Вишну» — вишну-таттва: Рама, Нараяна, Нрисимха и другие; «святые места» — Каши, Канчи, Гая и прочие; эта обитель труднодостижима потому, что в Ведах и прочем она описана очень сокровенно и недоступна пониманию обычных людей: это сокровенное место — подножие Шри Радха-Говинды.</w:t>
-      </w:r>
     </w:p>
     <w:p>
       <w:pPr>
@@ -5233,10 +5134,10 @@
           <w:b w:val="0"/>
           <w:i/>
         </w:rPr>
-        <w:t>Пословно:</w:t>
-      </w:r>
-      <w:r>
-        <w:t xml:space="preserve"> апараварам — безбрежный; чет — если; амрита-мая-патходхим — океан из нектара; адхикам — долго, усердно; виматхья — пахтая; праптам — добыта; сьят — была бы; кимапи — некая неописуемая; парамам — высшая; сарам — суть; атулам — несравненная; татхапи — всё же; шри-гаура-акрити-мадана-гопала-чарана-чхата-спириштанам — для тех, кого коснулось сияние стоп Мадана-Гопалы в облике Шри Гауры (B: Шри — Радхика; Мадана-Гопала, принявший её золотой цвет); тат — она; вахати — несёт; викатам — резкую; эва — лишь; катутам — горечь.</w:t>
+        <w:t>Пословно (анвайя Бхактисиддханты):</w:t>
+      </w:r>
+      <w:r>
+        <w:t xml:space="preserve"> [ядьяпи — даже если]; апараварам — безбрежный: «паравара» — оба берега; тот, у которого нет обоих берегов, то есть не имеющий берегов, бесконечный; амрита-мая-патходхим — «патходхи» — океан, вместилище вод; такой океан, водой которого является нектар; адхикам — обильно; виматхья — тщательно спахтав; идам кимапи — некая неописуемая; атулам — несравненная, лишённая подобия; парамам сарам — наивысшая суть; праптам сьят — будет добыта; татхапи тат васту — всё же эта вещь; шри-гаура-акрити-мадана-гопала-чарана-ччхата-сприштанам — для людей, которых коснулся свет (красота) стоп Мадана-Гопалы, золотого [сиянием] Шри: «Шри» — Шри Радхика, воплощение всех Лакшми; Мадана-Гопала, ставший золотым её сиянием, то есть Кришна, облечённый настроением и сиянием Шри Радхи, — Шри Гаурасундар; для тех, кого коснулось сияние его стоп; викатам эва катутам — именно ужасающей горечью; вахати — кажется.</w:t>
       </w:r>
     </w:p>
     <w:p>
@@ -5296,15 +5197,6 @@
         </w:rPr>
         <w:t>Даже если, пахтая с чрезвычайным усердием океан нектара, не имеющий берегов, извлечь какую-то неописуемую, наивысшую, несравненную драгоценную суть, — всё равно для тех, кого коснулись лучи стоп Мадана-Гопалы, то есть Кришны, облечённого настроением и сиянием Радхи, — Шри Гаурасундара, — она покажется крайне горькой.</w:t>
       </w:r>
-      <w:r>
-        <w:br/>
-      </w:r>
-      <w:r>
-        <w:rPr>
-          <w:sz w:val="20"/>
-        </w:rPr>
-        <w:t>Из пословного толкования: «Шри» — это Шри Радхика, воплощение всех Лакшми; её сиянием Мадана-Гопала стал золотистым.</w:t>
-      </w:r>
     </w:p>
     <w:p>
       <w:pPr>
@@ -5410,10 +5302,10 @@
           <w:b w:val="0"/>
           <w:i/>
         </w:rPr>
-        <w:t>Пословно:</w:t>
-      </w:r>
-      <w:r>
-        <w:t xml:space="preserve"> тринат — травы; апи — даже; ча — и; ничата — смирение, приниженность (B: отсутствие мирской гордыни); сахаджа-саумья-мугдха-акритих — от природы кроткий и пленительный облик; судха-мадхура-бхашита — речь, сладкая, как нектар; вишая-гандха-тхутхут-критих — плевок даже на запах чувственных предметов (B: не связанных с Кришной); хари-пранайя-вихвала — охваченный любовью к Хари; кимапи — неописуемо; дхих — ум; аналамбита — ни на что [внешнее] не опирающийся (B: полное забвение внешнего); бхаванти — бывают; кила — поистине; сад-гунах — благие качества; джагати — в мире; гаура-бхаджам — у преданных Гауре; ами — эти.</w:t>
+        <w:t>Пословно (анвайя Бхактисиддханты):</w:t>
+      </w:r>
+      <w:r>
+        <w:t xml:space="preserve"> тринад апи ча суничата — смирение ниже травы, то есть отсутствие материальной гордости; сахаджа-саумья-мугдха-акритих — естественный, кроткий, прекрасный облик; судха-мадхура-бхашита — речь, сладкая, как нектар; вишая-гандха-тхутхуткритих — плевок при одном запахе чувственных предметов, не связанных с Кришна-Чайтаньей; дхих хари-пранная-вихвала [сати] кимапи аналамбита — ум, охваченный любовью к Хари, полностью лишённый внешнего сознания; ами сад-гунах — эти благие качества; джагати — в мире; кила гаура-бхаджам [эва] бхаванти — бывают лишь у одних преданных Гауры.</w:t>
       </w:r>
     </w:p>
     <w:p>
@@ -5578,10 +5470,10 @@
           <w:b w:val="0"/>
           <w:i/>
         </w:rPr>
-        <w:t>Пословно:</w:t>
-      </w:r>
-      <w:r>
-        <w:t xml:space="preserve"> упасатам — пусть почитают; ва — или; гуру-варья-котих — миллионы лучших гуру; адхиятам — пусть изучают; ва — или; шрути-шастра-котих — миллионы шрути и шастр; чайтанья-карунья-катакша-бхаджам — у тех, на кого пал милостивый взгляд Чайтаньи; садьях — тотчас; парам — высшая; сьят — бывает; хи — поистине; рахасья-лабхах — обретение тайны (B: сокровенной премы).</w:t>
+        <w:t>Пословно (анвайя Бхактисиддханты):</w:t>
+      </w:r>
+      <w:r>
+        <w:t xml:space="preserve"> гуру-варья-котих — миллионы лучших гуру; упасатам — пусть принимают прибежище; ва — или; шрути-шастра-котих — миллионы шрути и шастр; адхиятам — пусть изучают; [паранту — но]; чайтанья-карунья-катакша-бхаджам — тех, кто обрёл милостивый взгляд Чайтаньи; хи — несомненно; садьях — немедленно; парам рахасья-лабхах — обретение сокровенной премы; сьят — бывает.</w:t>
       </w:r>
     </w:p>
     <w:p>
@@ -5746,10 +5638,10 @@
           <w:b w:val="0"/>
           <w:i/>
         </w:rPr>
-        <w:t>Пословно:</w:t>
-      </w:r>
-      <w:r>
-        <w:t xml:space="preserve"> астам — пусть будет; вайрагья-котих — миллионы видов отречения; бхавату — пусть будут; шама-дама-кшанти-маитра-ади-котих — миллионы [проявлений] спокойствия, обуздания чувств, терпения, дружелюбия и прочего; таттва-анудхьяна-котих — миллионы созерцаний истины (B: единства дживы и Брахмана); бхавату — пусть будут; бхавату ва — или пусть будут; вайшнави-бхакти-котих — миллионы [видов] вайшнавской бхакти; коти-амшах — миллионная доля; апи — даже; асья — этого; на сьят — не бывает; тат апи — всё же; гуна-ганах — множество качеств; ях — которое; сватах-сиддхах — само собой присуще; асте — пребывает; шримач-чайтанья-чандра-прия-чарана-накха-джьотих-амода-бхаджам — у тех, кто радуется сиянию ногтей на любимых стопах Шри Чайтаньи-Луны.</w:t>
+        <w:t>Пословно (анвайя Бхактисиддханты):</w:t>
+      </w:r>
+      <w:r>
+        <w:t xml:space="preserve"> вайрагья-котих — сильная или многообразная вайрагья; вайрагья бывает двух видов — пхалгу и юкта: отказ от вещей, связанных с Хари, как от мирских называется пхалгу-вайрагьей, а надлежащее принятие благоприятного, связанного с Кришной, — юкта-вайрагьей; астам — пусть будет; шама-дама-кшанти-майтрьяди-котих ва — или: шама — устойчивость в Бхагаване, дама — обуздание чувств, кшанти — терпимость, невозмутимость ума даже при поводе к волнению, майтри и прочее — чистота и прочее, — все эти бесчисленные качества; бхавату — пусть будут; таттва-анудхьяна-котих — миллионы медитаций на «тат твам аси», то есть на единство дживы и Брахмана; бхавату — пусть будут; вайшнави-бхакти-котих ва — или миллионы бхакти, связанной с Вишну; бхавату — пусть будут; тад апи — всё же; шримач-чайтанья-чандра-прия-чарана-накха-джьотир-амода-бхаджам — людей, обретших блаженство от сияния ногтей на стопах дорогих преданных всемогущего Чайтанья-чандры; ях — который; сватах-сиддхах — естественно присущий; гуна-ганах — сонм качеств; асте — пребывает; асья — его; коти-амшах апи — даже миллионной доли; [аньятра — в другом месте]; на сьят — нет.</w:t>
       </w:r>
     </w:p>
     <w:p>
@@ -5809,15 +5701,6 @@
         </w:rPr>
         <w:t>Пусть будет сильнейшее отречение, пусть будут бесчисленные качества — шама, дама, кшанти, майтри и прочие, пусть миллионы размышлений о единстве […] Брахмана и дживатмы завладеют сердцем, или пусть будут миллионы видов бхакти, связанной с Вишну, — но и одной доли из миллиона тех естественных качеств, что всегда пребывают в людях, радующихся сиянию ногтей стоп любимых преданных Шри Чайтанья-чандры, больше нигде не найти.</w:t>
       </w:r>
-      <w:r>
-        <w:br/>
-      </w:r>
-      <w:r>
-        <w:rPr>
-          <w:sz w:val="20"/>
-        </w:rPr>
-        <w:t>Из пословного толкования: отречение бывает двух видов — пхальгу и юкта: отказ от того, что связано с Хари, из-за того, что считаешь это мирским, называется пхальгу-вайрагьей, а принятие должным образом благоприятного, связанного с Кришной, — юкта-вайрагьей; шама — сосредоточенность на Бхагаване, дама — обуздание чувств, кшанти — терпение, невозмутимость ума даже при поводе к волнению, «майтри и прочее» — чистота и т. д.; «созерцание истины» — медитация на «тат твам аси», то есть на единство дживы и Брахмана.</w:t>
-      </w:r>
     </w:p>
     <w:p>
       <w:pPr>
@@ -5923,10 +5806,10 @@
           <w:b w:val="0"/>
           <w:i/>
         </w:rPr>
-        <w:t>Пословно:</w:t>
-      </w:r>
-      <w:r>
-        <w:t xml:space="preserve"> кечит — одни (B: Мурари Гупта и др.); сагара-бхудхаран — океаны и горы; апи — даже; паракраманти — перешагивают; нритьянти — пляшут; ваи — поистине; кечит — другие (B: Шриваса и др.); дева-пурандара-адишу — на Индру и прочих богов; маха-акшепам — великие упрёки; кшипантах — бросая; мухух — то и дело; ананда-удбхата-джала-вихвалатая — от смятения в сетях бурного блаженства; те — эти; адвайта-чандра-адаях — Адвайта-чандра и другие; ке ке — кто только; на уддхатаван — не неистовствовал; идриши — в таком; пунах — же; чайтанья-нритья-утсаве — празднике танца Чайтаньи.</w:t>
+        <w:t>Пословно (анвайя Бхактисиддханты):</w:t>
+      </w:r>
+      <w:r>
+        <w:t xml:space="preserve"> ананда-удбхата-джала-вихвалатая — из-за упоения безграничным блаженством, рождённым вкушением нектара премы; кечит — некоторые из преданных во главе с Мурари Гуптой; сагара-бхудхаран апи — даже океаны и горы; паракраманти — перешагивают; кечит — некоторые из преданных во главе со Шривасой; дева-пурандарадишу — на Индру и других богов; мухух — снова и снова; маха-акшепам — великое порицание; кшипантах — бросая; ваи нритьянти — танцуют; идриши — на таком; чайтанья-нритья-утсаве — празднике танца Шри Гауранги; те адвайтачандрадаях — те, во главе со Шри Адвайта Ачарьей; ке ке — кто, кто; пунах на уддхатавантах — не пришёл в неистовство?</w:t>
       </w:r>
     </w:p>
     <w:p>
@@ -6091,10 +5974,10 @@
           <w:b w:val="0"/>
           <w:i/>
         </w:rPr>
-        <w:t>Пословно:</w:t>
-      </w:r>
-      <w:r>
-        <w:t xml:space="preserve"> бхутах — был; ва — или; бхавита — будет; апи ва — или же; бхавати — есть; ва — или; касья апи — у кого-либо; ях ко 'пи — какая бы то ни было; ва — или; самбандхах — связь; бхагават-пада-амбуджа-расе — с расой лотосных стоп Господа; на — не; асмин — в этом; джаган-мандале — мире; тат сарвам — всё это; ниджа-бхакти-рупа-парама-аишварьена — высшим богатством — преданностью себе; викридитах — играющего; гаурасья — Гауры; асья — этого; крипа-виджримбхитатая — благодаря разлившейся милости; джананти — познают; нирматсарах — свободные от зависти.</w:t>
+        <w:t>Пословно (анвайя Бхактисиддханты):</w:t>
+      </w:r>
+      <w:r>
+        <w:t xml:space="preserve"> асмин джаган-мандале — в этом земном мире; бхагават-пада-амбуджа-расе — в расе лотосных стоп Бхагавана; касьяпи — ни у кого; ях ко'пи самбандхах — какая бы то ни было связь; на бхутах — не была; [на] бхавита — не будет; [на] бхавати апи ва — и не бывает даже сейчас; ниджа-бхакти-рупа-парамайшварьена — вместе с высшим богатством в виде преданности себе; викридитах — играющего; асья гаурасья — этого Гаурачандры; крипа-виджримбхитатая — благодаря проявлению милости; [тад-упалакшитах — озарённые этой милостью]; нирматсарах — люди, милосердные ко всем существам; тат сарвам — все те сладости расы; джананти — познают.</w:t>
       </w:r>
     </w:p>
     <w:p>
@@ -6153,15 +6036,6 @@
           <w:sz w:val="20"/>
         </w:rPr>
         <w:t>Никакой связи с расой лотосных стоп Бхагавана ни у кого в этом мире не было, не будет и нет; но, поскольку проявилась милость Гаурасундара, играющего со своим высшим богатством — преданностью себе, — отмеченные этой милостью преданные, свободные от зависти, познали всю эту сладость расы. То есть ту сокровенную связь с расой лотосных стоп Кришны, которой ни у кого никогда не было, не будет и нет и теперь, спутники Гауры по милости Гауры постоянно постигают.</w:t>
-      </w:r>
-      <w:r>
-        <w:br/>
-      </w:r>
-      <w:r>
-        <w:rPr>
-          <w:sz w:val="20"/>
-        </w:rPr>
-        <w:t>Из пословного толкования: «свободные от зависти» — исполненные сострадания ко всем существам.</w:t>
       </w:r>
     </w:p>
     <w:p>
@@ -6391,10 +6265,10 @@
           <w:b w:val="0"/>
           <w:i/>
         </w:rPr>
-        <w:t>Пословно:</w:t>
-      </w:r>
-      <w:r>
-        <w:t xml:space="preserve"> маха-пуруша-манинам — мнящих себя великими личностями; сура-муни-ишваранам — владык богов и мудрецов; ниджам — собственных (его); пада-амбуджам — лотосные стопы; аджанатам — не знающих; ким апи — неописуемым образом; гарва-нирвасанам — изгоняющего гордыню; ахо — о!; наяна-гочарам — зримым для глаз; нигама-чакра-чуда-чарам — того, кого ищут венцы (упанишады) всего множества Вед; шачи-сутам — сына Шачи; ачикарат — сделал; ках — какой (кто); иха — здесь, в этом мире; бхури-бхагья-удаях — великий восход удачи (необычайно удачливый).</w:t>
+        <w:t>Пословно (анвайя Бхактисиддханты):</w:t>
+      </w:r>
+      <w:r>
+        <w:t xml:space="preserve"> нигама-чакра-чудачаям — того, кого ищут Упанишады («нигама-чакра» — собрание шрути, их «чуда» — венцы, и «чая» — то, что ими ищется, то есть тот, кого ищут Упанишады, головное украшение Вед, — его); ниджам падамбуджам аджанатам — не ведающих собственных — Гаурахари — лотосных стоп; маха-пуруша-манинам — мнящих себя великими личностями; сура-муни-ишваранам — лучших из богов и лучших из мудрецов; кимапи гарва-нирвасанам — некоего сокрушителя гордыни; шачи-сутам — сына Шачи; [мад-видхе джане апи — даже для такого человека, как я]; наяна-гочарам — видимым глазу; ачикарат — сделал; ахо иха — ах, в этом мире; [идрик — такой]; бхури-бхагьодаях — весьма удачливый; ках — кто?</w:t>
       </w:r>
     </w:p>
     <w:p>
@@ -6454,15 +6328,6 @@
         </w:rPr>
         <w:t>Шачинандану — того, кого ищет гирлянда Упанишад, украшение всех шрути, — сокрушителя гордыни лучших из мудрецов и богов, мнящих себя великими личностями и не ведающих его собственных лотосных стоп, — кто сделал зримым даже для такого, как я? О! Кто в этом мире столь же великий счастливец?</w:t>
       </w:r>
-      <w:r>
-        <w:br/>
-      </w:r>
-      <w:r>
-        <w:rPr>
-          <w:sz w:val="20"/>
-        </w:rPr>
-        <w:t>Из пословного толкования: «нигама-чакра» — собрание шрути, их «чуда» (венцы) — Упанишады, «чая» — то, что ими ищется.</w:t>
-      </w:r>
     </w:p>
     <w:p>
       <w:pPr>
@@ -6528,10 +6393,10 @@
           <w:b w:val="0"/>
           <w:i/>
         </w:rPr>
-        <w:t>Пословно:</w:t>
-      </w:r>
-      <w:r>
-        <w:t xml:space="preserve"> сарва-садхана-хинах — лишённый всех средств практики; апи — даже; парама-ашчарья-вайбхаве — чьё величие высшим образом удивительно; гауранге — в Гауранге; ньяста-бхавах — вверивший своё сердце; ях — кто; сарва-артха-пурнах — исполненный всех целей (обретший высшую цель — према); эва — непременно; сах — тот.</w:t>
+        <w:t>Пословно (анвайя Бхактисиддханты):</w:t>
+      </w:r>
+      <w:r>
+        <w:t xml:space="preserve"> сарва-садхана-хинах апи — даже лишённый всех видов садханы; ях — тот, кто; парамашчарья-вайбхаве гауранге — в Гаурасундаре, обладающем в высшей степени удивительным величием; ньяста-бхавах — вручил свою читта-вритти (движения ума); сах — тот; сарвартха-пурнах — (сарва — […]; артха — према, то есть высшая цель человека — према к Кришне; обретя её, пурна — полный, то есть исполнивший все желания); эва [бхавати] — непременно становится.</w:t>
       </w:r>
     </w:p>
     <w:p>
@@ -6656,10 +6521,10 @@
           <w:b w:val="0"/>
           <w:i/>
         </w:rPr>
-        <w:t>Пословно:</w:t>
-      </w:r>
-      <w:r>
-        <w:t xml:space="preserve"> апи — даже; аганья-маха-пуньям — обладающего несметными великими заслугами; ананья-шаранам — не имеющего иного прибежища; харех — (кроме) Хари; анупасита-чайтаньям — не поклонявшегося Чайтанье; адханьям — несчастным (недостойным богатства любви); манъяте — считает; матих — (мой) разум.</w:t>
+        <w:t>Пословно (анвайя Бхактисиддханты):</w:t>
+      </w:r>
+      <w:r>
+        <w:t xml:space="preserve"> аганья-маха-пуньям — того, у кого несметные великие заслуги, — такого человека; харех ананья-шаранам апи — даже безраздельно предавшегося Хари; анупасита-чайтаньям [джанам] — того человека, который не поклонялся Кришна-Чайтанья-чандре; матих — мой разум; адханьям — (дхана — пятая цель человека, према; кто достоин этого богатства, тот «дханья», кто не «дханья», тот «адханья», то есть никто, кроме поклоняющихся Шри Чайтанья-чандре, не достоин обрести богатство премы); маньяте — считает.</w:t>
       </w:r>
     </w:p>
     <w:p>
@@ -6722,29 +6587,16 @@
     </w:p>
     <w:p>
       <w:pPr>
+        <w:pStyle w:val="Heading3"/>
+      </w:pPr>
+      <w:r>
+        <w:t>Шлока 32</w:t>
+      </w:r>
+    </w:p>
+    <w:p>
+      <w:pPr>
         <w:spacing w:after="60"/>
         <w:ind w:left="567"/>
-        <w:jc w:val="both"/>
-      </w:pPr>
-      <w:r>
-        <w:rPr>
-          <w:sz w:val="20"/>
-        </w:rPr>
-        <w:t>Из пословного толкования: «дхана» (богатство) — это према, пятая цель человека; «дханья» — тот, кто достоин этого богатства, а кто не «дханья», тот «а-дханья»: иначе говоря, без поклонения Шри Чайтанье-Луне никто не достоин обрести богатство премы.</w:t>
-      </w:r>
-    </w:p>
-    <w:p>
-      <w:pPr>
-        <w:pStyle w:val="Heading3"/>
-      </w:pPr>
-      <w:r>
-        <w:t>Шлока 32</w:t>
-      </w:r>
-    </w:p>
-    <w:p>
-      <w:pPr>
-        <w:spacing w:after="60"/>
-        <w:ind w:left="567"/>
       </w:pPr>
       <w:r>
         <w:rPr>
@@ -6837,10 +6689,10 @@
           <w:b w:val="0"/>
           <w:i/>
         </w:rPr>
-        <w:t>Пословно:</w:t>
-      </w:r>
-      <w:r>
-        <w:t xml:space="preserve"> крия-асактан — привязанных к обрядам; дхиг дхиг — позор, позор; виката-тапасах — суровым подвижникам; дхик — позор; ча — и; яминах — йогам, обуздывающим себя (ямой и прочим); дхик асту — да будет позор; брахма ахам — «я — Брахман»; вадана-парипхуллан — (тем, у кого) лицо расцветает (от этих слов); джада-матин — тупоумным; ким — к чему; этан — о них; шочамах — нам горевать; вишая-раса-маттан — опьянённых вкусом чувственных предметов; нара-пашун — двуногих животных; на — не; кешанчит — ни у кого из них; лешах апи — даже капли; ахаха — увы!; милитах — досталось; гаура-мадхунах — мёда (стоп) Гауры.</w:t>
+        <w:t>Пословно (анвайя Бхактисиддханты):</w:t>
+      </w:r>
+      <w:r>
+        <w:t xml:space="preserve"> крия-асактан — (крия — постоянные и периодические обряды, сандхья-вандана и прочее) привязанных к ним, то есть всегда к ним стремящихся, а потому; джада-матин — тупоумных (джада — равнодушных к подлинному поиску высшей цели, но поглощённых поиском крупицы бренного мирского, майического счастья, — таких); дхик — позор (несклоняемое слово, выражающее презрение); виката-тапасах — суровых подвижников (тех, кто летом терпит жар солнца, в сезон дождей — непрестанные ливни, в холодные сезоны стоит в воде, отращивает ногти, бороду и волосы или висит вниз головой, обходится без пищи и сна, совершая многотрудные аскезы, джапу, медитацию и прочее, — их); дхик — позор; яминах ча — и аскетов (тех, кто пытается обуздать чувства или ум ямой, ниямой и прочими ступенями восьмиступенчатой йоги, — и их); дхик — позор; брахмахам [ити шабдоччарана-матренайва — лишь произнесением слов «я — Брахман»]; вадана-парипхуллан — тех, чьи лица цветут (кто, лишь произнеся слова «я — Брахман», гордится, мня себя «освобождённым», и потому лицо его очень радостно, — их); дхик асту — позор; вишая-раса-маттан — опьянённых расой чувственных предметов (опьянённых гордостью наслаждения чувственными предметами, не связанными с Бхагаваном: ищущие безличного Брахмана ложные отреченные (пхальгу-тьяги) опьянены дурной расой отвращения от Бхагавана — мыслью «я освобождён», а жаждущие наслаждений, привязанные к обрядам, заняты наслаждением плодами этого и иного мира; итак, этих); нара-пашун — о людях-животных (о животных в облике людей: как деревенские животные едят и развлекаются, так и эти, не имея связи с Гаурой, всячески едят и развлекаются подобно им, — о них); ким шочамах — что ещё нам горевать?; ахаха — увы!; [этешам — из них]; кешанчит — ни у кого; гаура-мадхунах — мёда лотосных стоп Гауры; лешах апи — даже капли; на милитах — не досталось.</w:t>
       </w:r>
     </w:p>
     <w:p>
@@ -6903,29 +6755,16 @@
     </w:p>
     <w:p>
       <w:pPr>
+        <w:pStyle w:val="Heading3"/>
+      </w:pPr>
+      <w:r>
+        <w:t>Шлока 33</w:t>
+      </w:r>
+    </w:p>
+    <w:p>
+      <w:pPr>
         <w:spacing w:after="60"/>
         <w:ind w:left="567"/>
-        <w:jc w:val="both"/>
-      </w:pPr>
-      <w:r>
-        <w:rPr>
-          <w:sz w:val="20"/>
-        </w:rPr>
-        <w:t>Из пословного толкования: «крия» — постоянные и периодические обряды вроде сандхья-ванданы, а привязанные к ним «тупоумны» — равнодушны к подлинному поиску высшей цели, но заняты поиском крупицы бренного, мирского, майического счастья; «суровые подвижники» — те, кто летом терпит жар солнца, в сезон дождей — непрестанные ливни, в холодные сезоны стоит в воде, отращивает ногти, бороду и волосы или висит вниз головой, обходится без пищи и сна, совершая тяжкие аскезы, джапу, медитацию и прочее; «аскеты» (ямины) — те, кто пытается обуздать чувства и ум с помощью ямы, ниямы и прочих ступеней восьмиступенчатой йоги; «опьянённые вкусом чувственных предметов» — с одной стороны, ищущие безличного Брахмана ложные отреченные (пхальгу-тьяги), опьянённые дурной расой отвращения от Господа — мыслью «я освобождён», с другой — жаждущие наслаждений приверженцы обрядов, занятые плодами этого и иного мира; «двуногие животные» — подобно деревенским животным, они, не имея связи с Гаурой, лишь едят и развлекаются.</w:t>
-      </w:r>
-    </w:p>
-    <w:p>
-      <w:pPr>
-        <w:pStyle w:val="Heading3"/>
-      </w:pPr>
-      <w:r>
-        <w:t>Шлока 33</w:t>
-      </w:r>
-    </w:p>
-    <w:p>
-      <w:pPr>
-        <w:spacing w:after="60"/>
-        <w:ind w:left="567"/>
       </w:pPr>
       <w:r>
         <w:rPr>
@@ -7018,10 +6857,10 @@
           <w:b w:val="0"/>
           <w:i/>
         </w:rPr>
-        <w:t>Пословно:</w:t>
-      </w:r>
-      <w:r>
-        <w:t xml:space="preserve"> пашанах — камень; паришечитах — сколько ни поливаемый; амрита-расаих — нектарными соками; на эва — никак не; анкурах — росток; самбхавет — появится; лангулам — хвост; сарама-патех — пса; вивринатах — распрямляющего; сьят — станет; асья — его; на эва — никак не; арджавам — прямизна; хастау — руки; уннаята — (человеком,) поднимающим вверх; будхах — о мудрые; катхам — как; ахо — о!; дхарьям — может быть удержан; видхох — луны; мандалам — диск; сарвам — все; садханам — средства практики; асту — пусть будут; гаура-каруна-абхаве — без милости Гауры; на — нет; бхава-утсавах — праздника чувства (любви).</w:t>
+        <w:t>Пословно (анвайя Бхактисиддханты):</w:t>
+      </w:r>
+      <w:r>
+        <w:t xml:space="preserve"> [хе] будхах — о учёные; пашанах — камень; амрита-расаих — потоками нектара; паришечитах [апи] — (пари — всесторонне, обильно; сечита — орошённый) даже если орошён; [тасья — у него]; анкурах наива самбхавет — появление ростка никогда невозможно; лангулам вивринатах — расправляющего хвост; сарама-патех — собаки; асья [лангуласья] — этого расправленного хвоста; арджавам — прямота; наива [бхавати] — никогда не бывает; хастау уннаята [джанена] — человеком, поднимающим руки; видхох мандалам — лунный диск; катхам дхарьям — как удержать? (то есть, лишь подняв руки, человек не может коснуться лунного диска); сарвам садханам асту — пусть будут все средства практики, но даже тогда; гаура-каруна-абхаве — при отсутствии милости Гаурасундары, то есть без милости; на бхавотсавах — праздник [премы] (OCR неясно) никогда не возможен.</w:t>
       </w:r>
     </w:p>
     <w:p>
@@ -7146,10 +6985,10 @@
           <w:b w:val="0"/>
           <w:i/>
         </w:rPr>
-        <w:t>Пословно:</w:t>
-      </w:r>
-      <w:r>
-        <w:t xml:space="preserve"> аватирне — когда снизошёл; гаура-чандре — Гаурачандра; вистирне — когда разлился; према-сагаре — океан любви; су-пракашита-ратна-огхе — в котором ярко засияло множество самоцветов (девять видов бхакти, бхавы, имена); ях — кто; динах — беден; динах — беден (злосчастен); эва — поистине; сах — тот.</w:t>
+        <w:t>Пословно (анвайя Бхактисиддханты):</w:t>
+      </w:r>
+      <w:r>
+        <w:t xml:space="preserve"> вистирне према-сагаре — в широком океане премы; гаура-чандре аватирне [сати] — когда Гаурачандра взошёл; [тена — им]; су-пракашита-ратнаугхе — когда множество самоцветов прекрасно освещено (су — прекрасно, пракашита — освещены, ратна — самоцветы, огха — множество, то есть когда яркое сияние Шри Гаурачандры прекрасно осветило самоцветы сокровищницы премы — девять видов бхакти, или бхавы, питаемые вибхавами, анубхавами, саттвика- и вьябхичари-бхавами и прочими ингредиентами, или ожерелье самоцветов-имён «Харе Кришна» и др.); ях динах — кто остаётся бедным; сах динах эва — тот поистине беден (то есть кто, оставив самоцветы океана премы, освещённого лучами Гаурачандры, желает искать в другом месте ржавчину и окалину, того бедность никогда не покидает: не приняв прибежища лотосных стоп Гауры-луны, он не избавится от бедности, вечно трудясь ради того, что не есть богатство, и оставаясь лишённым богатства премы).</w:t>
       </w:r>
     </w:p>
     <w:p>
@@ -7212,29 +7051,16 @@
     </w:p>
     <w:p>
       <w:pPr>
+        <w:pStyle w:val="Heading3"/>
+      </w:pPr>
+      <w:r>
+        <w:t>Шлока 35</w:t>
+      </w:r>
+    </w:p>
+    <w:p>
+      <w:pPr>
         <w:spacing w:after="60"/>
         <w:ind w:left="567"/>
-        <w:jc w:val="both"/>
-      </w:pPr>
-      <w:r>
-        <w:rPr>
-          <w:sz w:val="20"/>
-        </w:rPr>
-        <w:t>Из пословного толкования: самоцветы этого океана, ярко освещённые сиянием Шри Гаурачандры, — это девять видов бхакти, или же бхавы, питаемые вибхавами, анубхавами, саттвика- и вьябхичари-бхавами и прочим, или же ожерелье самоцветов имени «Харе Кришна» и др.; кто, оставив самоцветы океана премы, освещённого лучами Гаурачандры, желает искать в другом месте ржавчину и окалину, того бедность никогда не покинет: не приняв прибежища лотосных стоп Гауры-Луны, он вечно трудится ради того, что не есть богатство, и остаётся лишён богатства премы.</w:t>
-      </w:r>
-    </w:p>
-    <w:p>
-      <w:pPr>
-        <w:pStyle w:val="Heading3"/>
-      </w:pPr>
-      <w:r>
-        <w:t>Шлока 35</w:t>
-      </w:r>
-    </w:p>
-    <w:p>
-      <w:pPr>
-        <w:spacing w:after="60"/>
-        <w:ind w:left="567"/>
       </w:pPr>
       <w:r>
         <w:rPr>
@@ -7287,10 +7113,10 @@
           <w:b w:val="0"/>
           <w:i/>
         </w:rPr>
-        <w:t>Пословно:</w:t>
-      </w:r>
-      <w:r>
-        <w:t xml:space="preserve"> аватирне — когда снизошёл; гаура-чандре — Гаурачандра; вистирне — когда разлился; према-сагаре — океан любви; йе — те, кто; на мадджанти — не погружаются (в него); мадджанти — тонут; те — они; маха-анартха-сагаре — в океане великих бед.</w:t>
+        <w:t>Пословно (анвайя Бхактисиддханты):</w:t>
+      </w:r>
+      <w:r>
+        <w:t xml:space="preserve"> вистирне према-сагаре — в широком океане-сокровищнице премы, или в океане расы премы; гаура-чандре аватирне [сати] — когда взошла Гаура-луна; йе [джанах татра] — те люди, которые в этот океан расы или в эту сокровищницу; на мадджанти — не окунаются; те — они; маха-анартха-сагаре — в океане великих анартх (при толковании океана как сокровищницы самоцветов: артха — Кришна, или высшая цель — према, анартха — её противоположность: всё, что не Кришна, или четыре цели человека; при толковании как океана расы — в океане ослиной мочи, то есть анартх — жажды почёта (пратиштха-аши), лукавства (кутинати) и прочего); мадджанти — тонут.</w:t>
       </w:r>
     </w:p>
     <w:p>
@@ -7353,29 +7179,16 @@
     </w:p>
     <w:p>
       <w:pPr>
+        <w:pStyle w:val="Heading3"/>
+      </w:pPr>
+      <w:r>
+        <w:t>Шлока 36</w:t>
+      </w:r>
+    </w:p>
+    <w:p>
+      <w:pPr>
         <w:spacing w:after="60"/>
         <w:ind w:left="567"/>
-        <w:jc w:val="both"/>
-      </w:pPr>
-      <w:r>
-        <w:rPr>
-          <w:sz w:val="20"/>
-        </w:rPr>
-        <w:t>Из пословного толкования: если понимать «океан» как сокровищницу самоцветов, то «артха» — это Кришна, или высшая цель — према, а «анартха» — её противоположность: всё, что не Кришна, или четыре цели человека (чатур-варга); если же понимать его как океан расы, то «анартхи» — жажда почёта (пратиштха-аша), лукавство (кутинати) и прочее, и это — океан ослиной мочи.</w:t>
-      </w:r>
-    </w:p>
-    <w:p>
-      <w:pPr>
-        <w:pStyle w:val="Heading3"/>
-      </w:pPr>
-      <w:r>
-        <w:t>Шлока 36</w:t>
-      </w:r>
-    </w:p>
-    <w:p>
-      <w:pPr>
-        <w:spacing w:after="60"/>
-        <w:ind w:left="567"/>
       </w:pPr>
       <w:r>
         <w:rPr>
@@ -7428,10 +7241,10 @@
           <w:b w:val="0"/>
           <w:i/>
         </w:rPr>
-        <w:t>Пословно:</w:t>
-      </w:r>
-      <w:r>
-        <w:t xml:space="preserve"> прасарита-маха-према-пиюша-раса-сагаре — когда простёрся океан нектарной расы великой любви; чайтанья-чандре — Чайтанья-Луна; пракате — когда явилась; ях — кто; динах — беден; динах — беден (злосчастен); эва — поистине; сах — тот.</w:t>
+        <w:t>Пословно (анвайя Бхактисиддханты):</w:t>
+      </w:r>
+      <w:r>
+        <w:t xml:space="preserve"> прасарита-маха-према-пиюша-раса-сагаре — в океане, где (прасарита — весьма широкий, махан — превосходный) према есть пиюша, то есть нектарная раса, — в нём; чайтанья-чандре пракате [сати] — когда взошла Чайтанья-луна; ях динах сах динах эва — кто беден, тот поистине беден (кто не принял прибежища стоп Гауры, тот глупее глупого).</w:t>
       </w:r>
     </w:p>
     <w:p>
@@ -7494,29 +7307,16 @@
     </w:p>
     <w:p>
       <w:pPr>
+        <w:pStyle w:val="Heading3"/>
+      </w:pPr>
+      <w:r>
+        <w:t>Шлока 37</w:t>
+      </w:r>
+    </w:p>
+    <w:p>
+      <w:pPr>
         <w:spacing w:after="60"/>
         <w:ind w:left="567"/>
-        <w:jc w:val="both"/>
-      </w:pPr>
-      <w:r>
-        <w:rPr>
-          <w:sz w:val="20"/>
-        </w:rPr>
-        <w:t>Из пословного толкования: «бедный» здесь — тот, кто не принял прибежища стоп Гауры; он глупее самого глупого.</w:t>
-      </w:r>
-    </w:p>
-    <w:p>
-      <w:pPr>
-        <w:pStyle w:val="Heading3"/>
-      </w:pPr>
-      <w:r>
-        <w:t>Шлока 37</w:t>
-      </w:r>
-    </w:p>
-    <w:p>
-      <w:pPr>
-        <w:spacing w:after="60"/>
-        <w:ind w:left="567"/>
       </w:pPr>
       <w:r>
         <w:rPr>
@@ -7569,10 +7369,10 @@
           <w:b w:val="0"/>
           <w:i/>
         </w:rPr>
-        <w:t>Пословно:</w:t>
-      </w:r>
-      <w:r>
-        <w:t xml:space="preserve"> ачайтаньям — лишённый сознания (неодушевлённый, материальный; игра слов: «без Чайтаньи»); идам — этот; вишвам — мир (в этом мире); яди — если; чайтаньям — Чайтанью; ишварам — Богом; на видух — не знают; сарва-шастра-джнах — знатоки всех шастр; хи апи — даже; бхрамьянти — блуждают; те — те; джанах — люди.</w:t>
+        <w:t>Пословно (анвайя Бхактисиддханты):</w:t>
+      </w:r>
+      <w:r>
+        <w:t xml:space="preserve"> сарва-шастра-джнях [джанах] апи — даже люди, сведущие во всех шастрах; яди чайтаньям — если Шри Чайтанья-дэву; ишварам на видух — не знают как самого Бхагавана; те — они; ачайтаньям идам вишвам — в этом бессознательном материальном мире; бхрамьянти — блуждают (то есть, подвластные плодам кармы, лишь странствуют по раю, аду и прочим мирам, и их приходам и уходам нет конца).</w:t>
       </w:r>
     </w:p>
     <w:p>
@@ -7635,29 +7435,16 @@
     </w:p>
     <w:p>
       <w:pPr>
+        <w:pStyle w:val="Heading3"/>
+      </w:pPr>
+      <w:r>
+        <w:t>Шлока 38</w:t>
+      </w:r>
+    </w:p>
+    <w:p>
+      <w:pPr>
         <w:spacing w:after="60"/>
         <w:ind w:left="567"/>
-        <w:jc w:val="both"/>
-      </w:pPr>
-      <w:r>
-        <w:rPr>
-          <w:sz w:val="20"/>
-        </w:rPr>
-        <w:t>Из пословного толкования: подвластные плодам своих дел, они лишь блуждают по раю, аду и прочим мирам, и их приходам и уходам нет конца.</w:t>
-      </w:r>
-    </w:p>
-    <w:p>
-      <w:pPr>
-        <w:pStyle w:val="Heading3"/>
-      </w:pPr>
-      <w:r>
-        <w:t>Шлока 38</w:t>
-      </w:r>
-    </w:p>
-    <w:p>
-      <w:pPr>
-        <w:spacing w:after="60"/>
-        <w:ind w:left="567"/>
       </w:pPr>
       <w:r>
         <w:rPr>
@@ -7750,10 +7537,10 @@
           <w:b w:val="0"/>
           <w:i/>
         </w:rPr>
-        <w:t>Пословно:</w:t>
-      </w:r>
-      <w:r>
-        <w:t xml:space="preserve"> свадам свадам — снова и снова вкушая; мадхурима-бхарам — полноту сладости; свия-нама-авалинам — собственных имён; мадам мадам — снова и снова пьянея; ким апи — неописуемо; вивашибхута-висраста-гатрах — потерявший власть над собой, с обмякшим телом; варам варам — раз за разом; враджа-пати-гунан — достоинства владыки Враджа; гая гая — «пой, пой»; ити — так; джалпан — приговаривающий; гаурах — Гаура; дриштах — увиден; сакрит апи — хоть раз; на — не; яих — кем; дургхата — труднодостижима; тешу — для них; бхактих — бхакти.</w:t>
+        <w:t>Пословно (анвайя Бхактисиддханты):</w:t>
+      </w:r>
+      <w:r>
+        <w:t xml:space="preserve"> свия-намавалинам — своих имён — «Харе Кришна» и прочих; мадхурима-бхарам — (мадхурима — сладость, бхара — полнота или избыток, то есть) предельную сладость; свадам свадам — снова и снова вкушая; [татах — от этого]; мадам мадам — снова и снова пьянея; кимапи — неописуемым образом; вивашибхута-висраста-гатрах [сан] — обессилев, а затем с ослабевшим телом; враджапати-гунан — качества владыки Вриндавана; варам варам — снова и снова; гая гая — «пой», «пой»; ити — так; джалпан — приговаривая (то есть он говорит); гаурах — Гаурасундара; яих — теми людьми; сакрит апи на дриштах — ни разу не увиден, то есть не постигнут на опыте; тешу — в тех людях; бхактих кутах [бхавати] — откуда бхакти? (возможность бхакти ничтожна).</w:t>
       </w:r>
     </w:p>
     <w:p>
@@ -7816,29 +7603,16 @@
     </w:p>
     <w:p>
       <w:pPr>
+        <w:pStyle w:val="Heading3"/>
+      </w:pPr>
+      <w:r>
+        <w:t>Шлока 39</w:t>
+      </w:r>
+    </w:p>
+    <w:p>
+      <w:pPr>
         <w:spacing w:after="60"/>
         <w:ind w:left="567"/>
-        <w:jc w:val="both"/>
-      </w:pPr>
-      <w:r>
-        <w:rPr>
-          <w:sz w:val="20"/>
-        </w:rPr>
-        <w:t>Из пословного толкования: «не увидел» значит — не постиг его на опыте.</w:t>
-      </w:r>
-    </w:p>
-    <w:p>
-      <w:pPr>
-        <w:pStyle w:val="Heading3"/>
-      </w:pPr>
-      <w:r>
-        <w:t>Шлока 39</w:t>
-      </w:r>
-    </w:p>
-    <w:p>
-      <w:pPr>
-        <w:spacing w:after="60"/>
-        <w:ind w:left="567"/>
       </w:pPr>
       <w:r>
         <w:rPr>
@@ -7931,10 +7705,10 @@
           <w:b w:val="0"/>
           <w:i/>
         </w:rPr>
-        <w:t>Пословно:</w:t>
-      </w:r>
-      <w:r>
-        <w:t xml:space="preserve"> вина биджам — без семени; ким на — разве не; анкура-джананам — появление ростка; андхах апи — даже слепой; на катхам — почему бы не; прапашьет — увидел; но — не; пангух — хромой; гири-шикхарам — на вершину горы; арохати — взойдёт; катхам — почему; яди — если; шри-чайтанье — к Шри Чайтанье; хари-раса-мая-ашчарья-вибхаве — чьё дивное богатство соткано из Хари-расы (расы бхакти); апи — даже; абхактанам — у непреданных; бхави — возникнет; катхам апи — каким-либо образом; пара-према-рабхасах — порыв высшей любви (любви к Всевышнему).</w:t>
+        <w:t>Пословно (анвайя Бхактисиддханты):</w:t>
+      </w:r>
+      <w:r>
+        <w:t xml:space="preserve"> яди хари-расамая-ашчарья-вибхаве — обладающем в высшей степени дивным богатством, которое есть раса бхакти к самому Хари; шри-чайтанье — в Шри Гаурасундаре; абхактанам апи — даже у лишённых бхакти; пара-према-рабхасах — («пара» — Всевышний, Парамешвара; «према-рабхаса» — блаженство премы) блаженство любви к Всевышнему; катхамапи — каким-либо образом; бхави — возникнет; [тада — тогда]; биджам вина ким на анкура-дженанам [бхавет] — почему без семени не появляется росток?; андхах апи катхам на прапашйет — почему и слепой не видит?; пангух катхам на гири-шикхарам арохати — почему хромой не восходит на вершину горы Сумеру? (то есть для тех, кто не принял прибежища лотосных стоп Гауры, вкусить расу премы совершенно невозможно).</w:t>
       </w:r>
     </w:p>
     <w:p>
@@ -7997,29 +7771,16 @@
     </w:p>
     <w:p>
       <w:pPr>
+        <w:pStyle w:val="Heading3"/>
+      </w:pPr>
+      <w:r>
+        <w:t>Шлока 40</w:t>
+      </w:r>
+    </w:p>
+    <w:p>
+      <w:pPr>
         <w:spacing w:after="60"/>
         <w:ind w:left="567"/>
-        <w:jc w:val="both"/>
-      </w:pPr>
-      <w:r>
-        <w:rPr>
-          <w:sz w:val="20"/>
-        </w:rPr>
-        <w:t>Из пословного толкования: «пара» (в слове «пара-према») — Всевышний (Парамешвара); иначе говоря, для тех, кто не принял прибежища лотосных стоп Гауры, вкусить расу премы совершенно невозможно.</w:t>
-      </w:r>
-    </w:p>
-    <w:p>
-      <w:pPr>
-        <w:pStyle w:val="Heading3"/>
-      </w:pPr>
-      <w:r>
-        <w:t>Шлока 40</w:t>
-      </w:r>
-    </w:p>
-    <w:p>
-      <w:pPr>
-        <w:spacing w:after="60"/>
-        <w:ind w:left="567"/>
       </w:pPr>
       <w:r>
         <w:rPr>
@@ -8112,10 +7873,10 @@
           <w:b w:val="0"/>
           <w:i/>
         </w:rPr>
-        <w:t>Пословно:</w:t>
-      </w:r>
-      <w:r>
-        <w:t xml:space="preserve"> алаукикья — неземным; према-унмада-раса-виласа-пратханая — распространением игр опьяняющей расы любви; на — не (причисленному); ях — кто; шри-говинда-анучара-сачивешу — к спутникам и сподвижникам Шри Говинды; эшу — этим; критишу — благочестивым; маха-ашчарья-према-утсавам — праздник великой, дивной любви; апи — даже (ему); хатхат — внезапно (насильно); датари — дарующему; на — не (обращён); ят-матих — чей ум; гауре — к Гауре; сакшат — самому; парах — величайший; иха — здесь; сах — тот; мудхах — глупец; нара-пашух — двуногое животное.</w:t>
+        <w:t>Пословно (анвайя Бхактисиддханты):</w:t>
+      </w:r>
+      <w:r>
+        <w:t xml:space="preserve"> эшу шри-говинда-анучара-сачивешу критишу — среди тех благочестивых, кто как спутники помогает играм Шри Говинды; ях на [ганитах — кто не причислен; тасмаи апи — даже ему]; алаукикья — неземным образом; премонмада-раса-виласа-пратханая — распространением игр расы, рождённых любовью, — радости, гордости и прочего; маха-ашчарья-премотсавам — в высшей степени дивное блаженство премы; хатхат датари сакшат гауре — к самому Гаурасундаре, который внезапно дарует; ян-матих на [бхавет] — у кого ум не обращается; иха — в этом мире; сах нара-пашух — тот человек-животное; парах мудхах — величайший глупец.</w:t>
       </w:r>
     </w:p>
     <w:p>
@@ -8280,10 +8041,10 @@
           <w:b w:val="0"/>
           <w:i/>
         </w:rPr>
-        <w:t>Пословно:</w:t>
-      </w:r>
-      <w:r>
-        <w:t xml:space="preserve"> асанкхьях — бесчисленные; шрути-адау — в шрути и прочих писаниях; бхагават-аватарах — воплощения Господа; нигадитах — названы; прабхавам — (такое) могущество (какое видно в Гауре); ках — кто; самбхавайату — мог бы предположить; парамешат — от Всевышнего; итаратах — в ином; ким аньят — что ещё (сказать); сва-прештхе — в своём возлюбленном (Гауре); кати кати — сколько, сколько; сатам — у святых; на апи — разве не (было); анубхавах — откровений (видение шестирукого облика и пр.); татха апи — и всё же; шри-гауре — в Шри Гауре; хари хари — увы, увы (Хари, Хари); на — не (имеют); мудхах — глупцы; хари-дхиях — представления, что он Хари.</w:t>
+        <w:t>Пословно (анвайя Бхактисиддханты):</w:t>
+      </w:r>
+      <w:r>
+        <w:t xml:space="preserve"> шрути-адау — в Ведах и прочем (в Ведах, […] неподдельном комментарии на Веданту — «Шримад-Бхагаватам», […] шастрах); асанкхьях — бесчисленные; аватарах — воплощения; нигадитах — названы; [гаура-харау … — в Гаурахари …] (такое дивное могущество, какое видно в Гаурахари, […]); прабхавам — такое могущество; парамешат итаратах — в ком-либо, кроме Парамешвары; ках самбхаваяту — кто может предположить?; аньят ким [вактавьям] — что ещё сказать?; сва-прештхе — в своём возлюбленном Гаурасундаре; сатам — святых преданных; кати кати анубхавах апи на [дриштах] — сколько-сколько опытов разве не было? (освобождение Джагая и Мадхая, […], шестирукий облик, явленный Сарвабхауме, […] — разве не постигли они его как Всевышнего?); хари хари — увы! (с горечью); татхапи шри-гауре — всё же в Гаурасундаре; мудхах хари-дхиях на — у глупцов нет понимания, что он — Хари (Всевышний).</w:t>
       </w:r>
     </w:p>
     <w:p>
@@ -8346,29 +8107,16 @@
     </w:p>
     <w:p>
       <w:pPr>
+        <w:pStyle w:val="Heading3"/>
+      </w:pPr>
+      <w:r>
+        <w:t>Шлока 42</w:t>
+      </w:r>
+    </w:p>
+    <w:p>
+      <w:pPr>
         <w:spacing w:after="60"/>
         <w:ind w:left="567"/>
-        <w:jc w:val="both"/>
-      </w:pPr>
-      <w:r>
-        <w:rPr>
-          <w:sz w:val="20"/>
-        </w:rPr>
-        <w:t>Из пословного толкования: «шрути и прочие» — Веды, «Шримад-Бхагаватам» (неподдельный комментарий на Веданту) и другие шастры; среди опытов святых упомянуты освобождение Джагая и Мадхая, […], шестирукий облик, явленный Сарвабхауме, и прочее […].</w:t>
-      </w:r>
-    </w:p>
-    <w:p>
-      <w:pPr>
-        <w:pStyle w:val="Heading3"/>
-      </w:pPr>
-      <w:r>
-        <w:t>Шлока 42</w:t>
-      </w:r>
-    </w:p>
-    <w:p>
-      <w:pPr>
-        <w:spacing w:after="60"/>
-        <w:ind w:left="567"/>
       </w:pPr>
       <w:r>
         <w:rPr>
@@ -8461,10 +8209,10 @@
           <w:b w:val="0"/>
           <w:i/>
         </w:rPr>
-        <w:t>Пословно:</w:t>
-      </w:r>
-      <w:r>
-        <w:t xml:space="preserve"> сакшат — непосредственные; мокша-адика-артхан — освобождение и прочие цели; вивидха-викритибхих — разнообразными преображениями (экстаза); туччхатам — ничтожность; даршаянтам — показывающее; према-анандам — блаженство любви; прасуте — порождает; сакала-тану-бхритам — у всех воплощённых; яся — чей; лила-катакшах — игривый взгляд; на — не; асау — этот; ведешу — в Ведах; гудхах — сокрытый; джагати — в мире (мира); яди — если; бхавет — является; ишварах — Богом; гаура-чандрах — Гаурачандра; тат — то; праптах — утвердилось; анишавадах — учение о том, что Бога нет; шива шива — Шива, Шива!; гахане — о непостижимая; вишну-мае — о майя Вишну; намах — поклон; те — тебе.</w:t>
+        <w:t>Пословно (анвайя Бхактисиддханты):</w:t>
+      </w:r>
+      <w:r>
+        <w:t xml:space="preserve"> ясья лила-катакшах — игривый, исполненный бхав взгляд того Гаурасундары; сакала-тану-бхритам — всех воплощённых; сакшат мокша-адика-артхан — непосредственные цели человека — освобождение и прочие; вивидха-викритибхих — множеством преображений (викар); туччхатам даршаянтам преманандам — блаженство премы, показывающее ничтожность, то есть крайнюю никчёмность (то есть пятую цель — премананду, «делающую освобождение ничтожным»); прасуте — рождает (являет); ведешу гудхах асау гаурачандрах — этот Гаурачандра, сокрытый в Ведах (сокрытый, так как он скрытое воплощение; то есть хотя шрути мантрами «махан прабхур вай пурушах» («Шветашватара-упанишад», 3.12), «рукма-варнам картарам ишам пурушам брахма-йоним» («Мундака-упанишад», 3.1.3) и прочими указывают на Гаурасундару, для лишённых понимания знающих это не стало предметом постижения); джагати яди ишварах на бхавет — если он не единственный Владыка в мире; тат аниша-вадах праптах — то пришёл атеизм (учение о безбожии); шива шива — Шива, Шива!; [хе] гахане вишну-мае — о Вишну-майя непостижимой силы; те — тебе; намах — поклон (то есть, обманутые Вишну-майей непостижимой силы, некоторые не могут постичь Гаурасундару как «Всевышнего»).</w:t>
       </w:r>
     </w:p>
     <w:p>
@@ -8527,29 +8275,16 @@
     </w:p>
     <w:p>
       <w:pPr>
+        <w:pStyle w:val="Heading3"/>
+      </w:pPr>
+      <w:r>
+        <w:t>Шлока 43</w:t>
+      </w:r>
+    </w:p>
+    <w:p>
+      <w:pPr>
         <w:spacing w:after="60"/>
         <w:ind w:left="567"/>
-        <w:jc w:val="both"/>
-      </w:pPr>
-      <w:r>
-        <w:rPr>
-          <w:sz w:val="20"/>
-        </w:rPr>
-        <w:t>Из пословного толкования: эта према — пятая цель человека, «делающая освобождение ничтожным» («мокша-лагхута-крит»); Гаурачандра «сокрыт в Ведах», так как он — скрытое воплощение (чханна-аватара): шрути указывают на Гаурасундару мантрами вроде «махан прабхур вай пурушах» («Шветашватара-упанишад», 3.12) и «рукма-варнам картарам ишам пурушам брахма-йоним» («Мундака-упанишад», 3.1.3), но для тех, кто лишён понимания знающих, это осталось непостигнутым; обманутые Вишну-майей, чья сила непостижима, некоторые не могут постичь, что Гаурасундара — Всевышний.</w:t>
-      </w:r>
-    </w:p>
-    <w:p>
-      <w:pPr>
-        <w:pStyle w:val="Heading3"/>
-      </w:pPr>
-      <w:r>
-        <w:t>Шлока 43</w:t>
-      </w:r>
-    </w:p>
-    <w:p>
-      <w:pPr>
-        <w:spacing w:after="60"/>
-        <w:ind w:left="567"/>
       </w:pPr>
       <w:r>
         <w:rPr>
@@ -8642,10 +8377,10 @@
           <w:b w:val="0"/>
           <w:i/>
         </w:rPr>
-        <w:t>Пословно:</w:t>
-      </w:r>
-      <w:r>
-        <w:t xml:space="preserve"> дхик асту — да будет позор; кулам — роду; удджвалам — блестящему; дхик апи — позор и; вагмитам — красноречию; дхик — позор; яшах — славе; дхик — позор; адхьянам — учёности (изучению Вед); акритим — красивой наружности; нава-ваях — юности; шриях — богатству; ча — и; асту дхик — да будет позор; двиджатвам — рождению дваждырождённым; апи — и; дхик — позор; парам — высшему; вималам — чистому; ашрама-адьям — ашраму и прочему; ча — и; дхик — позор; на чет — если не; паричитах — узнан (принят и почитаем); калау — в век Кали; праката-гаура-гопи-патих — владыка гопи, явленный как Гаура.</w:t>
+        <w:t>Пословно (анвайя Бхактисиддханты):</w:t>
+      </w:r>
+      <w:r>
+        <w:t xml:space="preserve"> удджвалам кулам дхик — позор знатному роду (позор рождению в праведном роду, исполненном благочестивого поведения); вагмитам апи дхик — позор и красноречию (многословию); яшах [ча] дхик асту — позор славе, или почёту; адхьяянам дхик — позор изучению шрути и прочего; акритим навам ваях шриям [ча] дхик асту — позор красивому сложению рук, ног и прочих членов, полной юности (пурна-кайшоре), неистощимому богатству; двиджатвам апи дхик — позор и тому, чтобы, приняв предписанные таинства — упанаяну и прочие, — получить наставление в Гаятри и прочем; парам вималам ашрама-адьям ча дхик — позор и высшему, чистому брахмачарье и прочим ашрамам (словом «ади» указываются также [жертвоприношения] (OCR неясно), практика йоги, отречение и прочее, — позор и им); чет — если; калау — в век Кали; праката-гаура-гопипатих — явленный Гаура — возлюбленный гопи (возлюбленный гопи, воплощение сладости (мадхурьи) Кришна, который, приняв настроение и сияние «гауры», то есть золотой Шри Радхи, явился как воплощение расы випраламбхи); на паричитах [бхавет] — не почитаем (не становится предметом поклонения).</w:t>
       </w:r>
     </w:p>
     <w:p>
@@ -8810,10 +8545,10 @@
           <w:b w:val="0"/>
           <w:i/>
         </w:rPr>
-        <w:t>Пословно:</w:t>
-      </w:r>
-      <w:r>
-        <w:t xml:space="preserve"> ахо — о!; вайкунтха-стхаих — живущими на Вайкунтхе; апи ча — даже; бхагават-паршада-вараих — лучшими спутниками Господа; са-ромаянчам — с трепетом, от которого встают волосы; дриштах — видимы; ят-анучара-вакрешвара-мукхах — чьи слуги во главе с Вакрешварой; маха-ашчарья-према-удджвала-раса-сада-авеша-вивашикрита-ангах — чьи тела всегда во власти неистовства от дивной расы, сияющей великой любовью; там — того; гаурам — Гауру; катхам — как; акрита-пуньях — лишённый заслуг; пранаяту — полюбит.</w:t>
+        <w:t>Пословно (анвайя Бхактисиддханты):</w:t>
+      </w:r>
+      <w:r>
+        <w:t xml:space="preserve"> ахо — о!; маха-ашчарья-премоджджвала-раса-сада-авеша-вивашикрита-ангах — те, чьи члены обессилены постоянным погружением в в высшей степени удивительную сияющую расу премы; яд-анучара-вакрешвара-мукхах — спутники того Гаурасундары во главе с Вакрешварой, ценители мадхура-расы, то есть Вакрешвара, Гададхара, Рай Рамананда и другие; вайкунтхастхаих бхагават-паршада-вараих апи ча — даже лучшими спутниками Нараяны, пребывающими на Вайкунтхе — обители величия (айшварьи); са-романчам дриштах [абхаван] — были видимы с мурашками (то есть, видя их, даже спутники Нараяны на Вайкунтхе не могут не покрыться мурашками от [восторга]); акрита-пуньях — лишённый благочестия; катхам — как; там гаурам — того Гаурасундару; пранаяту — сможет сделать предметом своей любви?</w:t>
       </w:r>
     </w:p>
     <w:p>
@@ -8876,29 +8611,16 @@
     </w:p>
     <w:p>
       <w:pPr>
+        <w:pStyle w:val="Heading3"/>
+      </w:pPr>
+      <w:r>
+        <w:t>Шлока 45</w:t>
+      </w:r>
+    </w:p>
+    <w:p>
+      <w:pPr>
         <w:spacing w:after="60"/>
         <w:ind w:left="567"/>
-        <w:jc w:val="both"/>
-      </w:pPr>
-      <w:r>
-        <w:rPr>
-          <w:sz w:val="20"/>
-        </w:rPr>
-        <w:t>Из пословного толкования: «слуги во главе с Вакрешварой» — ценители мадхура-расы: Вакрешвара, Гададхара, Рай Рамананда и другие; Вайкунтха — обитель величия (айшварьи).</w:t>
-      </w:r>
-    </w:p>
-    <w:p>
-      <w:pPr>
-        <w:pStyle w:val="Heading3"/>
-      </w:pPr>
-      <w:r>
-        <w:t>Шлока 45</w:t>
-      </w:r>
-    </w:p>
-    <w:p>
-      <w:pPr>
-        <w:spacing w:after="60"/>
-        <w:ind w:left="567"/>
       </w:pPr>
       <w:r>
         <w:rPr>
@@ -8991,10 +8713,10 @@
           <w:b w:val="0"/>
           <w:i/>
         </w:rPr>
-        <w:t>Пословно:</w:t>
-      </w:r>
-      <w:r>
-        <w:t xml:space="preserve"> даттва — даровав; ях — кто; кам апи — кому бы то ни было; прасадам — милость; атха — затем; самбхашья — заговорив; смита-шри-мукхам — (становится) с улыбающимся прекрасным лицом; дурат — издали; снигдха-дриша — ласковым взглядом; нирикшья — посмотрев; ча — и; маха-према-утсавам — праздник великой любви; яччхати — дарует; йешам — у кого; ханта — увы; кутарка-каркаша-дхия — из-за ума, огрубевшего от ложных рассуждений; татра апи — даже к нему; на атьядарах — нет должного почтения; сакшат — самому; пурна-раса-аватарини — нисшедшему воплощением полной расы; харау — к Хари; душтах — злы; ами — они; кевалам — попросту.</w:t>
+        <w:t>Пословно (анвайя Бхактисиддханты):</w:t>
+      </w:r>
+      <w:r>
+        <w:t xml:space="preserve"> ях — тот, кто; кам апи — кому-либо; прасадам — милость (благосклонность); [даттва — даровав]; смита-шри-мукхам — сияет слегка улыбающимся прекрасным лицом; атха — затем; самбхашья — заговорив; дурат снигдха-дриша нирикшья ча — и издали посмотрев ласковым взглядом; маха-премотсавам — высочайшее блаженство премы; яччхати — дарует; ханта — увы!; йешам — у тех, у кого; кутарка-каркаша-дхия — из-за ума, огрубевшего от ложных рассуждений; татра сакшат-пурна-раса-аватарини харау апи — даже к тому Шри Гаурахари, чья природа — воочию нисводить, то есть являть полную расу премы; на атьядарах — нет великого почтения; ами — они; кевалам душтах — лишь злы (имеют природу асуров).</w:t>
       </w:r>
     </w:p>
     <w:p>
@@ -9057,37 +8779,24 @@
     </w:p>
     <w:p>
       <w:pPr>
+        <w:pStyle w:val="Heading2"/>
+      </w:pPr>
+      <w:r>
+        <w:t>Смирение (дайнья)</w:t>
+      </w:r>
+    </w:p>
+    <w:p>
+      <w:pPr>
+        <w:pStyle w:val="Heading3"/>
+      </w:pPr>
+      <w:r>
+        <w:t>Шлока 46</w:t>
+      </w:r>
+    </w:p>
+    <w:p>
+      <w:pPr>
         <w:spacing w:after="60"/>
         <w:ind w:left="567"/>
-        <w:jc w:val="both"/>
-      </w:pPr>
-      <w:r>
-        <w:rPr>
-          <w:sz w:val="20"/>
-        </w:rPr>
-        <w:t>Из пословного толкования: «нисходящий полной расой» — тот, чья природа — являть полную расу премы; «злые» — имеющие природу асуров.</w:t>
-      </w:r>
-    </w:p>
-    <w:p>
-      <w:pPr>
-        <w:pStyle w:val="Heading2"/>
-      </w:pPr>
-      <w:r>
-        <w:t>Смирение (дайнья)</w:t>
-      </w:r>
-    </w:p>
-    <w:p>
-      <w:pPr>
-        <w:pStyle w:val="Heading3"/>
-      </w:pPr>
-      <w:r>
-        <w:t>Шлока 46</w:t>
-      </w:r>
-    </w:p>
-    <w:p>
-      <w:pPr>
-        <w:spacing w:after="60"/>
-        <w:ind w:left="567"/>
       </w:pPr>
       <w:r>
         <w:rPr>
@@ -9140,10 +8849,10 @@
           <w:b w:val="0"/>
           <w:i/>
         </w:rPr>
-        <w:t>Пословно:</w:t>
-      </w:r>
-      <w:r>
-        <w:t xml:space="preserve"> ванчитах асми — я обманут; ванчитах асми — я обманут; ванчитах асми — я обманут; на самшаях — нет сомнений; вишвам — весь мир; гаура-расе — в расе Гауры; магнам — погрузился; спаршах апи — даже касания; мама — у меня; на абхават — не было.</w:t>
+        <w:t>Пословно (анвайя Бхактисиддханты):</w:t>
+      </w:r>
+      <w:r>
+        <w:t xml:space="preserve"> ванчитах асми ванчитах асми ванчитах асми — я обманут, обманут, непременно обманут; [ятах — потому что]; вишвам — весь мир; гаура-расе магнам — погрузился в небывалую прежде (анарпита-чари) возвышенную сияющую расу, дарованную Шри Гаурасундарой — воплощением випраламбхи; [кинту — но]; мама — у меня; [татра — с ней]; спаршах апи — даже касания; на абхават — не было.</w:t>
       </w:r>
     </w:p>
     <w:p>
@@ -9206,29 +8915,16 @@
     </w:p>
     <w:p>
       <w:pPr>
+        <w:pStyle w:val="Heading3"/>
+      </w:pPr>
+      <w:r>
+        <w:t>Шлока 47</w:t>
+      </w:r>
+    </w:p>
+    <w:p>
+      <w:pPr>
         <w:spacing w:after="60"/>
         <w:ind w:left="567"/>
-        <w:jc w:val="both"/>
-      </w:pPr>
-      <w:r>
-        <w:rPr>
-          <w:sz w:val="20"/>
-        </w:rPr>
-        <w:t>Из пословного толкования: «раса Гауры» — небывалая прежде (анарпита-чари), возвышенная сияющая раса (уннатоджджвала-раса), дарованная Шри Гаурасундарой, воплощением разлуки (випраламбхи).</w:t>
-      </w:r>
-    </w:p>
-    <w:p>
-      <w:pPr>
-        <w:pStyle w:val="Heading3"/>
-      </w:pPr>
-      <w:r>
-        <w:t>Шлока 47</w:t>
-      </w:r>
-    </w:p>
-    <w:p>
-      <w:pPr>
-        <w:spacing w:after="60"/>
-        <w:ind w:left="567"/>
       </w:pPr>
       <w:r>
         <w:rPr>
@@ -9321,10 +9017,10 @@
           <w:b w:val="0"/>
           <w:i/>
         </w:rPr>
-        <w:t>Пословно:</w:t>
-      </w:r>
-      <w:r>
-        <w:t xml:space="preserve"> каих ва — кем только; сарва-пум-артха-маулих — венец всех целей человека (према); акрита-аясаих — не прилагавшими усилий; иха — здесь; асадитах — обретён; на асит — не был; гаура-пада-аравинда-раджаса — пылью с лотосных стоп Гауры; сприште — когда коснулась (коснувшейся); махи-мандале — земли; ха ха — увы, увы; дхик — позор; мама — моей; дживанам — жизни; дхик апи — позор и; ме — моей; видьям — учёности; дхик апи — позор и; ашрамам — ашраму (санньясе); ят — потому что; даурбхагья-бхарат — по великому злосчастью; ахо — о!; мама — у меня; на — не; тат-самбандха-гандхах апи — даже запаха связи с ним; абхут — было.</w:t>
+        <w:t>Пословно (анвайя Бхактисиддханты):</w:t>
+      </w:r>
+      <w:r>
+        <w:t xml:space="preserve"> гаура-падаравинда-раджаса — пыльцой лотосных стоп Шри Гаурасундары; махи-мандале сприште [сати] — когда земля была осенена; иха — в этом мире; каир ва — кем же; акрита-аясаих — без усилий; сарва-пумартха-маулих — венец всех целей человека — према; асадитах на асит — не был обретён? (то есть его обрели все); ха ха — увы, увы (с горечью); мама — моей; дживанам дхик — позор жизни; ме — моей; видьям апи дхик — позор и учёности (знанию шастр и прочего); ашрамам апи дхик — позор и ашраму — триданда-санньясе, четвёртому ашраму; ят — потому что; даурбхагья-бхарат — из-за крайнего злосчастья; ахо — о!; мама — у меня; тат-самбандха-гандхах апи — даже запаха связи с этой [премой]; на абхут — не было.</w:t>
       </w:r>
     </w:p>
     <w:p>
@@ -9449,10 +9145,10 @@
           <w:b w:val="0"/>
           <w:i/>
         </w:rPr>
-        <w:t>Пословно:</w:t>
-      </w:r>
-      <w:r>
-        <w:t xml:space="preserve"> утсасарпа — вышел из берегов; джагат — мир; эва — весь; пураян — заполнив (затопив); гаура-чандра-каруна-маха-арнавах — великий океан милости Гаурачандры; бинду-матрам апи — даже капли; на апатат — не упало; маха-дурбхаге — великого несчастливца; майи — на меня; ким — что за; этат — это; адбхутам — чудо.</w:t>
+        <w:t>Пословно (анвайя Бхактисиддханты):</w:t>
+      </w:r>
+      <w:r>
+        <w:t xml:space="preserve"> гаурачандра-каруна-махарнавах — великий океан милости Гаура-луны (OCR частично утрачено); джагат пураян эва — полностью затопив мир; утсарпа — вышел из берегов (взметнулся); [кинту — но]; маха-дурбхаге майи — на меня, крайне несчастного; бинду-матрам апи — даже капли этой милости; на апатат — не упало; этат ким адбхутам — что это за чудо? (то есть все в мире затоплены милостью Гаурасундары, лишь я по своему крайнему злосчастью не смог принять и капли).</w:t>
       </w:r>
     </w:p>
     <w:p>
@@ -9617,10 +9313,10 @@
           <w:b w:val="0"/>
           <w:i/>
         </w:rPr>
-        <w:t>Пословно:</w:t>
-      </w:r>
-      <w:r>
-        <w:t xml:space="preserve"> калах — время; калих — Кали; балинах — сильны; индрия-вайри-варгах — враги-чувства; шри-бхакти-маргах — путь святой бхакти; иха — здесь; кантака-коти-руддхах — перегорожен миллионами шипов (кармы, гьяны и пр.); ха ха — увы, увы; ква — куда; ями — мне идти; викалах — обезумевшему; ким — что; ахам — я; кароми — сделаю; чайтанья-чандра — о Чайтанья-Луна; яди — если; на — не; адья — сегодня; крипам — милость; кароши — явишь.</w:t>
+        <w:t>Пословно (анвайя Бхактисиддханты):</w:t>
+      </w:r>
+      <w:r>
+        <w:t xml:space="preserve"> калах калих — время — Кали (насаждающий адхарму); индрия-вайри-варгах — полчища врагов-чувств; балинах — весьма сильны; иха — в этот век Кали; шри-бхакти-маргах — высший сияющий путь бхакти; кантака-коти-руддхах — перегорожен бесчисленными шипами в виде кармы, гьяны и прочего; [атах — поэтому]; [хе] чайтанья-чандра — о Чайтанья-луна; яди адья крипам — если сегодня милость; на кароши — не явишь; [тада — тогда]; ха ха — увы, увы; викалах — смятённый (подавленный, то есть поражённый всеми этими пороками Кали); ахам — я; ким кароми — что мне делать?; ква — куда; ями — мне идти?</w:t>
       </w:r>
     </w:p>
     <w:p>
@@ -9683,29 +9379,16 @@
     </w:p>
     <w:p>
       <w:pPr>
+        <w:pStyle w:val="Heading3"/>
+      </w:pPr>
+      <w:r>
+        <w:t>Шлока 50</w:t>
+      </w:r>
+    </w:p>
+    <w:p>
+      <w:pPr>
         <w:spacing w:after="60"/>
         <w:ind w:left="567"/>
-        <w:jc w:val="both"/>
-      </w:pPr>
-      <w:r>
-        <w:rPr>
-          <w:sz w:val="20"/>
-        </w:rPr>
-        <w:t>Из пословного толкования: Кали — тот, кто насаждает беззаконие (адхарму); миллионы шипов — карма, гьяна и прочее.</w:t>
-      </w:r>
-    </w:p>
-    <w:p>
-      <w:pPr>
-        <w:pStyle w:val="Heading3"/>
-      </w:pPr>
-      <w:r>
-        <w:t>Шлока 50</w:t>
-      </w:r>
-    </w:p>
-    <w:p>
-      <w:pPr>
-        <w:spacing w:after="60"/>
-        <w:ind w:left="567"/>
       </w:pPr>
       <w:r>
         <w:rPr>
@@ -9798,10 +9481,10 @@
           <w:b w:val="0"/>
           <w:i/>
         </w:rPr>
-        <w:t>Пословно:</w:t>
-      </w:r>
-      <w:r>
-        <w:t xml:space="preserve"> сах апи — даже тот; ашчарья-маях — дивный; прабхух — Господь; наянайох — глаз (моих); ят — что; на абхават — не стал; гочарах — видимым; ят — что; на асвади — не был вкушён (мною); харех — Хари; пада-амбуджа-расах — раса лотосных стоп; тат — то; ят гатам — что ушло; тат гатам — то ушло; этават — лишь это; мама — у меня; тават — по крайней мере; асту — пусть будет; джагатим — землю; йе — которые; анье апи — другие (преданные); аланкурвате — украшают; шри-чайтанья-паде — в стопах Шри Чайтаньи; никхата-манасах — утвердившие (погрузившие) ум; таих — с ними; ят — какой; прасанга-утсавах — праздник общения.</w:t>
+        <w:t>Пословно (анвайя Бхактисиддханты):</w:t>
+      </w:r>
+      <w:r>
+        <w:t xml:space="preserve"> сах апи ашчарьямаях прабхух — даже тот исполненный высших чудес Господь Гаурахари; ят — то, что по злосчастью; наянайох — глазам; гочарах на абхават — не стал видим; ят — или то, что по какой-то причине; харех падамбуджа-расах — раса лотосных стоп Хари; на асвади — не была вкушена; тат гатам тат гатам [эва] — что было, то прошло; [кинту — но]; мама — у меня; этават [эва] — лишь это; [асту — пусть будет]; шри-чайтанья-паде никхата-манасах — утвердившие ум в лотосных стопах Шри Чайтаньи; йе аньйе апи — иные, которые; джагатим — землю; аланкурвате — украшают; таих — с ними; ят прасанготсавах — возвышенное общение (пра — превосходно, санга — общение) и его блаженство; тават асту — пусть же будет.</w:t>
       </w:r>
     </w:p>
     <w:p>
@@ -9966,10 +9649,10 @@
           <w:b w:val="0"/>
           <w:i/>
         </w:rPr>
-        <w:t>Пословно:</w:t>
-      </w:r>
-      <w:r>
-        <w:t xml:space="preserve"> душкарма-коти-ниратасья — преданного миллионам дурных дел; дуранта-гхора-дурвасана-нигада-шринкхалитасья — скованного цепями бесконечных, страшных дурных наклонностей; гадхам — накрепко; клишьян-матех — чей ум мучится (кармой, гьяной и пр.); кумати-коти-кадартхитасья — терзаемого миллионами ложных воззрений (по Бхактисиддханте — людей с дурным умом, сбивающих с пути); гаурам вина — кроме Гауры; адья — сегодня; мама — мне; ках — кто; бхавита — станет; иха — здесь; бандхух — другом.</w:t>
+        <w:t>Пословно (анвайя Бхактисиддханты):</w:t>
+      </w:r>
+      <w:r>
+        <w:t xml:space="preserve"> душкарма-коти-ниратасья — преданного миллионам дурных дел; гадхам — накрепко; дуранта-гхора-дурвасана-нигада-шринкхалитасья — скованного цепями неукротимых, страшных дурных наклонностей; клишьян-матех — с умом, измученным [трудами ради] кармы, гьяны и прочего; кумати-коти-кадартхитасья — ведомого бесчисленными людьми дурного ума, упорствующими в карме, и одолеваемого ими; мама — мне; гаурам вина — кроме Гаурахари; адья — сегодня; иха — в этом мире; ках бандхух бхавита — кто станет другом?</w:t>
       </w:r>
     </w:p>
     <w:p>
@@ -10134,10 +9817,10 @@
           <w:b w:val="0"/>
           <w:i/>
         </w:rPr>
-        <w:t>Пословно:</w:t>
-      </w:r>
-      <w:r>
-        <w:t xml:space="preserve"> ха ханта ханта — увы, увы!; парама-ушара-читта-бхумау — на крайне бесплодной почве сердца; вьяртхи-бхаванти — пропадают даром; мама — мои; садхана-котаях апи — даже миллионы практик; сарва-атмана — всей душой; тат — поэтому; ахам — я; адбхута-бхакти-биджам — дивное семя бхакти; шри-гаура-чандра-чаранам — стопы Шри Гаурачандры; шаранам кароми — принимаю прибежищем.</w:t>
+        <w:t>Пословно (анвайя Бхактисиддханты):</w:t>
+      </w:r>
+      <w:r>
+        <w:t xml:space="preserve"> ха ханта ханта — увы! увы! увы!; мама — моей; парама-ушара-читта-бхумау — на в высшей степени бесплодной почве сердца; садхана-котаях апи — даже миллионы практик; вьяртхах бхаванти — пропадают даром; тат — поэтому; ахам — я; сарватмана — всем сердцем; адбхута-бхакти-биджам — являющиеся семенем неземной (апракрита) бхакти; шри-гаурачандра-чаранам — лотосные стопы Шри Гаурачандры; шаранам кароми — принимаю прибежищем.</w:t>
       </w:r>
     </w:p>
     <w:p>
@@ -10302,10 +9985,10 @@
           <w:b w:val="0"/>
           <w:i/>
         </w:rPr>
-        <w:t>Пословно:</w:t>
-      </w:r>
-      <w:r>
-        <w:t xml:space="preserve"> ха ханта — увы!; читта-бхуви — на почве сердца; ме — моего; парама-ушараям — крайне бесплодной; сат-бхакти-калпа-латика-анкурита — пробившийся росток лианы желаний истинной бхакти; катхам — как; сьят — будет; хриди — в сердце; экам эва — одно лишь; парама-ашвасания — высшее утешение; асти — есть; чайтанья-нама — имя «Чайтанья»; калаян — повторяющий; на — не; када апи — никогда; шочьях — достоин сожаления.</w:t>
+        <w:t>Пословно (анвайя Бхактисиддханты):</w:t>
+      </w:r>
+      <w:r>
+        <w:t xml:space="preserve"> ха ханта — увы!; ме — моей; парама-ушараям читта-бхуви — на крайне бесплодной почве сердца; катхам — как; сад-бхакти-калпа-латика-анкурита бхавет — возникнет росток бхакти в виде премы — стхайи-бхава, или рати?; [кинту — но]; хриди — в сердце; экам эва — единственное; парам ашвасанийам — главное утешение; асти — есть; [ят — что]; чайтанья-нама — имя Чайтаньи; калаян — повторяя; кадапи — никогда; на шочьях — не бывает предметом скорби.</w:t>
       </w:r>
     </w:p>
     <w:p>
@@ -10470,10 +10153,10 @@
           <w:b w:val="0"/>
           <w:i/>
         </w:rPr>
-        <w:t>Пословно:</w:t>
-      </w:r>
-      <w:r>
-        <w:t xml:space="preserve"> самсара-духкха-джаладхау — в океан мирских страданий; патитасья — упавшего; кама-кродха-ади-накра-макараих — крокодилами и чудовищами вожделения, гнева и прочего; кавали-критасья — проглоченного; дурвасана-нигадитасья — скованного дурными наклонностями; нирашраясья — лишённого прибежища; чайтанья-чандра — о Чайтанья-Луна; мама — мне; дехи — дай; пада-аваламбам — опору стоп.</w:t>
+        <w:t>Пословно (анвайя Бхактисиддханты):</w:t>
+      </w:r>
+      <w:r>
+        <w:t xml:space="preserve"> [хе] чайтанья-чандра — о Чайтанья-луна!; самсара-дукха-джаладхау патитасья — упавшему в океан страданий сансары; кама-кродха-ади-накра-макараих каваликритасья — схваченному крокодилами — вожделением, гневом — и макарами и прочими; дурвасана-нигадитасья — скованному цепями дурных наклонностей; нирашраясья — лишённому опоры; мама — мне; пада-авалямбанам — прибежище стоп; дехи — дай.</w:t>
       </w:r>
     </w:p>
     <w:p>
@@ -10638,10 +10321,10 @@
           <w:b w:val="0"/>
           <w:i/>
         </w:rPr>
-        <w:t>Пословно:</w:t>
-      </w:r>
-      <w:r>
-        <w:t xml:space="preserve"> мригья — разыскиваемая; апи — даже; са — та; шива-шука-уддхава-нарада-адьяих — Шивой, Шукой, Уддхавой, Нарадой и другими; ашчарья-бхакти-падави — дивный путь бхакти; на — не; давияси — далека; нах — от нас; дурбодха-вайбхава-пате — о владыка непостижимого богатства; майи — на меня; памаре — ничтожного; апи — даже; чайтанья-чандра — о Чайтанья-Луна; яди — если; те — твой; каруна-катакшах — милостивый взгляд (падёт).</w:t>
+        <w:t>Пословно (анвайя Бхактисиддханты):</w:t>
+      </w:r>
+      <w:r>
+        <w:t xml:space="preserve"> [хе] дурбодха-вайбхава-пате чайтанья-чандра — о Чайтанья-луна, владыка непостижимой силы (шакти); памаре апи майи — даже на меня, падшего; яди те — если твой; каруна-катакшах — милостивый взгляд; [сьят — падёт]; [тада — тогда]; шива-шука-уддхава-нарада-адьяих апи — даже великими душами — Шивой, Шукой, Уддхавой, Нарадой и другими; мригья — искомый; са ашчарья-бхакти-падави — тот дивный путь бхакти; нах — от нас; на давияси — не будет далёк.</w:t>
       </w:r>
     </w:p>
     <w:p>
@@ -10766,10 +10449,10 @@
           <w:b w:val="0"/>
           <w:i/>
         </w:rPr>
-        <w:t>Пословно:</w:t>
-      </w:r>
-      <w:r>
-        <w:t xml:space="preserve"> ква — где (ещё); са — такая; ниранкуша — безудержная; крипа — милость; ква — где; тат — такое; вайбхавам — величие; адбхутам — дивное; ква — где; са — такая; ватсалата — нежность (любовь к преданным); шауре — о Шаури (Кришна); гауре — в облике Гауры; ядрик — какая; тава — в твоём; атмани — самом (теле).</w:t>
+        <w:t>Пословно (анвайя Бхактисиддханты):</w:t>
+      </w:r>
+      <w:r>
+        <w:t xml:space="preserve"> [хе] шауре — о Кришна из рода Шуры; тава гауре атмани — в твоём золотом облике; ядрик — какая; ниранкуша-крипа — беспричинная милость; са ква — где ещё такая?; тат адбхутам вайбхавам ква — где ещё такое в высшей степени дивное величие?; са ватсалата [ча] ква — где ещё такая ватсалья (любовь к преданным)?</w:t>
       </w:r>
     </w:p>
     <w:p>
@@ -10929,10 +10612,10 @@
           <w:b w:val="0"/>
           <w:i/>
         </w:rPr>
-        <w:t>Пословно:</w:t>
-      </w:r>
-      <w:r>
-        <w:t xml:space="preserve"> сва-теджаса — собственной мощью (сиянием); кришна-пада-аравинда-маха-раса-авешита-вишвам — погрузившего весь мир в великую расу лотосных стоп Кришны (своего же облика); ишам — Владыку; кам апи — неописуемого; ашеша-шрути-гудха-вешам — чей облик сокрыт во всех шрути (кто тайно присутствует во всех Ведах); гаурангам — Гаурангу; ангикуру — прими (прими прибежище его стоп); мудха-четах — о глупое сердце.</w:t>
+        <w:t>Пословно (анвайя Бхактисиддханты):</w:t>
+      </w:r>
+      <w:r>
+        <w:t xml:space="preserve"> [хе — о]; мудха-четах — глупое сердце; сва-теджаса — своей собственной силой (влиянием); кришна-падаравинда-махараса-авешита-вишвам — того, кто возвышенной сияющей (уннатоджджвала) расой лотосных стоп Шри Кришны — своего собственного облика (сва-сварупы) — сделал вселенную исполненной анураги (привязанности); ашеша-шрути-гудха-вешам — того, кто среди всех шрути пребывает сокровенно, то есть вошёл в них в скрытом виде; кам апи ишам гаурангам — того неописуемого Всевышнего Гаурахари; ангикуру — прими, то есть прими прибежище его лотосных стоп</w:t>
       </w:r>
     </w:p>
     <w:p>
@@ -10995,29 +10678,16 @@
     </w:p>
     <w:p>
       <w:pPr>
+        <w:pStyle w:val="Heading3"/>
+      </w:pPr>
+      <w:r>
+        <w:t>Шлока 58</w:t>
+      </w:r>
+    </w:p>
+    <w:p>
+      <w:pPr>
         <w:spacing w:after="60"/>
         <w:ind w:left="567"/>
-        <w:jc w:val="both"/>
-      </w:pPr>
-      <w:r>
-        <w:rPr>
-          <w:sz w:val="20"/>
-        </w:rPr>
-        <w:t>Из пословного толкования: «великая раса» лотосных стоп Кришны — уннатоджджвала-раса (возвышенная сияющая раса).</w:t>
-      </w:r>
-    </w:p>
-    <w:p>
-      <w:pPr>
-        <w:pStyle w:val="Heading3"/>
-      </w:pPr>
-      <w:r>
-        <w:t>Шлока 58</w:t>
-      </w:r>
-    </w:p>
-    <w:p>
-      <w:pPr>
-        <w:spacing w:after="60"/>
-        <w:ind w:left="567"/>
       </w:pPr>
       <w:r>
         <w:rPr>
@@ -11110,10 +10780,10 @@
           <w:b w:val="0"/>
           <w:i/>
         </w:rPr>
-        <w:t>Пословно:</w:t>
-      </w:r>
-      <w:r>
-        <w:t xml:space="preserve"> шравана-манана-санкиртти-ади-бхактья — бхакти, состоящей из слушания, размышления, воспевания и прочего; мурарех — к Мурари; йади — если; парама-пум-артхам — высшую цель человека (прему); садхайет — достигает; ках апи — кто-либо; бхадрам — хорошо (пусть так); мама — для меня; ту — же; парама-апара-према-пийуша-синдхох — безбрежного океана нектара высшей любви; ким апи — неописуемая; раса-рахасйам — тайна расы (сокровенная према, заключённая в расе бхакти); гаура-дхамнах — того, чьё сияние золотое (Хари в облике Гауры); намасйам — достойна поклонения (единственный предмет служения).</w:t>
+        <w:t>Пословно (анвайя Бхактисиддханты):</w:t>
+      </w:r>
+      <w:r>
+        <w:t xml:space="preserve"> яди ках апи — если кто-то; мурарех — Мурари; шравана-манана-санкиртй-ади-бхактья — посредством девятеричной садхана-бхакти — слушания, размышления и прочего; парама-пумартхам — высшую цель человека, прему; садхайет — достигает практикой; [тархи — тогда]; бхадрам — хорошо, пусть достигает; мама ту — для меня же; апара-према-пийуша-синдхох гаура-дхамнах — Шри Хари, обладающего золотым сиянием (гаура-канти), который есть океан нектара безбрежной премы; ким апи раса-рахасьям — то, что есть некая тайна в расе бхакти, то есть сокровище любви; парам намасьям — единственно достойно поклонения</w:t>
       </w:r>
     </w:p>
     <w:p>
@@ -11289,10 +10959,10 @@
           <w:b w:val="0"/>
           <w:i/>
         </w:rPr>
-        <w:t>Пословно:</w:t>
-      </w:r>
-      <w:r>
-        <w:t xml:space="preserve"> ишам — Владыке; бхаджанту — пусть поклоняются; пуруша-артха-чатуштая-ашах — надеющиеся на четыре цели человека (дхарму, артху, каму, мокшу); дасах — слугами (Хари); бхаванту — пусть станут; ча — и; вихайа — оставив; харех — Хари; упасьян — (иные) предметы поклонения; ким-чит-рахасья-пада-лобхита-дхих — с умом, прельщённым неким сокровенным предметом (тайной любовью Радхи и Кришны); ахам — я; ту — же; чайтанья-чандра-чаранам — стопы Чайтаньи-Луны; шаранам — прибежищем; кароми — делаю.</w:t>
+        <w:t>Пословно (анвайя Бхактисиддханты):</w:t>
+      </w:r>
+      <w:r>
+        <w:t xml:space="preserve"> пурушартха-чатуштая-ашах — те, у кого есть стремление к четырём целям — дхарме, артхе, каме и мокше, — некоторые из них; ишам — Всевышнему; бхаджанту — пусть поклоняются; [аньян — иные]; упасьян — иные объекты поклонения; вихайя — оставив; харех дасах ча бхаванту — пусть станут безраздельными слугами Хари; ахам ту — я же; кинчит рахасья-пада-лобхита-дхих [сан — будучи] — жаждущий вкусить некую крайне труднодостижимую сокровенную любовь Радхи и Кришны; чайтанья-чандра-чаранам шаранам кароми — принимаю прибежище стоп Чайтаньи-Луны</w:t>
       </w:r>
     </w:p>
     <w:p>
@@ -11457,10 +11127,10 @@
           <w:b w:val="0"/>
           <w:i/>
         </w:rPr>
-        <w:t>Пословно:</w:t>
-      </w:r>
-      <w:r>
-        <w:t xml:space="preserve"> ништхам прапта — достигшая твёрдости (в которой я утвердился); вьявахрити-татих — череда занятий; лаукики — мирских; вайдики — ведических; ва — или; йа — какая; ва — или; ладджа — стыдливость; прахасана-самудгана-натья-утсавешу — при шутках, громком пении, танце и празднествах; йе — какие; ва — или; абхуван — были; ахаха — увы!; сахаджа-прана-деха-артха-дхармах — природные обязанности (дхармы), связанные с жизнью и телом; гаурах — золотой; чаурах — вор; сакалам — всё; ахарат — похитил; ках апи — некий; ме — у меня; тивра-вирйах — неодолимой силы.</w:t>
+        <w:t>Пословно (анвайя Бхактисиддханты):</w:t>
+      </w:r>
+      <w:r>
+        <w:t xml:space="preserve"> лаукики-вайдики-ништхам прапта ва вьявахрити-татих — та череда мирских и ведических дел, в которой я утвердился; прахасана-самудгана-натйотсавешу йа ва ладжа — тот стыд, что был при смехе (шутках), громком воспевании, танце, празднествах и прочем; ахаха — о!; йе ва сахаджа-прана-дехартха-дхармах — те природные свойства, что служат причиной (опорой) жизни и тела; абхуван — были; ках апи тивра-вирйах гаурах чаурах — некий вор, весьма могущественный, принявший облик Гауры; ме сакалам ахарат — всё это моё похитил</w:t>
       </w:r>
     </w:p>
     <w:p>
@@ -11523,29 +11193,16 @@
     </w:p>
     <w:p>
       <w:pPr>
+        <w:pStyle w:val="Heading3"/>
+      </w:pPr>
+      <w:r>
+        <w:t>Шлока 61</w:t>
+      </w:r>
+    </w:p>
+    <w:p>
+      <w:pPr>
         <w:spacing w:after="60"/>
         <w:ind w:left="567"/>
-        <w:jc w:val="both"/>
-      </w:pPr>
-      <w:r>
-        <w:rPr>
-          <w:sz w:val="20"/>
-        </w:rPr>
-        <w:t>Из пословного толкования: «природные свойства жизни, тела и прочего» — естественные обязанности, необходимые для поддержания жизни и тела; «праздник» включает шуточные представления (прахасана), громкое воспевание, театральные действа и торжества.</w:t>
-      </w:r>
-    </w:p>
-    <w:p>
-      <w:pPr>
-        <w:pStyle w:val="Heading3"/>
-      </w:pPr>
-      <w:r>
-        <w:t>Шлока 61</w:t>
-      </w:r>
-    </w:p>
-    <w:p>
-      <w:pPr>
-        <w:spacing w:after="60"/>
-        <w:ind w:left="567"/>
       </w:pPr>
       <w:r>
         <w:rPr>
@@ -11638,10 +11295,10 @@
           <w:b w:val="0"/>
           <w:i/>
         </w:rPr>
-        <w:t>Пословно:</w:t>
-      </w:r>
-      <w:r>
-        <w:t xml:space="preserve"> сандра-ананда-уджджвала-раса-мая-према-пийуша-синдхох — океанов нектара любви, состоящей из густого блаженства и сияющей расы; котим — миллионы; варшан — изливая; ким апи — неописуемые; каруна-снигдха-нетра-анчалена — уголком глаз, увлажнённых состраданием; ках — кто; айам — этот; девах — Бог (играющий Господь); канака-кадали-гарбха-гаура-анга-йаштих — чьё стройное золотое тело подобно сердцевине золотого бананового дерева; четах — ум; акасмат — внезапно; мама — мой; ниджа-паде — к своим стопам; гадха-йуктам — накрепко привязанным; чакара — сделал.</w:t>
+        <w:t>Пословно (анвайя Бхактисиддханты):</w:t>
+      </w:r>
+      <w:r>
+        <w:t xml:space="preserve"> каруна-снигдха-нетранчалена — уголком глаз, увлажнённых состраданием; сандрананда-уджджвала-расамая-према-пийуша-синдхох — океана нектара премы, состоящего из расы, густой (сандра), то есть […], и сияющей (уджджвала), то есть всё время обновляющейся; ким апи — неописуемые; котим варшан — изливая миллионы; ках айам — кто этот; канака-кадали-гарбха-гауранга-яштих девах — играющий (лиламая) Пуруша, чьё прекрасное стройное тело золотого цвета, как сердцевина золотого бананового дерева; акасмат — внезапно; мама четах — моё сердце; ниджа-паде — в своих, то есть в его, святых стопах; гадха-юктам чакара — крепко утвердил</w:t>
       </w:r>
     </w:p>
     <w:p>
@@ -11704,29 +11361,16 @@
     </w:p>
     <w:p>
       <w:pPr>
+        <w:pStyle w:val="Heading3"/>
+      </w:pPr>
+      <w:r>
+        <w:t>Шлока 62</w:t>
+      </w:r>
+    </w:p>
+    <w:p>
+      <w:pPr>
         <w:spacing w:after="60"/>
         <w:ind w:left="567"/>
-        <w:jc w:val="both"/>
-      </w:pPr>
-      <w:r>
-        <w:rPr>
-          <w:sz w:val="20"/>
-        </w:rPr>
-        <w:t>Из пословного толкования: «густая» (сандра) — уплотнённая; «сияющая» (уджджвала) — вечно обновляющаяся.</w:t>
-      </w:r>
-    </w:p>
-    <w:p>
-      <w:pPr>
-        <w:pStyle w:val="Heading3"/>
-      </w:pPr>
-      <w:r>
-        <w:t>Шлока 62</w:t>
-      </w:r>
-    </w:p>
-    <w:p>
-      <w:pPr>
-        <w:spacing w:after="60"/>
-        <w:ind w:left="567"/>
       </w:pPr>
       <w:r>
         <w:rPr>
@@ -11819,10 +11463,10 @@
           <w:b w:val="0"/>
           <w:i/>
         </w:rPr>
-        <w:t>Пословно:</w:t>
-      </w:r>
-      <w:r>
-        <w:t xml:space="preserve"> свайам — сам; девах — Бог; йатра — где; друта-канака-гаурах — золотой, как расплавленное золото; карунайа — по милости; маха-према-ананда-уджджвала-раса-вапух — чьё тело — сияющая раса великой любви и блаженства (махабхава, шрингара-раса); прадурабхават — явился; навадвипе — в навадвипе; тасмин — в том; пратибхавана-бхакти-утсава-майе — где в каждом доме праздник бхакти; манах — ум; ме — мой; вайкунтхат апи — даже больше, чем Вайкунтха; ча — и; мадхуре — в сладкой; дхамни — обители; рамате — находит радость.</w:t>
+        <w:t>Пословно (анвайя Бхактисиддханты):</w:t>
+      </w:r>
+      <w:r>
+        <w:t xml:space="preserve"> ятра — где; друта-канака-гаурах — золотистый, как расплавленное золото; маха-премананда-уджджвала-раса-вапух — обладающий телом, состоящим из шрингара-расы в форме махабхавы; девах — играющий Бхагаван; карунайа — из милости (подвластный милости); свайам прадурабхават — сам явился; тасмин — в той; прати-бхавана-бхакти-утсавамайе — где каждый дом полон праздника богини према-бхакти; вайкунтхат апи ча мадхуре дхамни навадвипе — в Навадвипе, обители, исполненной сладости даже большей, чем Вайкунтха; ме манах — мой ум; рамате — наслаждается (пребывает в играх)</w:t>
       </w:r>
     </w:p>
     <w:p>
@@ -11947,10 +11591,10 @@
           <w:b w:val="0"/>
           <w:i/>
         </w:rPr>
-        <w:t>Пословно:</w:t>
-      </w:r>
-      <w:r>
-        <w:t xml:space="preserve"> йат тат — что угодно; ваданту — пусть говорят; шастрани — шастры; йат тат — как угодно; вйакхйанту — пусть толкуют; таркиках — логики; дживанам — жизнь; мама — моя; чайтанья-пада-амбходжа-судха — нектар лотосных стоп Чайтаньи; эва — лишь; ту — же.</w:t>
+        <w:t>Пословно (анвайя Бхактисиддханты):</w:t>
+      </w:r>
+      <w:r>
+        <w:t xml:space="preserve"> шастрани — шастры; ят тат вадату — пусть говорят что угодно; таркиках ча — и логики; ят ят вьякхйанту — пусть толкуют как угодно; ту — но; чайтанья-падамбходжа-судха эва — именно нектар лотосных стоп Чайтаньи; мама дживанам — моя жизнь</w:t>
       </w:r>
     </w:p>
     <w:p>
@@ -12115,10 +11759,10 @@
           <w:b w:val="0"/>
           <w:i/>
         </w:rPr>
-        <w:t>Пословно:</w:t>
-      </w:r>
-      <w:r>
-        <w:t xml:space="preserve"> патанти — падают; йади — если; сиддхайах — сиддхи; кара-тале — в ладонь; свайам — сами; дурлабхах — труднодостижимые; свайам — сами; ча — и; йади — если; севаки-бхавитум — чтобы стать слугами; агатах сйух — пришли бы; сурах — боги; ким анйат — что ещё (говорить); идам эва — это самое; ва — или; йади — если; чатур-бхуджам — четырёхруким; сйат — стало бы; вапух — тело; татха апи — всё же; мама — мой; но — не; манак — ничуть; чалати — отклоняется; гаура-чандрат — от Гаурачандры; манах — ум.</w:t>
+        <w:t>Пословно (анвайя Бхактисиддханты):</w:t>
+      </w:r>
+      <w:r>
+        <w:t xml:space="preserve"> дурлабхах сиддхайах [апи] — даже крайне труднодостижимые сиддхи; яди кара-тале свайам патанти — если сами придут в руку; сурах — боги; севаки бхавитум — чтобы стать слугами; яди свайам ча агатах сьюх — если и сами придут; ким аньят — что ещё (более того); яди ва идам эва вапух — если даже это самое тело; чатур-бхуджам сьят — станет четырёхруким, то есть если будет обретена даже сарупья-мукти; татхапи мама манах — всё же мой ум; гаурачандрат — от Гаурачандры; манак но чалати — ни в малейшей степени не отклонится</w:t>
       </w:r>
     </w:p>
     <w:p>
@@ -12178,15 +11822,6 @@
         </w:rPr>
         <w:t>Пусть крайне труднодостижимые сиддхи — анима и прочие — сами придут и окажутся у меня на ладони, словно плод амалаки; пусть все боги сами явятся, чтобы служить мне; более того, пусть даже это моё тело станет четырёхруким, — и всё же мой ум ни на йоту не отклонится от Шри Гаурачандры.</w:t>
       </w:r>
-      <w:r>
-        <w:br/>
-      </w:r>
-      <w:r>
-        <w:rPr>
-          <w:sz w:val="20"/>
-        </w:rPr>
-        <w:t>Из пословного толкования: «если это тело станет четырёхруким» — то есть если будет обретено даже освобождение сарупья (обладание обликом, подобным облику Господа).</w:t>
-      </w:r>
     </w:p>
     <w:p>
       <w:pPr>
@@ -12292,10 +11927,10 @@
           <w:b w:val="0"/>
           <w:i/>
         </w:rPr>
-        <w:t>Пословно:</w:t>
-      </w:r>
-      <w:r>
-        <w:t xml:space="preserve"> васах — жительство; ме — моё; варам асту — лучше пусть будет; гхора-дахана-джвала-авали-панджаре — в клетке из языков страшного пламени; шри-чайтанья-пада-аравинда-вимукхаих — с отвернувшимися от лотосных стоп Шри Чайтаньи; ма — да не будет; кутрачит — где-либо (когда-либо); сангамах — общения; вайкунтха-ади-падам — обитель Вайкунтхи и прочее; свайам — сама собой; ча — и; милитам — достигнутую; но — не; ме — мой; манах — ум; липсате — желает; пада-амбходжа-раджах-чхата — блеск пыльцы лотосных стоп; йади — если; манак — хоть немного; гаурасйа — Гауры; но расйате — не вкушается.</w:t>
+        <w:t>Пословно (анвайя Бхактисиддханты):</w:t>
+      </w:r>
+      <w:r>
+        <w:t xml:space="preserve"> гхора-дахана-джвалавали-панджаре — в клетке из множества языков страшного пламени; варам ме васах асту — лучше пусть будет моё жительство; [кинту — но, татхапи — всё же]; шри-чайтанья-падаравинда-вимукхаих — с теми, кто отвернулся от лотосных стоп Чайтаньи; кутрачит — когда бы то ни было; сангамах — общение; ма — не; [асту — пусть будет]; яди гаурасья падамбходжа-раджас-чхата — если сияние пыльцы с лотосных стоп Чайтаньи; манак — хоть немного; но расьяте — не удастся вкусить; [тада — тогда]; ме манах — мой ум; свайам милитам вайкунтха-ади падам ча — даже обитель Вайкунтхи и прочие, обретённые сами собой, без садханы и прочего; но липсате — не желает получить</w:t>
       </w:r>
     </w:p>
     <w:p>
@@ -12460,10 +12095,10 @@
           <w:b w:val="0"/>
           <w:i/>
         </w:rPr>
-        <w:t>Пословно:</w:t>
-      </w:r>
-      <w:r>
-        <w:t xml:space="preserve"> астам нама — пусть будет; махан махан ити — «велик, велик!»; равах — молва (слава обо мне); сарва-кшама-мандале — по всему кругу земли; локе — в мире; ва — или; праката асту нама — пусть явится; махати — великая (долговечная); сиддхих — сиддхи; чаматкарини — дивная; камам — по желанию; чару-чатур-бхуджатвам — прекрасную четырёхрукость; айатам — пусть обретётся; арадхья — поклонившись; вишва-ишварам — Владыке вселенной (Вишну); четах — ум; ме — мой; баху манйате — высоко ценит; нахи нахи — нет, нет; шри-гаура-бхактим — бхакти к Шри Гауре; вина — без.</w:t>
+        <w:t>Пословно (анвайя Бхактисиддханты):</w:t>
+      </w:r>
+      <w:r>
+        <w:t xml:space="preserve"> сарва-кшама-мандале — по всему кругу земли; махан махан ити равах — такая молва (слава): «он великий человек», «он великий человек»; астам — пусть будет; нама — (частица, выражающая допущение); ва — или; локе — на земле; махати — долговечная; чаматкарини сиддхих — сверхъестественная сиддхи; праката асту — пусть явится; нама — (частица, выражающая допущение); [ким ва — или же]; вишвешварам — Владыку вселенной Вишну; арадхья — почитая; камам — желанная для себя; чару-чатур-бхуджатвам — прелестная четырёхрукость; айатам — пусть придёт; [кинту — но]; шри-гаура-бхактим вина — без бхакти к Шри Гауре; ме четах — мой ум; [этат сарвам — всего этого]; на хи бахуманьяте на хи — поистине не ценит, поистине не ценит</w:t>
       </w:r>
     </w:p>
     <w:p>
@@ -12628,10 +12263,10 @@
           <w:b w:val="0"/>
           <w:i/>
         </w:rPr>
-        <w:t>Пословно:</w:t>
-      </w:r>
-      <w:r>
-        <w:t xml:space="preserve"> чайтанья ити — «Чайтанья!»; крипамайа ити — «Милостивый!»; парама-удара ити — «Высший щедрец!»; нана-видха-према-авешита-сарва-бхута-хридайа ити — «наполнивший сердца всех существ любовью разных видов!»; ашчарья-дхаман ити — «Дивно сияющий (обитель чудесного сияния)!»; гауранга ити — «Гауранга!»; гуна-арнава ити — «Океан достоинств!»; раса-рупа ити — «Воплощение расы!»; сва-нама-прийа ити — «Любящий свои имена!»; ашрантам — неустанно; мама — мой; джалпатах — повторяющего; джаних — жизнь; ийам — эта; йайат — пусть пройдёт; ити — так; прартхайе — молю.</w:t>
+        <w:t>Пословно (анвайя Бхактисиддханты):</w:t>
+      </w:r>
+      <w:r>
+        <w:t xml:space="preserve"> [хе — о]; чайтанья ити — «Чайтанья» (слово «Чайтанья» означает: облик, состоящий из бытия, сознания и блаженства, или тот, кто притягивает сердца всех существ, — о такой Чайтанья); [хе — о]; крипамайа ити — «о милостивый»; [хе — о]; парамодара ити — «о величайший щедрец»; [хе — о]; нана-видха-према-авешита-сарва-бхута-хридайа ити — «о тот, кем сердца всех существ проникнуты разными видами премы — дасьей, сакхьей, ватсальей и мадхурьей»; [хе — о]; ашчарья-дхаман ити — «о обладатель высшим образом чудесного сияния, подобного раскалённому золоту»; [хе — о]; гауранга ити — «о Гаурасундара»; [хе — о]; гунарнава ити — «о океан благих качеств»; [хе — о]; раса-рупа ити — «о воплощённый образ випраламбха-расы»; [хе — о]; сва-нама-прийа ити — «о любящий свои имена» — так; ашрантам джалпатах — непрестанно воспевая; мама ийам джаних — эта моя жизнь; йайат — пусть пройдёт; ити прартхайе — только об этом молю</w:t>
       </w:r>
     </w:p>
     <w:p>
@@ -12691,15 +12326,6 @@
         </w:rPr>
         <w:t>«О Чайтанья-Чандра, притягивающий сердца всех существ, тело вечности, знания и блаженства!», «О сокровищница милости!», «О величайший щедрец!», «О ты, наполнивший сердца всех существ любовью разных видов!» (то есть ты, который наполняет сердца всех существ различной любовью — дасьей, сакхьей и прочими), «О обладатель дивного сияния, подобного сиянию расплавленного золота!», «О Шри Хари в золотистом теле!», «О океан благих качеств!», «О воплощённый образ расы разлуки (випраламбхи)!», «О любящий свои имена!» — пусть, воспевая такие имена, я проведу эту жизнь: только об этом я молю.</w:t>
       </w:r>
-      <w:r>
-        <w:br/>
-      </w:r>
-      <w:r>
-        <w:rPr>
-          <w:sz w:val="20"/>
-        </w:rPr>
-        <w:t>Из пословного толкования: «любовь разных видов» — дасья, сакхья, ватсалья и мадхура.</w:t>
-      </w:r>
     </w:p>
     <w:p>
       <w:pPr>
@@ -12805,10 +12431,10 @@
           <w:b w:val="0"/>
           <w:i/>
         </w:rPr>
-        <w:t>Пословно:</w:t>
-      </w:r>
-      <w:r>
-        <w:t xml:space="preserve"> када — когда; шауре — о Шаури (Кришна из рода Шуры); гауре — золотом; вапуши — к телу (твоему); парама-према-раса-де — дарующему расу высшей любви; сат-эка-пране — единственной жизни святых (расика-бхакт); нишкапата-крита-бхавах — исполненным бесхитростного чувства; асми бхавита — я стану; када ва — или когда; тасйа — его (этого чувства); алаукика-сат-анумана — неземным истинным умозаключением; мама — моём; хриди — в сердце; акасмат — внезапно; шри-радха-пада-накха-мани-джйотих — сияние драгоценных ногтей стоп Шри Радхи; удагат — взойдёт.</w:t>
+        <w:t>Пословно (анвайя Бхактисиддханты):</w:t>
+      </w:r>
+      <w:r>
+        <w:t xml:space="preserve"> [хе — о]; шауре — Шаури (Кришна, потомок Шуры); [тава — твоём]; парама-према-расаде — дарующем наивысшую расу премы, то есть дарующем возвышенную сияющую (уннатоджджвала) расу премы; сад-эка-пране — единственной жизни расика-бхакт; гауре вапуши — в теле Гауры; када — когда; нишкапата-крита-бхавах — бесхитростное чувство; бхавита асми — возникнет; када ва — или когда; тасья — этого бесхитростного чувства; алаукика-сад-анумана — неземным, то есть недоступным материальным чувствам, истинным умозаключением, то есть умозаключением: «где взошло сияние драгоценных ногтей стоп Шри Радхи, там и есть чувство к Гаурахари»; мама хриди — в моём сердце; акасмат — внезапно; шри-радха-пада-накха-мани-джйотих — сияние драгоценностей-ногтей на лотосных стопах Шри Радхи; удагат — взойдёт (при слове «када» прошедшее время употреблено в значении будущего)</w:t>
       </w:r>
     </w:p>
     <w:p>
@@ -12868,15 +12494,6 @@
         </w:rPr>
         <w:t>О Кришна, украшение рода Шуры! Когда же возникнет у меня бесхитростная рати к твоему телу Гауры — дарующему возвышенную, сияющую расу любви и являющемуся единственной жизнью преданных-расиков? И когда же посредством трансцендентного (адхокшаджа) умозаключения, исходящего из этой бесхитростной рати, в моём сердце внезапно взойдёт сияние драгоценных ногтей на стопах Шри Радхики?</w:t>
       </w:r>
-      <w:r>
-        <w:br/>
-      </w:r>
-      <w:r>
-        <w:rPr>
-          <w:sz w:val="20"/>
-        </w:rPr>
-        <w:t>Из пословного толкования: умозаключение здесь таково: где взошло сияние драгоценных ногтей на стопах Шри Радхи, там есть и чувство к Гаурахари; оно названо неземным, так как недоступно мирским чувствам.</w:t>
-      </w:r>
     </w:p>
     <w:p>
       <w:pPr>
@@ -12982,10 +12599,10 @@
           <w:b w:val="0"/>
           <w:i/>
         </w:rPr>
-        <w:t>Пословно:</w:t>
-      </w:r>
-      <w:r>
-        <w:t xml:space="preserve"> уддама-даманака-дамам — носящего гирлянду из пышно цветущей даманаки; гана-абхирамам — радующего всех людей; арама-рамам — наслаждающегося (собой) в уединённых садах; авирама-грихита-намам — непрестанно повторяющего Имя; карунья-дхама — обитель милосердия; канака-уджджвала-гаура-дхама — сияющего золотистым светом, как золото; чайтанья-нама — по имени Чайтанья; парамам — высшую; калайамах — созерцаем; дхама — обитель (прибежище).</w:t>
+        <w:t>Пословно (анвайя Бхактисиддханты):</w:t>
+      </w:r>
+      <w:r>
+        <w:t xml:space="preserve"> уддама-даманака-дамам — того, кто носит гирлянду из распустившихся цветов даманаки; ганабхирамам — гана — людей, абхитах — всецело, рамайати — радует, то есть того, кто всецело радует множество людей; арама-рамам — того, кто, пребывая в уединённом месте, переживает блаженство в себе самом; авирама-грихита-нама — того, кто непрестанно воспевает имена «Кришна» и прочие; карунья-дхама — вместилище милосердия; канакоджджвала-гаура-дхама — золотистого, сияющего, как золото; чайтанья-нама парамам дхама — высшую обитель по имени Чайтанья, то есть наивысшее прибежище; [вайам — мы]; калайамах — созерцаем (медитируем)</w:t>
       </w:r>
     </w:p>
     <w:p>
@@ -13045,15 +12662,6 @@
         </w:rPr>
         <w:t>Украшенную гирляндами из распустившихся цветов даманаки, дарующую полное блаженство множеству людей, вместилище милосердия, с золотистым сиянием, ярким, как золото, — высшую обитель по имени «Чайтанья», то есть наилучшее прибежище, мы созерцаем.</w:t>
       </w:r>
-      <w:r>
-        <w:br/>
-      </w:r>
-      <w:r>
-        <w:rPr>
-          <w:sz w:val="20"/>
-        </w:rPr>
-        <w:t>Из пословного толкования: «арама-рама» — тот, кто, пребывая в уединённом месте, переживает блаженство в себе; «авирама-грихита-нама» — тот, кто непрестанно воспевает имена.</w:t>
-      </w:r>
     </w:p>
     <w:p>
       <w:pPr>
@@ -13159,10 +12767,10 @@
           <w:b w:val="0"/>
           <w:i/>
         </w:rPr>
-        <w:t>Пословно:</w:t>
-      </w:r>
-      <w:r>
-        <w:t xml:space="preserve"> сада — всегда; ранге — на праздничной; нилачала-шикхара-шринге — на вершине ниладри; виласатах — играющего; харех — Хари (Джаганнатхи); эва — именно; бхраджат-мукха-камала-бхринга-икшана-йугам — того, чьи глаза — пчёлы на сияющем лотосе лица; самуттунга-према-унмада-раса-тарангам — в ком вздымаются высокие волны опьяняющей расы любви; мрига-дришам — для ланеоких; анангам — Ананга (Камадева); гаурангам — Гаурангу; смарату — пусть помнит; гата-сангам — отрешённого от всего; мама — мой; манах — ум.</w:t>
+        <w:t>Пословно (анвайя Бхактисиддханты):</w:t>
+      </w:r>
+      <w:r>
+        <w:t xml:space="preserve"> мама манах — мой ум; ранге нилачала-шикхара-шринге — на праздничной вершине Нилачалы; сада — всегда; виласатах харех эва — одного лишь Хари (Джаганнатхадевы), играющего там; бхраджан-мукха-камала-бхринга-икшана-йугам — бхраджат — сияющем, мукха-камалам — лотосе лица, тасмин — на нём, бхринга-рупам — в виде пчёл, икшана-йугам — пара глаз, йасья — у кого, то есть того, чьи глаза — пчёлы на сияющем лотосе лица; самуттунга-премонмада-раса-тарангам — того, в ком текут волны рас — радости, гордости и прочего, рождённых высочайшей великой премой в форме махабхавы; мригадришам анангам — для ланеоких женщин — сам Кандарпа; гата-сангам — крайне отрешённого (то есть совершенно не склонного к наслаждению самбхога-расой — к смотрению на женщин и прочему, исполняющего лилу ачарьи); гаурангам — Гаурангу; смарату — пусть помнит</w:t>
       </w:r>
     </w:p>
     <w:p>
@@ -13338,10 +12946,10 @@
           <w:b w:val="0"/>
           <w:i/>
         </w:rPr>
-        <w:t>Пословно:</w:t>
-      </w:r>
-      <w:r>
-        <w:t xml:space="preserve"> аланкарах — украшение; панкеруха-найана-нихсйанди-пайасам — влаги, струящейся из лотосных глаз; пришадбхих — каплями; сат-мукта-пхала-сулалитаих — прелестными, как лучшие жемчужины; йасйа — чьего; вапуши — на теле; уданчат-романчаих — вставшими волосками (трепетом); апи ча — а также; парама — высшая; йасйа — чья; сушама — красота; там — к тому; аламбе — прибегаю; гаурам — золотому; харим — Хари; аруна-рочишну-васанам — носящему одежду, сияющую цветом зари.</w:t>
+        <w:t>Пословно (анвайя Бхактисиддханты):</w:t>
+      </w:r>
+      <w:r>
+        <w:t xml:space="preserve"> аруна-рочишну-васанам — того, чья одежда цвета алой зари; панкеруха-найана-нихсьянди-пайасам сан-мукта-пхала-сулалитаих пришадбхих — каплями слёз, струящимися из глаз, подобных лотосам, весьма прелестными, подобными жемчужинам; йасья вапуши аланкарах — чьё тело украшено; уданчад-романчаих апи ча — также и вставшими волосками, то есть вспыхнувшими (уддипта) саттвика-бхавами — трепетом, рождённым премой, и прочим, — которыми создаётся красота его тела; там — того; гаурам — золотистого; харим — Хари; аламбе — принимаю прибежищем</w:t>
       </w:r>
     </w:p>
     <w:p>
@@ -13506,10 +13114,10 @@
           <w:b w:val="0"/>
           <w:i/>
         </w:rPr>
-        <w:t>Пословно:</w:t>
-      </w:r>
-      <w:r>
-        <w:t xml:space="preserve"> кандарпат апи — даже Кандарпы; сундарах — прекраснее; сура-сарит-пурат — потоков небесной реки (Ганги); ахо — о!; паванах — очистительнее; шита-амшох апи — даже луны; шиталах — прохладнее; сумадхурах — слаще; мадхвика-сарат апи — даже лучшего мёда (хмельного напитка); дата — щедрее (даритель); калпа-махирухат апи — даже древа желаний; маха-снигдхах — нежнее (любящий сильнее); джананйах апи — даже матери; премна — с любовью; гаура-харих — Гаурахари; када ну — когда же; хриди — в сердце; ме — моё; дхйатах — тот, о ком я размышляю; падам дхасйати — ступит.</w:t>
+        <w:t>Пословно (анвайя Бхактисиддханты):</w:t>
+      </w:r>
+      <w:r>
+        <w:t xml:space="preserve"> кандарпат апи сундарах — прекраснее даже Кандарпы ([…] — того, кто способен пренебречь даже им, то есть сокрушить даже гордость Брахмы, состоящую в красоте и могуществе, — Кандарпы; прекраснее даже его; мирской Кандарпа, или Мадана, порождает волнение и помрачение, а красота Гаурахари, уничтожая волнение и помрачение, даёт вкусить высшее счастье блаженства премы); ахо — о! (выражает изумление); сура-сарит-пурат павана — очищающий больше, чем поток небесной реки («сура-сарит» — Ганга, лучшая из всех очистительниц; «пура» — её поток; очищающий больше даже его: поток Ганги уничтожает грехи, но не может очистить грешное сердце, а Шри Гаурасундара, очистив сердце, вызывает в нём поток высшей премы — поэтому его чистота и чудесность выше, чем у потока Ганги); шитамшох апи шиталах — прохладнее даже луны (тот, у кого прохладные лучи, — луна; прохладнее даже её: луна способна устранить внешнюю тьму, жар и прочее, а Шри Гаурасундара полностью уничтожает тьму сердца — мрак невежества, накопленный за миллионы рождений, — и жар страданий, и затопляет его […] лучами блаженства премы); мадхвика-сарат апи сумадхурах — слаще даже лучшего мёда (мадхвика-сара, то есть амрита; слаще даже её: сладость амриты могут вкушать лишь боги, и как плод её вкушения у них возникает мирская гордость, зависть и прочее, а сладость Гауры недоступна даже богам, и в результате её вкушения мирская гордость, зависть и прочее полностью исчезают и является блаженство премы); калпа-махирухат апи дата — щедрее даже древа желаний (древо желаний даёт плод тому, кто его просит, а Шри Гаурасундара настолько щедр, что сам, становясь просящим, дарует богатство премы и прочее даже недостойным и тем, кто не просит); джананьях апи маха-снигдхах — нежнее даже матери (любовь матери в будущем приносит ядовитый плод, ибо направлена на бренное тело и прочее, а любовь Шри Гаурасундары направлена на душу живого существа, поэтому оно обретает право на […] высшее блаженство премы; кроме того, мать любит лишь своё дитя, а Шри Гаурасундара орошает расой любви всех живых существ); гаура-харих — Гаурахари; дхйатах — став предметом медитации; када ну — когда же; ме хриди — в моём сердце; премна — с любовью; падам дхасьяти — ступит</w:t>
       </w:r>
     </w:p>
     <w:p>
@@ -13569,15 +13177,6 @@
         </w:rPr>
         <w:t>Прекраснее Кандарпы, чище потока Ганги, спасающей падших, прохладнее луны, слаще нектара, щедрее древа желаний, нежнее матери в любви, — когда же Гаурахари, став предметом моей медитации, с любовью ступит в моё сердце?</w:t>
       </w:r>
-      <w:r>
-        <w:br/>
-      </w:r>
-      <w:r>
-        <w:rPr>
-          <w:sz w:val="20"/>
-        </w:rPr>
-        <w:t>Из пословного толкования: Кандарпа может презреть даже гордость Брахмы своей красотой и могуществом, но мирской Кандарпа (Мадана) порождает тревогу и помрачение, а красота Гаурахари уничтожает их и даёт пережить счастье высшего блаженства любви; поток Ганги уничтожает грехи, но не может очистить греховное сердце, а Шри Гаурасундара очищает сердце и вызывает в нём поток высшей любви, — поэтому он чище и удивительнее Ганги; луна способна рассеять лишь внешнюю тьму и жар, а Шри Гаурасундара полностью уничтожает тьму сердца — мрак невежества миллионов рождений — и жар страданий, затопляя сердце лучами блаженства любви; сладость нектара могут вкушать лишь боги, и от этого у них рождаются мирская гордость, зависть и прочее, а сладость Гауры недоступна даже богам, и вкушение её полностью устраняет мирскую гордость, зависть и прочее и пробуждает блаженство любви; древо желаний даёт плод лишь тому, кто его просит, а Шри Гаурасундара так щедр, что сам, став просителем, дарует богатство любви и прочее даже недостойным и не просящим; любовь матери в будущем приносит ядовитые плоды, ибо направлена на бренное тело и прочее, любовь же Шри Гаурасундары направлена на душу дживы, и потому джива становится достойной высшего блаженства любви; к тому же мать любит лишь своё дитя, а Шри Гаурасундара орошает расой любви всех живых существ.</w:t>
-      </w:r>
     </w:p>
     <w:p>
       <w:pPr>
@@ -13683,10 +13282,10 @@
           <w:b w:val="0"/>
           <w:i/>
         </w:rPr>
-        <w:t>Пословно:</w:t>
-      </w:r>
-      <w:r>
-        <w:t xml:space="preserve"> пунджам пунджам — груду за грудой; мадхура-мадхура-према-мадхви-расанам — сладчайшего хмельного нектара любви; даттва даттва — раз за разом даруя; свайам — сам; уру-дайах — безмерно милостивый; модайан — радуя; вишвам — мир; этат — этот; эках — единственный (несравненный); девах — Бог; кати-тата-милат-манджу-манджиштха-васах — на чьих бёдрах прелестная одежда, окрашенная мареной (шафранная); бхаса — сиянием; нирбхартсита-нава-тадит-котих — посрамивший миллионы новых молний; эва — именно; прийах — дорог; ме — мне.</w:t>
+        <w:t>Пословно (анвайя Бхактисиддханты):</w:t>
+      </w:r>
+      <w:r>
+        <w:t xml:space="preserve"> мадхура-мадхура-према-мадхви-расанам — расы нектара премы, слаще сладкого; пунджам пунджам — грудами; даттва даттва — раз за разом даруя; этат вишвам — этот мир; модайан — радуя; кати-тата-милан-манджу-манджиштха-васах — манджу — очень прелестный, манджиштха — особая лиана красного цвета; тот, чья одежда окрашена ею, то есть носящий на бёдрах прелестную одежду цвета охры (гайрика); бхаса-нирбхартсита-нава-тадит-коти — тот, кто своим сиянием посрамил миллионы молний, то есть обладающий сиянием тела, посрамляющим миллионы молний; свайам уру-дайах — сам высшим образом милостивый; эках девах эва — эка — недвойственный, или не имеющий равных и высших; дева — Пуруша, преданный лилам; ме прийах [асту] — пусть будет мне дорог</w:t>
       </w:r>
     </w:p>
     <w:p>
@@ -13746,15 +13345,6 @@
         </w:rPr>
         <w:t>Тот, кто, раз за разом даруя груды нектарной расы любви, сладчайшей из сладкого, радует этот мир; кто носит на бёдрах прелестную шафрановую (гаирика) одежду; чьё сияние тела посрамляет миллионы новых молний, — этот сам безмерно милостивый, недвойственный Пуруша, предающийся духовным играм, — пусть лишь он будет мне дорог.</w:t>
       </w:r>
-      <w:r>
-        <w:br/>
-      </w:r>
-      <w:r>
-        <w:rPr>
-          <w:sz w:val="20"/>
-        </w:rPr>
-        <w:t>Из пословного толкования: «эка» — недвойственный, или тот, кому нет ни равного, ни высшего; «дева» — Пуруша, предающийся играм (лиле); одежда окрашена манджиштхой — особой лианой красного цвета.</w:t>
-      </w:r>
     </w:p>
     <w:p>
       <w:pPr>
@@ -13860,10 +13450,10 @@
           <w:b w:val="0"/>
           <w:i/>
         </w:rPr>
-        <w:t>Пословно:</w:t>
-      </w:r>
-      <w:r>
-        <w:t xml:space="preserve"> кантйа — красотой; ниндита-коти-коти-маданах — посрамивший миллионы миллионов Маданов; шриман-мукха-инду-чхата-вичхайи-крита-коти-коти-шарад-унмилат-тушара-чхавих — сиянием прекрасного лица-луны затмивший миллионы миллионов восходящих осенних лун; аударйена — щедростью; ча — и; коти-коти-гунитам — умноженное миллионы миллионов раз; калпа-друмам — древо желаний; хи — поистине; алпайан — умаляющий; гаурах — Гаура; ме — моё; хриди — в сердце; коти-коти-джанушам — миллионов миллионов рождений; бхагйаих — удачей (плодами благочестия); падам дхасйати — ступит.</w:t>
+        <w:t>Пословно (анвайя Бхактисиддханты):</w:t>
+      </w:r>
+      <w:r>
+        <w:t xml:space="preserve"> кантья — прелестной красотой облика; ниндита-коти-коти-маданах — тот, кто посрамляет миллионы миллионов Кандарп; шримат-мукхенду-чхата-виччхайикрита-коти-коти-шарад-унмилат-тушара-ччхавих — шримат-мукхенду — исполненная высшей красы луна лица; чхата — сияние; тена — им; виччхайикрита — затмены; коти-коти шарад-унмилат-тушара-ччхави — миллионы миллионов осенних восходящих лун, белых, как снег; то есть тот, чьим сиянием прекраснейшего лунного лика затмеваются миллионы миллионов осенних лун; аударйена ча коти-коти-гунитам калпа-друмам хи алпайан — тот, чьей великой щедростью умаляются даже миллионы древ желаний; гаурах — Гаурасундара; коти-коти-джанушам — бесчисленных рождений; бхагйаих — плодами благих дел (сукрити); ме хриди — в моём сердце; падам дхасьяти — ступит; [ким — ли?]</w:t>
       </w:r>
     </w:p>
     <w:p>
@@ -14028,10 +13618,10 @@
           <w:b w:val="0"/>
           <w:i/>
         </w:rPr>
-        <w:t>Пословно:</w:t>
-      </w:r>
-      <w:r>
-        <w:t xml:space="preserve"> кшанам — то; кшинах — исхудавший; пинах — полный; кшанам — то; ахаха — ах!; са-ашрух — в слезах; кшанам атха — то затем; кшанам — то; смерах — улыбающийся; шитах — холодный; кшанам — то; анала-таптах — пылающий, будто от огня; кшанам апи — то; кшанам — то; дхаван — бегущий; стабдхах — оцепеневший; кшанам — то; адхика-джалпан — говорящий без умолку; кшанам ахо — то, о!; кшанам — то; муках — немой; гаурах — Гаура; спхурату — да явится; мама — мне (в сердце); дехах — тело; бхагаватах — Господа (Кришны).</w:t>
+        <w:t>Пословно (анвайя Бхактисиддханты):</w:t>
+      </w:r>
+      <w:r>
+        <w:t xml:space="preserve"> кшанам кшинах — на мгновение исхудавший (то состояние, в котором была Шримати Радхика в долгой випраламбхе, то есть в разлуке-матхура-вирахе, — Гаурахари, проникнувшись этим настроением, в разлуке с Кришной на мгновение исхудавший); кшанам [ча] пинах — и на мгновение полный (вновь в випраламбхе, […], на мгновение полный); ахаха — увы!; кшанам сашрух — на мгновение полный слёз блаженства; атха — затем; кшанам шитах — на мгновение охлаждённый (опалённый огнём разлуки с Кришной, вновь при […] на мгновение обретший прохладу); кшанам смерах — на мгновение с лёгкой улыбкой (от шуток и смеха с […] Кришной); [кшанам] анала-таптах — опалённый огнём (в према-вайчиттье, то есть даже находясь рядом с Кришной, вновь на мгновение опалённый огнём будущей разлуки с ним); кшанам дхаван — на мгновение бегущий (поглощённый мыслью «Кришна уходит», на мгновение бегущий вслед за ним); кшанам стабдхах — на мгновение оцепеневший (вновь придя в другое место и […], на мгновение оцепеневший; стамбха — первая из восьми саттвика-бхав); ахо кшанам адхика-джалпан — о! на мгновение много говорящий (на мгновение произносящий праджалпу: «О распутник, о губитель обета целомудрия, не прикасайся ко мне!»); кшанам [ча] муках — и на мгновение немой (некоторое время хранящий молчание от тяжести гордой обиды — маны); [этадришах — такое]; бхагаватах дехах — тело Бхагавана; гаурах — Гаурасундара; мама [хридайе — в сердце] спхурату — пусть явится в моём сердце</w:t>
       </w:r>
     </w:p>
     <w:p>
@@ -14091,15 +13681,6 @@
         </w:rPr>
         <w:t>То исхудавший, то полный, то с глазами, полными слёз блаженства любви, то с улыбкой на лице, то прохладный, то пылающий, то бегущий, то оцепеневший, то многоречивый, то безмолвный, — пусть такое тело Гауры, принадлежащее Кришне, явится в моём сердце.</w:t>
       </w:r>
-      <w:r>
-        <w:br/>
-      </w:r>
-      <w:r>
-        <w:rPr>
-          <w:sz w:val="20"/>
-        </w:rPr>
-        <w:t>Из пословного толкования: «исхудавший» — в долгой разлуке (випраламбхе), то есть в том состоянии, в каком была Шримати Радхика в разлуке с Кришной, ушедшим в Матхуру: Гаурахари, проникшись этим чувством, на миг исхудал от разлуки с Кришной; «полный» — снова в разлуке, [при явлении] Кришны […], на миг полный; «прохладный» — опалённый огнём разлуки с Кришной, затем, [при встрече] с Кришной, на миг обретший прохладу; «улыбающийся» — на миг с лёгкой улыбкой от смеха и шуток с Кришной; «пылающий» — према-ваичиттья, то есть, даже находясь рядом с Кришной, снова на миг опалённый огнём предстоящей разлуки с ним; «бегущий» — погружённый в чувство «Кришна уходит» и на миг бегущий за ним; «оцепеневший» — снова придя в другое место […], на миг оцепеневший (стамбха — одна из восьми саттвика-бхав); «многоречивый» — на миг произносящий бессвязные речи (праджалпа): «О распутник, губитель верности целомудренных, не касайся меня!»; «безмолвный» — на время хранящий молчание из-за обиды (маны).</w:t>
-      </w:r>
     </w:p>
     <w:p>
       <w:pPr>
@@ -14205,10 +13786,10 @@
           <w:b w:val="0"/>
           <w:i/>
         </w:rPr>
-        <w:t>Пословно:</w:t>
-      </w:r>
-      <w:r>
-        <w:t xml:space="preserve"> патра-апатра-вичаранам — разбора, достоин или недостоин; на куруте — не делает; на — не; свам — своего; парам — чужого; викшате — различает; дейа-адейа-вимаршаках — взвешивающий, что можно дать и чего нельзя; нахи — не; на ва — и не; кала-пратикшах — ожидающий (подходящего) времени; прабхух — Господь; садйах — тотчас; йах — который; шравана-икшана-пранамана-дхйана-адина — через слушание (о нём), лицезрение, поклоны, медитацию и прочее; дурлабхам — труднодостижимую; датте — дарует; бхакти-расам — расу бхакти; сах эва — именно он; бхагаван — Господь; гаурах — Гаура; парам — высшее (единственное); ме — моё; гатих — прибежище.</w:t>
+        <w:t>Пословно (анвайя Бхактисиддханты):</w:t>
+      </w:r>
+      <w:r>
+        <w:t xml:space="preserve"> ях прабхух — тот Прабху (прабху — независимый Владыка), который; патрапатра-вичаранам — рассуждения о том, достоин человек или недостоин; на куруте — не производит; на свам парам викшате — не смотрит, свой или чужой; на хи деядея-вимаршаках — не размышляет и не рассуждает о том, что можно дать, а что нельзя; на ва кала-пратикшах — и не ждёт подходящего или неподходящего времени; шравана-икшана-пранамана-дхьяна-адина — слушанием, лицезрением, поклонами, медитацией и прочим; дурлабхам бхакти-расам — расу труднодостижимой бхакти; садьях датте — тотчас дарует; сах бхагаван гаурах эва — именно тот Бхагаван Гаурасундара; ме парам гатих — моё единственное прибежище</w:t>
       </w:r>
     </w:p>
     <w:p>
@@ -14373,10 +13954,10 @@
           <w:b w:val="0"/>
           <w:i/>
         </w:rPr>
-        <w:t>Пословно:</w:t>
-      </w:r>
-      <w:r>
-        <w:t xml:space="preserve"> папийан апи — даже величайший грешник; хина-джатих апи — даже низкорождённый; духшилах апи — даже порочный; душкарманам — дурных дел; сима апи — даже предел; швапача-адхамах апи — даже хуже собакоеда; сатата — вечно; дурвасана-адхйах апи — даже полный дурных наклонностей; ча — и; дурдеша-прабхавах апи — даже рождённый в дурной стране; татра — там; вихита-авасах апи — даже живущий; духсангатах — от дурного общества; наштах апи — даже погибший; уддхритах — спасён; эва — непременно; йена — кем; крипайа — по милости; там — к тому; гаурам — Гауре; эва — лишь; ашрайе — прибегаю.</w:t>
+        <w:t>Пословно (анвайя Бхактисиддханты):</w:t>
+      </w:r>
+      <w:r>
+        <w:t xml:space="preserve"> папийан апи — даже величайший грешник (как Гопала Чапала и прочие, поражённые проказой); хина-джатих апи — даже низкорождённый (как портные, яваны и прочие низкие касты); духшилах апи — даже человек дурного нрава; душкарманам сима апи — даже дошедший до предела крайне дурных дел (похищения чужих жён, пьянства и прочего), как Джагай, Мадхай и им подобные; швапачадхамах апи — даже худший, чем чандала; сататам дурвасанадхьях апи — даже тот, кто вечно предан дурным желаниям; дурдеша-прабхавах апи ча — и даже рождённый в дурной стране (там, где нет Ганги или куда не ходили Пандавы, — в таких землях, лишённых Ганги и Пандавов); татра вихитавасах апи — даже живущий в тех местах вследствие дурных дел; духсангатах наштах апи — даже погибший от дурного общества; йена крипайа эва уддхритах — тот, чьей милостью был спасён; там гаурам эва — лишь того Гаурасундару; ашрайе — принимаю прибежищем</w:t>
       </w:r>
     </w:p>
     <w:p>
@@ -14436,15 +14017,6 @@
         </w:rPr>
         <w:t>Тот, по чьей милости обрели спасение даже величайшие грешники вроде Гопала Чапала, низкорождённые вроде портного-явана и прочих, люди дурного нрава, дошедшие до предела дурных дел, — Джагай, Мадхай и им подобные, преданные греху и запретным деяниям, — существа ниже собакоеда-чандала, всегда преданные дурным наклонностям, рождённые в дурной стране, где нет Ганги и куда не ступали Пандавы, и живущие в дурной стране, а также погибшие от дурного общества, — к этому Гаурасундаре я прибегаю как к единственному прибежищу.</w:t>
       </w:r>
-      <w:r>
-        <w:br/>
-      </w:r>
-      <w:r>
-        <w:rPr>
-          <w:sz w:val="20"/>
-        </w:rPr>
-        <w:t>Из пословного толкования: Гопал Чапал и подобные ему — величайшие грешники, поражённые проказой; «предел дурных дел» — похищение чужих жён, пьянство и т. п.; в дурной стране они живут вследствие своих дурных дел.</w:t>
-      </w:r>
     </w:p>
     <w:p>
       <w:pPr>
@@ -14550,10 +14122,10 @@
           <w:b w:val="0"/>
           <w:i/>
         </w:rPr>
-        <w:t>Пословно:</w:t>
-      </w:r>
-      <w:r>
-        <w:t xml:space="preserve"> калинда-танайа-тате — на берегу дочери Калинды (Ямуны); спхурат-аманда-вриндаванам — ярко сияющий Вриндаван; вихайа — оставив; лавана-амбудхех — солёного океана; пулина-пушпа-ватим — в цветущие сады на берегу; гатах — ушедший; дхрита-аруна-патах — надевший одеяние цвета зари; парихрита-су-пита-васах — отбросивший прекрасную жёлтую одежду; харих — Хари; тирохита-ниджа-чхавих — скрывший собственный (тёмный) облик; праката-гаурима — явивший золотистость; ме — моё; гатих — прибежище.</w:t>
+        <w:t>Пословно (анвайя Бхактисиддханты):</w:t>
+      </w:r>
+      <w:r>
+        <w:t xml:space="preserve"> калинда-танайа-тате — Калинда — гора Калинда, её танайя — дочь, Ямуна, тате — на берегу; или Калинда означает солнце, его дочь — Ямуна, на её берегу; то есть на берегу Ямуны; спхурад-аманда-вриндаванам — сияющий, прелестнейший Вриндаван; вихайя — оставив; лаванамбудхех — солёного океана; пулина-пушпа-ватим — в прибрежный цветочный сад; гатах — тот, кто ушёл; парихрита-супита-васах — тот, кто, оставив прекраснейшую жёлтую одежду; дхритаруна-патах — надел одежду цвета зари; тирохита-ниджа-ччхавих — тот, кто, скрыв свой собственный тёмный цвет, подобный сапфиру индранила (в анувада: покрыв его чувством и сиянием своей возлюбленнейшей Шримати Радхики); праката-гаурима — явил золотое сияние; харих — тот Шри Хари; ме гатих — моё прибежище</w:t>
       </w:r>
     </w:p>
     <w:p>
@@ -14613,15 +14185,6 @@
         </w:rPr>
         <w:t>Тот, кто оставил сияющий прекрасный Вриндаван на берегу дочери Калинды и ушёл в цветущие сады на берегу солёного океана; кто оставил прекраснейшую жёлтую одежду и надел одежду цвета зари; кто скрыл свой цвет, то есть тёмный цвет (чувством и сиянием своей возлюбленнейшей Шримати Радхики), и явил золотистое сияние, — этот Шри Хари — моё единственное прибежище.</w:t>
       </w:r>
-      <w:r>
-        <w:br/>
-      </w:r>
-      <w:r>
-        <w:rPr>
-          <w:sz w:val="20"/>
-        </w:rPr>
-        <w:t>Из пословного толкования: «дочь Калинды» — Ямуна: Калинда — это гора Калинда или же солнце; собственный цвет Кришны — тёмный, как сапфир (индранила).</w:t>
-      </w:r>
     </w:p>
     <w:p>
       <w:pPr>
@@ -14735,10 +14298,10 @@
           <w:b w:val="0"/>
           <w:i/>
         </w:rPr>
-        <w:t>Пословно:</w:t>
-      </w:r>
-      <w:r>
-        <w:t xml:space="preserve"> аре — эй; мудхах — глупцы; гудхам — сокровенный; вичинута — ищите; харех — Хари; бхакти-падавим — путь преданности; давийасйа — далеко видящим; дриштйа — взором; апи — даже; апаричита-пурвам — прежде неведомый; муни-вараих — лучшим мудрецам; на — нет; вишрамбхах — веры; читте — в сердце; йади — если; йади ча — и если; даурлабхйам — недостижимость; ива — словно; тат — то (всё); паритйаджйа — оставив; ашешам — без остатка; враджата — идите; шаранам — под прибежище; гаура-чаранам — стоп Гауры.</w:t>
+        <w:t>Пословно (анвайя Бхактисиддханты):</w:t>
+      </w:r>
+      <w:r>
+        <w:t xml:space="preserve"> аре мудхах — эй, глупцы; мунивараих давийасья дриштья апи апаричита-пурвам — тот, который мудрецы прежде не могли познать даже своим далеко видящим взором; гудхам — сокровенный; харех бхакти-падавим — путь бхакти Шри Хари; вичинута — ищите; яди читте на вишрамбхах — если в сердце нет веры (из-за того, что путь бхакти слишком сокровенен); яди ча даурлабхьям ива — и если он кажется именно труднодостижимым; тат [сарвам] ашешам паритьяджья — оставив всё это полностью; гаура-чаранам шаранам враджата — примите прибежище стоп Гаурахари</w:t>
       </w:r>
     </w:p>
     <w:p>
@@ -14798,15 +14361,6 @@
         </w:rPr>
         <w:t>Эй, глупцы! Ищите тот сокровенный путь преданности Хари, который прежде не могли познать даже мудрецы своим далеко видящим взором (дальновидностью). А если в сердце нет веры, если он кажется труднодостижимым, — полностью оставьте всё это (свои усилия) и примите прибежище у стоп Гаурахари.</w:t>
       </w:r>
-      <w:r>
-        <w:br/>
-      </w:r>
-      <w:r>
-        <w:rPr>
-          <w:sz w:val="20"/>
-        </w:rPr>
-        <w:t>Из пословного толкования: веры может не быть оттого, что путь бхакти крайне сокровенен.</w:t>
-      </w:r>
     </w:p>
     <w:p>
       <w:pPr>
@@ -14912,10 +14466,10 @@
           <w:b w:val="0"/>
           <w:i/>
         </w:rPr>
-        <w:t>Пословно:</w:t>
-      </w:r>
-      <w:r>
-        <w:t xml:space="preserve"> дадхат — держащего; мурдхани — на голове; урдхвам — поднятые вверх; мукулита-кара-амбходжа-йугалам — сложенные бутоном лотосы ладоней; галат-нетра-амбхобхих — струящимися слезами глаз; снапита-мриду-ганда-стхала-йугам — чьи нежные щёки омыты; дукулена — тканью; авитам — облачённого; нава-камала-кинджалка-ручина — цвета тычинок свежего лотоса; парам — высший; джйотих — свет; гаурам — Гауру; канака-ручи-чаурам — похитителя золотого сияния; пранамата — склонитесь (поклонитесь).</w:t>
+        <w:t>Пословно (анвайя Бхактисиддханты):</w:t>
+      </w:r>
+      <w:r>
+        <w:t xml:space="preserve"> мукулита-карамбходжа-югалам — пару лотосов ладоней, сложенных (в анджали); мурдхни — на голове; урдхвам — вверх поднятыми; дадхат — держащего; галан-нетрамбхобхих — струящейся из глаз влагой; снапита-мриду-ганда-стхала-югам — того, чьи нежные щёки омыты; нава-камала-кинджалка-ручина — с блеском, как у тычинок свежего лотоса; дукулена — тканью; авитам — украшенного; канака-ручи-чаурам — канака — золото, ручи — его сияние, чаура — похититель, то есть того, кто принял золотое сияние; парам джйотих — высший свет; гаурам — Гаурасундаре; пранамата — поклонитесь (принесите пранаму)</w:t>
       </w:r>
     </w:p>
     <w:p>
@@ -15080,10 +14634,10 @@
           <w:b w:val="0"/>
           <w:i/>
         </w:rPr>
-        <w:t>Пословно:</w:t>
-      </w:r>
-      <w:r>
-        <w:t xml:space="preserve"> уччаих — громко; киртайа — воспевай; нама — (усилительная частица); гокула-патех — владыки Гокулы; уддама-нама-авалим — могущественную череду имён; йад ва — или же; бхавайа — созерцай; тасйа — его; дивйа-мадхурам — божественный, сладкий; рупам — облик; джагат-мангалам — несущий благо миру; ханта — увы; према-маха-раса-уджджвала-паде — к ступени уджджвала — великой расы любви; на — не; аша апи — даже надежды; те — у тебя; самбхавет — будет; шри-чайтанья-маха-прабхох — Шри Чайтаньи Махапрабху; йади — если; крипа-дриштих — милостивый взгляд; патет — падёт; на — не; твайи — на тебя.</w:t>
+        <w:t>Пословно (анвайя Бхактисиддханты):</w:t>
+      </w:r>
+      <w:r>
+        <w:t xml:space="preserve"> [хе бхратах — о брат]; уччаих — громко; гокула-патех — Сына царя Враджа; уддама-намавалим — череду имён, обладающую высшим могуществом; нама — (украшение речи, в значении согласия или уверенности); киртайа — воспевай; яд ва — или; тасья — его; дивья-мадхурам — сияющий, исполненный сладости; джаган-мангалам — несущий благо миру; рупам бхавайа — созерцай облик; яди шри-чайтанья-махапрабхох — если Шри Чайтаньи Махапрабху; крипа-дриштих — милостивый взгляд; твайи — на тебя; на патет — не упадёт; ханта — увы; [тада — тогда]; према-махарасоджджвала-паде — в предмете уджджвалы (сияющей расы), в которой из-за премы есть «махат» — наивысшая раса; уджджвала — это шрингара, «пада» — то есть предмет; шрингара-расу и называют уджджвала-расой; те — у тебя; аша апи на самбхавет — даже надежды не может быть</w:t>
       </w:r>
     </w:p>
     <w:p>
@@ -15143,15 +14697,6 @@
         </w:rPr>
         <w:t>О брат! Громко воспевай исполненный великой силы ряд имён владыки Гокулы или же созерцай его благой для мира, божественно-сладкий облик, — но если на тебя не упал милостивый взгляд Шри Чайтаньи Махапрабху, то у тебя не может быть даже надежды на ту высочайшую, возвышенную и сияющую расу любви.</w:t>
       </w:r>
-      <w:r>
-        <w:br/>
-      </w:r>
-      <w:r>
-        <w:rPr>
-          <w:sz w:val="20"/>
-        </w:rPr>
-        <w:t>Из пословного толкования: «сияющая (удджвала) раса» — это шрингара, раса супружеской любви, в которой заключена величайшая раса.</w:t>
-      </w:r>
     </w:p>
     <w:p>
       <w:pPr>
@@ -15257,10 +14802,10 @@
           <w:b w:val="0"/>
           <w:i/>
         </w:rPr>
-        <w:t>Пословно:</w:t>
-      </w:r>
-      <w:r>
-        <w:t xml:space="preserve"> айе — эй; на куру — не совершай; сахасам — опрометчивости (не берись наобум за иные пути без прибежища Чайтаньи); тава — твоим; хасанти — смеются; сарва-удйамам — над всеми усилиями; джанах — люди; паритах — вокруг (всецело); унмадах — опьянённые; хари-раса-амрита-асвадинах — вкушающие нектар Хари-расы; идам — это; ту — же; нибхритам — втайне; шрину — выслушай; пранайа-васту — предмет любви; прастуйате — представлен; йат эва — что именно; нигамешу — в Ведах; тат-патих — его владыка; айам — этот; хи — поистине; гаурах — Гаура; парам — только.</w:t>
+        <w:t>Пословно (анвайя Бхактисиддханты):</w:t>
+      </w:r>
+      <w:r>
+        <w:t xml:space="preserve"> айе — о! [бхратах — брат]; [шри-чайтанья-падашрайам вина анья-садханешу — в иных садханах, помимо прибежища стоп Шри Чайтаньи]; сахасам на куру — не совершай опрометчивости, то есть не берись за них поспешно; [ятах — так как]; хари-расамритасвадинах — искусные во вкушении нектара бхакти-расы Хари, похищающего сердце и богатство, то есть Шри Кришны; [атах эва — поэтому]; паритах унмадах — те, у кого всецело поднялось опьянение, то есть блаженство премы, — эти преданные Гауры; тава — твоим; сарводьямам — всем видам усилий; хасанти — смеются; идам ту нибхритам шрину — выслушай же эту сокровенную речь; нигамешу — в Ведах и прочих шастрах; ят эва пранайа-васту прастуйате — то, что представлено как предмет (вещество) любви; тат-патих — его владыка, то есть объект (вишая); айам хи — несомненно этот; [парам — только]; гаурах — Гаура</w:t>
       </w:r>
     </w:p>
     <w:p>
@@ -15320,15 +14865,6 @@
         </w:rPr>
         <w:t>Эй, не бросайся опрометчиво ни в какую иную садхану, кроме прибежища стоп Шри Чайтаньи: люди Гауры, всецело опьянённые питьём нектарной расы любви к Кришне, смеются над всеми твоими усилиями. А теперь выслушай одно сокровеннейшее слово: то, что во всех Ведах и прочих шастрах представлено как предмет любви, — знай твёрдо: единственный его объект (вишая) — этот Шри Гауранга.</w:t>
       </w:r>
-      <w:r>
-        <w:br/>
-      </w:r>
-      <w:r>
-        <w:rPr>
-          <w:sz w:val="20"/>
-        </w:rPr>
-        <w:t>Из пословного толкования: «Хари» — тот, чья природа — похищать сердце и богатство; «опьянённые» — те, в ком поднялось опьянение, то есть блаженство любви, — преданные Гауры.</w:t>
-      </w:r>
     </w:p>
     <w:p>
       <w:pPr>
@@ -15434,10 +14970,10 @@
           <w:b w:val="0"/>
           <w:i/>
         </w:rPr>
-        <w:t>Пословно:</w:t>
-      </w:r>
-      <w:r>
-        <w:t xml:space="preserve"> джнана-ади-вартма-виручим — отвращающий от пути знания и прочего; враджа-натха-бхакти-ритим — путь преданности владыке Враджа; на ведми — не знаю; на ча — и не; сат-гуравах — истинные гуру; миланти — встречаются; ха ханта ханта — увы, увы; мама — моё; ках — кто; шаранам — прибежище; вимудха — о глупец; гаурах харих — Гаура-Хари; тава — твоих; на — не; карна-патхам — пути ушей; гатах асти — достиг.</w:t>
+        <w:t>Пословно (анвайя Бхактисиддханты):</w:t>
+      </w:r>
+      <w:r>
+        <w:t xml:space="preserve"> джнянади-вартма-виручим — вызывающий отвращение к путям знания (джняна — знание Брахмана без различий; «и прочее» — постоянные и периодические обязанности, адхьятма-йога, сухое отречение и прочее); враджанатха-бхакти-ритим — метод поклонения Шри Кришне; на ведми — не знаю; на ча мама сад-гуравах миланти — и истинные гуру мне не встречаются; мама ках шаранам [бхавита — будет] — каков мой путь (кто моё прибежище)?; ха ханта ханта — увы, увы!; [аре — эй]; вимудха — о, ты — изрядный глупец!; гаурах харих — Гаурахари; тава карна-патхам на гатах асти — неужели не вошёл в путь твоих ушей? — то есть скорее введи поклонение Гаурахари в путь своих ушей, не медли больше</w:t>
       </w:r>
     </w:p>
     <w:p>
@@ -15497,15 +15033,6 @@
         </w:rPr>
         <w:t>«Путь поклонения Шри Кришне, вызывающий отвращение к пути знания недифференцированного Брахмана и прочим, — его я ведь не знаю! И с истинными гуру мне не доводится встретиться! (Что же мне теперь делать?) У кого мне искать прибежища?» — Увы, увы, глупец ты! (Ты всё ещё не можешь решить, кто твоё прибежище?) Неужели даже имя Гаурахари не вошло в твои уши?</w:t>
       </w:r>
-      <w:r>
-        <w:br/>
-      </w:r>
-      <w:r>
-        <w:rPr>
-          <w:sz w:val="20"/>
-        </w:rPr>
-        <w:t>Из пословного толкования: «знание и прочее» — это знание недифференцированного Брахмана, постоянные и периодические обязанности (нитья-наимиттика дхарма), адхьятма-йога, сухое отречение и т. п.; смысл последних слов: скорее донеси до своих ушей поклонение Гаурахари, не медли больше.</w:t>
-      </w:r>
     </w:p>
     <w:p>
       <w:pPr>
@@ -15611,10 +15138,10 @@
           <w:b w:val="0"/>
           <w:i/>
         </w:rPr>
-        <w:t>Пословно:</w:t>
-      </w:r>
-      <w:r>
-        <w:t xml:space="preserve"> вритха-авешам — напрасную увлечённость; кармасу — обрядами (нитья-наймиттика кармой); апанайата — отбросьте; вартам апи — даже разговора; манак — малейшего; на — не; карна-абхйарне апи — даже близко к ушам; квачана — когда-либо; найата — подпускайте; адхйатма-саранех — о пути (умозрительного) постижения Атмана; на — не; мохам — заблуждению; деха-адау — в отношении тела и прочего; бхаджата — предавайтесь; парама-ашчарйа-мадхурах — высшим образом дивный и сладкий; пум-артханам — целей человека; маулих — венец (према); милати — придёт; бхаватам — к вам; гаура-крипайа — по милости Гауры.</w:t>
+        <w:t>Пословно (анвайя Бхактисиддханты):</w:t>
+      </w:r>
+      <w:r>
+        <w:t xml:space="preserve"> кармасу — в постоянных и периодических обрядах; вритхавешам — напрасную увлечённость; апанайата — отбросьте прочь; адхьятма-сараних — адхьятма — рассуждение «нети, нети» сторонников восходящего пути (ароха-вади), сарани — его путь; манак вартам апи — даже малейшего разговора; квачана — когда-либо; карнабхьярне апи — даже к окрестности ушей; на найата — не подпускайте; дехадау — в теле и прочем (слово «и прочее» означает […], страну, общество и все прочие вещи); мохам на бхаджата — не предавайтесь заблуждению; [тада — тогда]; парамашчарья-мадхурах — обладающий высочайшей, вызывающей изумление особой сладостью; пумартханам маулих — венец целей человека — пятая цель, према; бхаватам — вами; гаура-крипайа — по милости Гаурасундары; милати — будет обретён (настоящее время в значении близкого будущего)</w:t>
       </w:r>
     </w:p>
     <w:p>
@@ -15674,15 +15201,6 @@
         </w:rPr>
         <w:t>Далеко отбрось напрасную увлечённость постоянными, периодическими и прочими обрядами (кармой); никогда не допускай даже к порогу своих ушей хоть малейшего слова о пути восходящего рассуждения (ароха) и никогда не впадай в заблуждение относительно тела и всего, что с ним связано, — тогда по милости Шри Гаурасундары вы обретёте венец целей человека — любовь к Кришне, полную высшей дивной сладости.</w:t>
       </w:r>
-      <w:r>
-        <w:br/>
-      </w:r>
-      <w:r>
-        <w:rPr>
-          <w:sz w:val="20"/>
-        </w:rPr>
-        <w:t>Из пословного толкования: «путь адхьятмы» — рассуждение «нети, нети» («не то, не то») сторонников восходящего метода; «тело и прочее» — тело, дом, семья, страна, общество и всё подобное; «венец целей человека» — према, пятая цель человека.</w:t>
-      </w:r>
     </w:p>
     <w:p>
       <w:pPr>
@@ -15788,10 +15306,10 @@
           <w:b w:val="0"/>
           <w:i/>
         </w:rPr>
-        <w:t>Пословно:</w:t>
-      </w:r>
-      <w:r>
-        <w:t xml:space="preserve"> алам — довольно; шастра-абхйасаих — изучения шастр; алам — довольно; ахаха — ах; тиртха-атаникайа — паломничеств; сада — всегда; йошит-вйагхрйах — тигрицы-женщины; трасата — страшитесь; витатхам — обманчивые (бренные); тхут-куру — оплюйте; дивам — небеса; тринам-манйах — считая (их) соломинкой; дханйах — о счастливцы; шрайата — примите прибежище; кила — поистине; саннйаси-капатам — принявшего личину санньясина; натантам — пляшущего; гаурангам — Гауранги; ниджа-раса-мадат — от опьянения собственной расой; амбудхи-тате — на берегу океана.</w:t>
+        <w:t>Пословно (анвайя Бхактисиддханты):</w:t>
+      </w:r>
+      <w:r>
+        <w:t xml:space="preserve"> ахаха — увы!; сада йошид-вьягхрьях трасата — всегда остерегайтесь тигрицы-женщины; (если спросят: «раз, сравнив женщину с тигрицей, запретили общение с женщинами, то как же без жертвоприношений и прочих обрядов, совершаемых вместе с женой, достичь рая?» — предвидя этот вопрос, он говорит:) витатхам — ложный, то есть бренный; дивам — рай; тринам-маньях — считая ничтожным, как соломинка; тхуткуру — плюньте на него; [предвидя вопрос: «хорошо, пусть так; тогда мы будем изучать шастры йоги и совершать йогу и прочее — ведь этим можно достичь всех целей», говорит:] шастрабхьясаих алам — изучение шастр напрасно; [ибо у тех, кто практикует йогу, изучив их, совершенство — дело далёкое; говорится о падении даже утвердившихся в йоге; какой смысл в такой практике, успех которой столь неверен, а сама практика крайне мучительна?]; [предвидя вопрос: «если так, то служение святым местам ведь приятнее? служа тиртхам, мы обретём знание и прочее и в результате станем достойны освобождения», говорит:] тиртхатаникайа [ча] алам — и в паломничествах что пользы?; [ибо, во-первых, паломничество — тяжкий труд, во-вторых, поскольку у кармы и гьяни с мирским умом есть оскорбления святой обители, их хождение по тиртхам — лишь напрасное усилие ради удовлетворения чувств; что же тогда следует делать — это он теперь заключает:]; дханьях — о люди, достойные обрести богатство премы; [юям — вы]; ниджа-раса-мадат амбудхи-тате — от блаженства, рождённого расой премы своего облика Кришны, на берегу океана в Нилачале; натантам — танцующего; саннйаси-капатам — исполняющего лилу санньясы; кила — несомненно; гаурангам шрайата — примите прибежище Гауранги</w:t>
       </w:r>
     </w:p>
     <w:p>
@@ -15851,15 +15369,6 @@
         </w:rPr>
         <w:t>Всегда остерегайтесь общения с женщинами-тигрицами; сочтя рай (преходящий) ничтожным, как соломинка, плюньте на него; к чему изучение множества шастр? — оставьте и его; и какая польза в паломничествах? — откажитесь и от них. (Вот, смотрите:) Шри Гаура, исполняющий роль санньясина, пляшет на берегу синего океана у Нилачалы в блаженстве любви своей собственной сущности — Кришны! О удачливые преданные, (идите же, идите,) примите прибежище у его стоп.</w:t>
       </w:r>
-      <w:r>
-        <w:br/>
-      </w:r>
-      <w:r>
-        <w:rPr>
-          <w:sz w:val="20"/>
-        </w:rPr>
-        <w:t>Из пословного толкования: женщина сравнена с тигрицей, и разговор с ней запрещён; на возражение: «Как же тогда обрести рай, ведь жертвоприношения и прочие обряды совершают вместе с женой?» — сказано: плюньте на рай, он ложен, то есть преходящ. На возражение: «Тогда мы будем изучать шастры о йоге и практиковать йогу — это может дать все совершенства» — сказано: довольно изучения шастр, ведь у практикующих йогу совершенство не то что далеко — говорится даже о падении достигших высот йоги; где достижение столь ненадёжно, а сама практика столь мучительна, — какая в ней нужда? На возражение: «Тогда служение святым местам приятнее: служа им, мы обретём знание и станем достойны освобождения» — сказано: довольно паломничеств, ведь, во-первых, это тяжкий труд, а во-вторых, у карми и гьяни с мирским умом остаются оскорбления святой обители (дхама-апарадха), и их странствия по святым местам — лишь напрасные усилия ради услаждения чувств. «Дханьях» — люди, достойные обрести богатство любви.</w:t>
-      </w:r>
     </w:p>
     <w:p>
       <w:pPr>
@@ -15965,10 +15474,10 @@
           <w:b w:val="0"/>
           <w:i/>
         </w:rPr>
-        <w:t>Пословно:</w:t>
-      </w:r>
-      <w:r>
-        <w:t xml:space="preserve"> ким — к чему; тават — же; бата — увы; дургамешу — на труднопроходимых; випхалам — бесплодно (скитаться); йога-ади-маргешу — путях йоги и прочих; ахо — о (братья); бхактим — бхакти; кришна-пада-амбудже — лотосным стопам Кришны; видадхатах — посвящая; сарва-артхам — все цели (высшее сокровище — прему); алунтхата — захватите; аша — надежда; према-маха-утсаве — на великий праздник любви; йади — если; шива-брахма-ади-алабхйе — недоступный Шиве, Брахме и другим; адбхуте — дивный; гауре — к Гауре; дхамани — сиянию (обители); дурвигаха-махима-ударе — чьё величие непостижимо, щедрому; тада — тогда; раджйатам — пусть будет привязанность (привяжитесь).</w:t>
+        <w:t>Пословно (анвайя Бхактисиддханты):</w:t>
+      </w:r>
+      <w:r>
+        <w:t xml:space="preserve"> бата — увы (выражает сожаление); ахо — эй (обращение) [ахо бхратарах — о братья]; дургамешу йогади-маргешу — на труднопроходимых путях восьмиступенчатой йоги и прочих; ким тават випхалам [анусандханам крияте — совершается поиск] — что пользы бесплодно блуждать?; кришна-падамбудже бхактим видадхатах — совершающие бхакти лотосным стопам Кришны; сарвартхам — прему, венец всех целей, или то, что среди всех вещей есть единственная цель (прайоджана), — богатство премы; алунтхата — захватите силой, разграбьте полностью; шива-брахмади-алабхйе — недоступном даже Шиве, Брахме и прочим; адбхуте — дивном; према-махотсаве — в великом празднике премы; яди аша [вартате] — если есть надежда; тада — тогда; дурвигаха-махимодаре гауре дхамани — к Гауре — обители, чьё величие непостижимо и кто щедр, то есть велик в щедрости (маха-ваданья); раджьятам — исполнитесь привязанности (анураги)</w:t>
       </w:r>
     </w:p>
     <w:p>
@@ -16028,15 +15537,6 @@
         </w:rPr>
         <w:t>О братья! Какой толк в напрасных поисках на мучительно трудных путях аштанга-йоги и прочих? Совершая бхакти к лотосным стопам Кришны, расхищайте богатство любви — всё самое ценное. А если у вас есть надежда на праздник блаженства любви, высшим образом дивный, недоступный даже Шиве, Брахме и другим, — тогда возлюбите великощедрого Гаурахари, чьё величие непостижимо.</w:t>
       </w:r>
-      <w:r>
-        <w:br/>
-      </w:r>
-      <w:r>
-        <w:rPr>
-          <w:sz w:val="20"/>
-        </w:rPr>
-        <w:t>Из пословного толкования: «всё ценное» (сарвартха) — это према, венец всех целей, или единственная подлинная нужда среди всех вещей — богатство любви.</w:t>
-      </w:r>
     </w:p>
     <w:p>
       <w:pPr>
@@ -16102,10 +15602,10 @@
           <w:b w:val="0"/>
           <w:i/>
         </w:rPr>
-        <w:t>Пословно:</w:t>
-      </w:r>
-      <w:r>
-        <w:t xml:space="preserve"> йатха йатха — по мере того как; гаура-пада-аравинде — к лотосным стопам Гауры; виндета — обретает; бхактим — бхакти; крита-пунйа-раших — совершивший груды благих дел; татха татха — так; утсарпати — вздымается; хриди — в сердце; акасмат — внезапно; радха-пада-амбходжа-судха-амбу-раших — океан нектара лотосных стоп Радхи.</w:t>
+        <w:t>Пословно (анвайя Бхактисиддханты):</w:t>
+      </w:r>
+      <w:r>
+        <w:t xml:space="preserve"> крита-пунья-раших — человек, совершивший груды благих дел (сукрити); гаура-падаравинде — к лотосным стопам Шри Гаурасундары; ятха ятха — по мере того как; бхактим виндета — обретает бхакти; акасмат — внезапно; [тасья — его]; хриди — в сердце; татха татха — в той же мере; радха-падамбходжа-судхамбу-раших — океан нектара лотосных стоп Шри Радхи; утсарпати — вздымается</w:t>
       </w:r>
     </w:p>
     <w:p>
@@ -16270,10 +15770,10 @@
           <w:b w:val="0"/>
           <w:i/>
         </w:rPr>
-        <w:t>Пословно:</w:t>
-      </w:r>
-      <w:r>
-        <w:t xml:space="preserve"> апарасйа — безбрежного; према-уджджвала-раса-рахасйа-амрита-нидхех — океана нектара тайны расы, сияющей любовью; нидханам — хранилище; брахма-иша-арчитах — почитаемые Брахмой и Шивой; иха — здесь; хи — ведь; чайтанья-чаранах — стопы Чайтаньи; атах — поэтому; там — их; дхйайантах — созерцая; пранайа-бхаратах — от избытка любви; йанту шаранам — пусть ищут прибежища; там эва — у них же; пронматтах — обезумев; там — о них; иха — здесь (в Кали-югу); кила — поистине; гайанту — пусть поют; критинах — мудрые (благочестивые).</w:t>
+        <w:t>Пословно (анвайя Бхактисиддханты):</w:t>
+      </w:r>
+      <w:r>
+        <w:t xml:space="preserve"> чайтанья-чаранах — стопы Чайтаньи; хи — так как; брахмешарчитах — почитаемы даже Шивой и Брахмой; апарасья — безбрежного; премоджджвала-раса-рахасьямрита-нидхех — океана нектара, который есть тайна сияющей расы премы; нидханам — вместилище; атах — поэтому; критинах — обладающие сукрити, то есть люди, принимающие суть (сараграхи); иха — в эту эпоху Кали; пранайа-бхаратах — в избытке любви; там — те стопы Чайтаньи; дхйайантах — созерцая; там эва — только у них; шаранам янту — пусть ищут прибежища; пронматтах [сантах] — исполнившись величайшей радости; там — величие их лотосных стоп; кила — несомненно; иха — в этот век; гаянту — пусть поют</w:t>
       </w:r>
     </w:p>
     <w:p>
@@ -16333,15 +15833,6 @@
         </w:rPr>
         <w:t>Стопы Чайтаньи, почитаемые даже Шивой и Брахмой, — вместилище безбрежного океана нектара тайны возвышенной сияющей расы. Поэтому в этот век Кали пусть благочестивые люди, [с любовью созерцая их,] примут у них прибежище и, обезумев от любви, в этот же век воспевают именно их (величие стоп Чайтаньи).</w:t>
       </w:r>
-      <w:r>
-        <w:br/>
-      </w:r>
-      <w:r>
-        <w:rPr>
-          <w:sz w:val="20"/>
-        </w:rPr>
-        <w:t>Из пословного толкования: благочестивые (кртинах) — это люди, обладающие сукрити, то есть постигающие суть.</w:t>
-      </w:r>
     </w:p>
     <w:p>
       <w:pPr>
@@ -16447,10 +15938,10 @@
           <w:b w:val="0"/>
           <w:i/>
         </w:rPr>
-        <w:t>Пословно:</w:t>
-      </w:r>
-      <w:r>
-        <w:t xml:space="preserve"> данте — в зубы; нидхайа — взяв; тринакам — травинку; падайох — к ногам; нипатйа — упав; критва — совершив; ча — и; каку-шатам — сотню жалобных мольб; этат — это; ахам — я; бравими — говорю; хе садхавах — о святые; сакалам — всё; эва — же; вихайа — оставив; дурат — далеко; гауранга-чандра-чаране — к стопам Гауранги-Луны; курута — питайте; анурагам — любовь.</w:t>
+        <w:t>Пословно (анвайя Бхактисиддханты):</w:t>
+      </w:r>
+      <w:r>
+        <w:t xml:space="preserve"> данте тринакам нидхайа — взяв в зубы крошечную травинку (этим указывается смирение «ниже травы» проповедника киртана, триданди-госвами: ведь из тех трав, что люди мира попирают ногами, он держит в зубах самую маленькую травинку, то есть оказывает почёт даже ей); падайох нипатья — припав к стопам (этим указывается качество «амани» — свободы от жажды почёта — проповедника слова о Гауре, триданди-госвами: он, в отличие от брахма-санньяси, не опьянён гордыней и не считает себя «Нараяной» и, в отличие от смартов, не лишён видения истинной природы (сварупы) всех существ и не скован мирскими суждениями о грубом и тонком теле — брахман или чандала, старший или младший; поэтому, став «амани» перед всеми, он стремится воспевать истину); каку-шатам критва ча — с сотней жалобных мольб (этим указывается «терпение, как у дерева» проповедника киртана, триданди-госвами: люди мира, отвернувшиеся от Кришны, никак не хотят слушать истину, но триданди-госвами, умоляя их, [стараются] дать им услышать хари-катху); этат ахам бравими — я говорю это; хе садхавах — о садху (этим указывается качество «манада» — оказывающего почтение другим — проповедника киртана, триданди-госвами); сакалам эва вихайя дурат — оставив всё издалека (вы, конечно, садху, но всё то, из-за чего у вас в сердце гордость «я садху» или слава садху в миру, — карму, гьяну, санкхью и йогу, фальгу-вайрагью, четыре цели, совершение дхармы и адхармы и все благие и неблагие усилия или желания, противные удовлетворению чувств Кришны, — оставив это издалека); чайтанья-чандра-чаране — к стопам Шри Чайтаньи-Луны; анурагам курута — исполнитесь привязанности</w:t>
       </w:r>
     </w:p>
     <w:p>
@@ -16510,15 +16001,6 @@
         </w:rPr>
         <w:t>О садху! Я (нищий-тридандин), держа в зубах травинку и пав к вашим стопам, с сотнями мольб говорю лишь одно (прошу подаяния): оставив всё (всю придуманную вами святость или дхарму) далеко позади (отвергнув это), исполнитесь любовью к стопам Шри Чайтаньи-Чандры.</w:t>
       </w:r>
-      <w:r>
-        <w:br/>
-      </w:r>
-      <w:r>
-        <w:rPr>
-          <w:sz w:val="20"/>
-        </w:rPr>
-        <w:t>Из пословного толкования: травинка в зубах указывает на смирение проповедника-киртании тридандина-госвами: самую крошечную из травинок, которые люди мира топчут ногами, он держит в зубах, то есть оказывает ей высочайшее почтение; падение к стопам указывает на его качество «амани» (не требующий почёта): он не мнит себя, опьянённый гордыней, «Нараяной», как брахма-санньяси, и не связан, подобно смартам, мирскими суждениями о грубом и тонком теле — брахман или чандал, старший или младший, — будучи лишённым видения истинной природы всех существ; поэтому, не требуя почёта ни от кого, он готов возвещать истину; сотни мольб указывают на его «терпение, как у дерева»: люди мира никак не хотят слушать истину, но тридандины-госвами, умоляя их, дают им слушать хари-катху; обращение «о садху» указывает на его качество «манада» (оказывающий почтение другим); «оставив всё»: вы, конечно, садху, но всё, из-за чего вы мните себя садху или слывёте ими в мире, — карму, гьяну, санкхью и йогу, фальгу-вайрагью (ложное отречение), четыре цели жизни, практику дхармы и адхармы и всякие благие и неблагие усилия или желания, противные услаждению чувств Кришны, — оставьте издали.</w:t>
-      </w:r>
     </w:p>
     <w:p>
       <w:pPr>
@@ -16584,10 +16066,10 @@
           <w:b w:val="0"/>
           <w:i/>
         </w:rPr>
-        <w:t>Пословно:</w:t>
-      </w:r>
-      <w:r>
-        <w:t xml:space="preserve"> ахо — о!; на — не; дурлабха — трудна; муктих — освобождение; на ча — и не; бхактих — бхакти; судурлабха — очень трудна; гаура-чандра-прасадах — милость Гаурачандры; ту — же; вайкунтхе апи — даже на Вайкунтхе; судурлабхах — труднодостижима.</w:t>
+        <w:t>Пословно (анвайя Бхактисиддханты):</w:t>
+      </w:r>
+      <w:r>
+        <w:t xml:space="preserve"> [если спросят: «зачем, оставив освобождение, бхакти (вайдхи-бхакти, исполненную величия) и прочее, привязываться к лотосным стопам Гауры?» — предвидя этот вопрос, говорит]; ахо — о!; муктих на дурлабха — освобождение не трудно обрести (четыре вида мукти — салокья и прочие — не труднодостижимы, ибо они легко обретаются вайдхи-бхакти, смешанной с гьяной); бхактих ча на судурлабха — и бхакти не крайне труднодостижима (ибо вайдхи-садханой обретается служение Нараяне на Вайкунтхе); гаура-чандра-прасадах ту — но благосклонность Гаурачандры, то есть проявленное по милости Гауры вкушение крайне сокровенного нектара премы; вайкунтхе апи судурлабхах — крайне труднодостижимо даже на Вайкунтхе</w:t>
       </w:r>
     </w:p>
     <w:p>
@@ -16647,15 +16129,6 @@
         </w:rPr>
         <w:t>Освобождение — брахма-саюджья или же четыре вида освобождения, салокья и прочие, достигаемые вайдхи-бхакти, смешанной со знанием, — не труднодостижимо. Служение Нараяне, достигаемое вайдхи-бхакти, тоже не труднодостижимо. Но милость Гауры (милость Гауры трояка: (1) чистая — в виде устранения анартх; (2) […] — в виде обретения расы сиддханты бхакти; (3) радостная — в виде обретения достоинства мадхурьи) труднодостижима даже на Вайкунтхе, ведь даже спутники Нараяны на Вайкунтхе молят о милости Гауры.</w:t>
       </w:r>
-      <w:r>
-        <w:br/>
-      </w:r>
-      <w:r>
-        <w:rPr>
-          <w:sz w:val="20"/>
-        </w:rPr>
-        <w:t>Из пословного толкования: на возможный вопрос: «Зачем, оставив освобождение и бхакти (вайдхи-бхакти, полную величия), обретать любовь к стопам Гауры?» — сказано это; «милость Гаурачандры» — проявленное по его милости вкушение сокровеннейшего нектара любви.</w:t>
-      </w:r>
     </w:p>
     <w:p>
       <w:pPr>
@@ -16721,10 +16194,10 @@
           <w:b w:val="0"/>
           <w:i/>
         </w:rPr>
-        <w:t>Пословно:</w:t>
-      </w:r>
-      <w:r>
-        <w:t xml:space="preserve"> бхаджанту — поклоняйтесь (примите прибежище); чайтанья-пада-аравиндам — лотосным стопам Чайтаньи; бхаванту — станьте; сат-бхакти-расена — расой истинной бхакти; пурнах — исполненными; анандайанту — радуйте; три-джагат — три мира; вичитрам — разнообразно; мадхурйа-саубхагйа-дайа-кшама-адйаих — сладостью (нрава), удачей, состраданием, терпением и прочим.</w:t>
+        <w:t>Пословно (анвайя Бхактисиддханты):</w:t>
+      </w:r>
+      <w:r>
+        <w:t xml:space="preserve"> чайтанья-падаравиндам бхаджанту — примите прибежище лотосных стоп Шри Чайтаньядевы; сад-бхакти-расена ча пурнах бхаванту — и исполнитесь высочайшей расы бхакти, то есть погрузитесь в никогда прежде не даровавшуюся (анарпита-чари) уннатоджджвала-расу (это возможно только при прибежище стоп Чайтаньи); мадхурья-саубхагья-дайа-кшама-адьяих — мадхурья — сладостным нравом, саубхагья — высочайшим вкушением премы, дайа — раздачей этой премы всем живым существам, кшама — смирением «ниже травы» и прочими вайшнавскими качествами; три-джагат — три мира; вичитрам — разнообразно; анандайанту — радуйте</w:t>
       </w:r>
     </w:p>
     <w:p>
@@ -16784,15 +16257,6 @@
         </w:rPr>
         <w:t>Примите прибежище лотосных стоп Чайтаньи-Чандры, исполнитесь наивысшей, то есть прежде не даровавшейся (анарпита-чари) возвышенной сияющей расой и одарите три мира разнообразным блаженством благодаря таким благим качествам, как сладость (сладостный нрав), удача (вкушение высочайшей любви), сострадание (обращение отвернувшихся душ к Кришне, или проповедь Имени) и терпение (терпеливость, как у дерева).</w:t>
       </w:r>
-      <w:r>
-        <w:br/>
-      </w:r>
-      <w:r>
-        <w:rPr>
-          <w:sz w:val="20"/>
-        </w:rPr>
-        <w:t>Из пословного толкования: исполниться такой расой возможно лишь при прибежище у стоп Чайтаньи; «сострадание» — раздача этой любви всем живым существам; «терпение» и прочее — смиренность «ниже травы» и другие качества вайшнава.</w:t>
-      </w:r>
     </w:p>
     <w:p>
       <w:pPr>
@@ -16898,10 +16362,10 @@
           <w:b w:val="0"/>
           <w:i/>
         </w:rPr>
-        <w:t>Пословно:</w:t>
-      </w:r>
-      <w:r>
-        <w:t xml:space="preserve"> самсара-синдху-тиране — к переправе через океан мирского бытия; хридайам — сердце (стремление); йади — если; сйат — есть; санкиртана-амрита-расе — в нектарной расе санкиртаны; рамате — радуется; манах — ум; чет — если; према-амбудхау — в океане любви; вихаране — к игре; йади — если; читта-вриттих — склонность сердца; чайтанья-чандра-чаране — к стопам Чайтаньи-Луны; шаранам — за прибежищем; прайату — пусть идёт.</w:t>
+        <w:t>Пословно (анвайя Бхактисиддханты):</w:t>
+      </w:r>
+      <w:r>
+        <w:t xml:space="preserve"> яди самсара-синдху-таране хридайам сьят — если у кого-то есть желание переплыть океан мирского бытия (то есть желание, переправившись через сансару, погрузиться «в океан бхакти»); манах чет санкиртанамрита-расе рамате — если ум желает наслаждаться сладостью нектарной расы санкиртаны; яди премамбудхау вихаране читта-вриттих [сьят] — если есть устремление ума к играм в океане расы премы; [тада — тогда]; чайтанья-чандра-чаране шаранам праяту — пусть примет прибежище стоп Чайтаньи-Луны</w:t>
       </w:r>
     </w:p>
     <w:p>
@@ -16961,15 +16425,6 @@
         </w:rPr>
         <w:t>Если есть желание переплыть океан сансары, если ум хочет наслаждаться сладостью нектарной расы санкиртаны, если есть стремление играть в океане любви, — тогда примите прибежище стоп Шри Чайтаньи-Чандры.</w:t>
       </w:r>
-      <w:r>
-        <w:br/>
-      </w:r>
-      <w:r>
-        <w:rPr>
-          <w:sz w:val="20"/>
-        </w:rPr>
-        <w:t>Из пословного толкования: желание переплыть океан сансары — это желание, перейдя на другой берег сансары, погрузиться в океан бхакти.</w:t>
-      </w:r>
     </w:p>
     <w:p>
       <w:pPr>
@@ -17035,10 +16490,10 @@
           <w:b w:val="0"/>
           <w:i/>
         </w:rPr>
-        <w:t>Пословно:</w:t>
-      </w:r>
-      <w:r>
-        <w:t xml:space="preserve"> джнана-вайрагйа-бхакти-ади — знание, отречение, бхакти и прочее; садхайанту — пусть совершают (обретают); йатха татха — как угодно; чайтанья-чарана-амбходжа-бхакти-лабхйа-самам — равное тому, что достигается бхакти к лотосным стопам Чайтаньи; кутах — откуда (где)?</w:t>
+        <w:t>Пословно (анвайя Бхактисиддханты):</w:t>
+      </w:r>
+      <w:r>
+        <w:t xml:space="preserve"> джняна-вайрагья-бхакти-ади — знание, отречение, бхакти и прочее; ятха-татха — каким угодно способом; садхаянту — пусть совершают (или порождают); чайтанья-чандра-чаранамбходжа-бхакти-лабхья-самам — подобное тому особому знанию, отречению и бхакти, что обретаются служением лотосным стопам Чайтаньячандры, то есть то, что есть у преданных стоп Чайтаньячандры, — знание истины о всеобъемлющей сладости Сваям Бхагавана Шри Кришны, […] отрешённость и уннатоджджвала бхакти-раса; кутах — где ещё? (то есть больше нигде не встречается)</w:t>
       </w:r>
     </w:p>
     <w:p>
@@ -17106,15 +16561,6 @@
         </w:rPr>
         <w:t>Пусть (люди) каким угодно способом развивают знание, отречение, бхакти и прочее, — но где [найти] то особое знание, отречение и бхакти, которые обретаются служением лотосным стопам Чайтаньи-Чандры? Подобного больше нигде не увидишь.</w:t>
       </w:r>
-      <w:r>
-        <w:br/>
-      </w:r>
-      <w:r>
-        <w:rPr>
-          <w:sz w:val="20"/>
-        </w:rPr>
-        <w:t>Из пословного толкования: это особое знание, отречение и бхакти, которые есть у преданных, прибегших к стопам Чайтаньи-Чандры, — знание истины о сладости Самого Бога Шри Кришны во всём, отрешённость [от иного] и возвышенная сияющая раса бхакти.</w:t>
-      </w:r>
     </w:p>
     <w:p>
       <w:pPr>
@@ -17180,10 +16626,10 @@
           <w:b w:val="0"/>
           <w:i/>
         </w:rPr>
-        <w:t>Пословно:</w:t>
-      </w:r>
-      <w:r>
-        <w:t xml:space="preserve"> ачайтанйам — лишённый сознания (бхакти); идам — этот; вишвам — мир; йади — если; чайтанйам — Чайтанье; ишварам — Владыке; на бхаджет — не поклоняется; сарватах — всюду (всякая); мритйух — смерть; упасйам — достойному поклонения; амара-уттамаих — лучшими из богов.</w:t>
+        <w:t>Пословно (анвайя Бхактисиддханты):</w:t>
+      </w:r>
+      <w:r>
+        <w:t xml:space="preserve"> идам — этот видимый; ачайтаньям — лишённый сознания, то есть лишённый постижения своей сварупы, или лишённый бхакти к всеобъемлющему Сознанию (вибху-чайтанье); вишвам — весь мир; амароттамаих — лучшими богами; упасьям — почитаемого; чайтаньям ишварам — Владыку Чайтанью, то есть Чайтанью, правящего всем; яди на бхаджет — если не почитает; [тада — тогда]; сарватах мритйух — смерть во всех отношениях; [бхавати — бывает] (в анувада: всякого рода смерть, то есть, подвластные рождению и смерти, они вкушают плоды кармы — счастье, страдание и прочее)</w:t>
       </w:r>
     </w:p>
     <w:p>
@@ -17243,15 +16689,6 @@
         </w:rPr>
         <w:t>Если этот лишённый бхакти к Кришне, лишённый сознания мир не поклоняется Самому Богу Шри Чайтанье, всеуправляющему, достойному поклонения даже лучших богов — Шивы, Брахмы и других, — то он обретает лишь смерть во всех её видах, то есть люди, подвластные рождению и смерти, только и вкушают плоды кармы — счастье, страдание и прочее.</w:t>
       </w:r>
-      <w:r>
-        <w:br/>
-      </w:r>
-      <w:r>
-        <w:rPr>
-          <w:sz w:val="20"/>
-        </w:rPr>
-        <w:t>Из пословного толкования: «лишённый сознания (а-чайтанья)» — то есть лишённый постижения своей истинной природы или лишённый бхакти к всепроникающему Сознанию (Чайтанье).</w:t>
-      </w:r>
     </w:p>
     <w:p>
       <w:pPr>
@@ -17317,10 +16754,10 @@
           <w:b w:val="0"/>
           <w:i/>
         </w:rPr>
-        <w:t>Пословно:</w:t>
-      </w:r>
-      <w:r>
-        <w:t xml:space="preserve"> аша — надежда; йасйа — у кого; пада-двандве — на две стопы; чайтанйасйа — Чайтаньи; маха-прабхох — Махапрабху; тасйа — тому; индрах — Индра; даса-ват — подобно слуге; бхати — кажется; ка катха — что говорить; нрипа-китаке — о царе-черве.</w:t>
+        <w:t>Пословно (анвайя Бхактисиддханты):</w:t>
+      </w:r>
+      <w:r>
+        <w:t xml:space="preserve"> чайтаньясья махапрабхох — Шри Чайтаньи Махапрабху; пада-двандве — на пару стоп; ясья аша — у кого надежда; тасья — для того; индрах [апи] — даже Индра; дасават бхати — является как слуга; [анье — о прочем]; нрипа-китаке — о царе, подобном ничтожному червю; ка катха — что и говорить</w:t>
       </w:r>
     </w:p>
     <w:p>
@@ -17445,10 +16882,10 @@
           <w:b w:val="0"/>
           <w:i/>
         </w:rPr>
-        <w:t>Пословно:</w:t>
-      </w:r>
-      <w:r>
-        <w:t xml:space="preserve"> йасйа — у которого; аша — надежда; кришна-чайтанйе — на Кришну Чайтанью; нрипа-двари — у дверей царя; ким — к чему (что); артхинах — просящему; чинтамани-майам — состоящее из чинтамани (камень чинтамани); прапйа — получив; ках — какой; мудхах — глупец; раджатам — к серебру; враджет — пойдёт.</w:t>
+        <w:t>Пословно (анвайя Бхактисиддханты):</w:t>
+      </w:r>
+      <w:r>
+        <w:t xml:space="preserve"> ясья артхинах — у какого просителя; кришна-чайтанье аша [вартате] — есть надежда обрести Шри Кришна-Чайтанью; [тасья — у того]; нрипа-двари — у дверей царя; ким — какая нужда?; чинтаманим прапья — обретя чинтамани; ках мудхах — кто такой глупец; раджатам враджет — пойдёт (в дальние края) за серебром?</w:t>
       </w:r>
     </w:p>
     <w:p>
@@ -17613,10 +17050,10 @@
           <w:b w:val="0"/>
           <w:i/>
         </w:rPr>
-        <w:t>Пословно:</w:t>
-      </w:r>
-      <w:r>
-        <w:t xml:space="preserve"> дхйайантах — созерцая; гири-кандарешу — в горных пещерах; бахавах — многие; брахма — Брахман; анубхуйа — пережив; асате — пребывают; йога-абхйаса-парах — преданные практике йоги; ча — и; санти — есть; бахавах — многие; сиддхах — сиддхи; махи-мандале — на земле; видйа-шаурйа-дхана-адибхих — учёностью, доблестью, богатством и прочим; ча — и; бахавах — многие; джалпанти — пустословят; митхйа-уддхатах — ложно возгордившиеся; ках ва — кто же; гаура-крипам — милости Гауры; вина — без; адйа — ныне; джагати — в мире; према-унмадах — опьянённый любовью; нритйати — пляшет.</w:t>
+        <w:t>Пословно (анвайя Бхактисиддханты):</w:t>
+      </w:r>
+      <w:r>
+        <w:t xml:space="preserve"> гири-кандарешу — в горных пещерах; бахавах — многие люди; [дхйайантах] — медитируя на безличный Брахман; брахма анубхуйа — постигнув Брахман; асате — пребывают; ча — и; махи-мандале — на земном круге; йогабхьяса-парах — преданные практике восьмиступенчатой йоги; бахавах сиддхах — многие, обретшие сиддхи (аниму и прочие); санти — есть; видья-шаурья-дхана-адибхих ча — и знанием, силой, богатством и прочим; митхйоддхатах — опьянённые неистинными вещами; бахавах — многие; джалпанти — предаются пустословию; [кинту — но]; гаура-крипам вина — без милости Гауры; джагати — в мире; ках ва — кто же; адья — сегодня; премонмадах [сан — будучи] — опьянённый премой; нритьяти — танцует?</w:t>
       </w:r>
     </w:p>
     <w:p>
@@ -17781,10 +17218,10 @@
           <w:b w:val="0"/>
           <w:i/>
         </w:rPr>
-        <w:t>Пословно:</w:t>
-      </w:r>
-      <w:r>
-        <w:t xml:space="preserve"> каши-васин апи — даже жителей Каши (ищущих там освобождения); на ганайе — ни во что не ставлю; ким — к чему; гайам — Гаю; маргайамах — искать; муктих — освобождение; шукти бхавати — становится (пустой) раковиной; йади — если; ме — для меня; ках — какая; пара-артха-прасангах — речь о прочих целях; траса-абхасах — тень страха; спхурати на — не возникает; маха-раураве апи — даже в великом аде Раурава; ква — где; бхитих — страх; стри-путра-адау — в отношении жены, сыновей и прочего; йади — если; крипайате — милостив; дева-девах — Бог богов; сах — тот; гаурах — Гаура.</w:t>
+        <w:t>Пословно (анвайя Бхактисиддханты):</w:t>
+      </w:r>
+      <w:r>
+        <w:t xml:space="preserve"> яди девадевах — если почитаемый даже богами; сах гаурах — тот Гаурасундара; крипайате — милостив; [тада — тогда]; каши-васин апи — даже жителей Каши (то есть тех, кто поселился в Каши ради безразличного освобождения); на ганайе — ни во что не ставлю; ким гайам маргайамах — зачем искать Гаю? (то есть преданный Гауры, в отличие от карми, ищущих плодов, не хлопочет о шраддхе в Гае, чтобы поднести пинды предкам); яди ме муктих — если для меня даже освобождение; шукти бхавати — становится раковиной; [тада — тогда]; ках парартха-прасангах — что говорить о плодах трёх других целей и прочего!; маха-раураве апи — даже в великом аде Раурава; [яди — если]; трасабхасах на спхурати — нет и тени страха; [тада — тогда]; стри-путради — в отношении жены, сыновей и прочего; ква бхитих — где страх?</w:t>
       </w:r>
     </w:p>
     <w:p>
@@ -17843,15 +17280,6 @@
           <w:sz w:val="20"/>
         </w:rPr>
         <w:t>Если милостив Шри Гаурасундара — Владыка даже богов, Брахмы, Шивы и прочих, — то я ни во что не ставлю живущих в Каши; к чему мне искать обитель Гаю? Если само освобождение кажется мне подобным перламутру, то что говорить о трёх целях — дхарме, артхе и каме? И если даже в Махараураве ко мне не подступает и тень страха, то где уж тут бояться за жену, сыновей и прочее?</w:t>
-      </w:r>
-      <w:r>
-        <w:br/>
-      </w:r>
-      <w:r>
-        <w:rPr>
-          <w:sz w:val="20"/>
-        </w:rPr>
-        <w:t>Из пословного толкования: «живущие в Каши» — те, кто поселился в Каши ради недифференцированного освобождения; преданный Гауры не хлопочет о шраддхе в Гае, о подношении пинды и прочего предкам, как это делают карми, ищущие плодов.</w:t>
       </w:r>
     </w:p>
     <w:p>
@@ -18027,10 +17455,10 @@
           <w:b w:val="0"/>
           <w:i/>
         </w:rPr>
-        <w:t>Пословно:</w:t>
-      </w:r>
-      <w:r>
-        <w:t xml:space="preserve"> матта-кешари-кишора-викрамах — с отвагой опьянённого (неистового) молодого льва; према-синдху-джагад-аплава-удьямах — стремящийся затопить мир океаном любви; ко 'пи — некий, неописуемый; дивья-нава-хема-кандали-комалах — нежный, как прекрасный, только что распустившийся золотой цветок кандали; джаяти — славится, побеждает; гаура-чандрамах — Гаура-Луна</w:t>
+        <w:t>Пословно (анвайя Бхактисиддханты):</w:t>
+      </w:r>
+      <w:r>
+        <w:t xml:space="preserve"> матта-кешари-кишора-викрамах — могучий, как опьянённый молодой лев, то есть в усмирении Кали обладающий доблестью, подобной доблести опьянённого молодого льва; према-синдху-джагад-аплава-удьямах — стремящийся, всколыхнув океан любви, затопить мир; дивья-нава-хема-кандали-комалах — (дивья — прекрасный; нава-хема-кандали-комала — нежный, как только что распустившийся золотой [цветок] кандали); ках апи гаура-чандрамах — некий неописуемый Гаурачандра; джаяти — сияет, превосходя всё</w:t>
       </w:r>
     </w:p>
     <w:p>
@@ -18195,10 +17623,10 @@
           <w:b w:val="0"/>
           <w:i/>
         </w:rPr>
-        <w:t>Пословно:</w:t>
-      </w:r>
-      <w:r>
-        <w:t xml:space="preserve"> саундарйе — в красоте; кама-котих — миллионы Камадев; сакала-джана-самахладане — в радовании всех людей; чандра-котих — миллионы лун; ватсалье — в нежной любви; матри-котих — миллионы матерей; тридаша-витапинам — райских деревьев (калпа-врикш); котих — миллионы; аударья-саре — в сути (высшей степени) щедрости; гамбхирйе — в глубине; амбходхи-котих — миллионы океанов; мадхуримани — в сладости; судха-кшира-мадхвика-котих — миллионы нектаров, молока и медового вина; гаурах — Гаура; девах — Бог; сах — тот; джийат — да славится; пранайа-раса-паде — в области расы любви (шрингара-расы); даршита-ашчарья-котих — явивший миллионы чудес</w:t>
+        <w:t>Пословно (анвайя Бхактисиддханты):</w:t>
+      </w:r>
+      <w:r>
+        <w:t xml:space="preserve"> [ях — тот, кто]; саундарье — в красоте; кама-котих — миллионы Камадев, то есть тот, чья россыпь красоты посрамляет бесчисленных Мадан; сакала-джана-самахладане — в доставлении отрады (освежающей нежности) всем людям; чандра-котих — миллионы лун, то есть умаляющий прохладу бесчисленных лун; ватсалье — в любящей нежности; матри-котих — миллионы матерей, то есть умаляющий любящую нежность бесчисленных матерей; аударья-саре — в высшей степени щедрости; тридаша-витапинам котих — миллионы древ богов, то есть посрамляющий щедрость бесчисленных древ желаний; гамбхирье — в глубине; амбходхи-котих — миллионы океанов, то есть тот, чья [глубина] превосходит глубину тысяч и тысяч океанов; мадхуримани — в сладости; судха-кшира-мадхвика-котих — миллионы сущностей нектара, [молочных напитков] и сущностей мёда («мадхвика» — опьяняющий напиток из мёда; здесь словом «судха» указаны бессмертие и небывалость вкуса, словом «кшира» — удовлетворение и [питание], словом «мадхвика» — безумие любви); пранайа-раса-паде — в отношении шрингара-расы; даршита-ашчарья-котих — явивший миллионы чудес, то есть пранайа-раса, явленная Шри Гаурасундарой, в миллионы раз чудеснее сладости шрингара-расы, которую показывали прежние знатоки расы; сах девах гаурах — этот играющий в лилах (лиламая) Гаурасундара; джият — да славится</w:t>
       </w:r>
     </w:p>
     <w:p>
@@ -18258,15 +17686,6 @@
         </w:rPr>
         <w:t>Тот, кто по красоте — миллионы Камадев, в радовании всех живых существ — миллионы лун, в любящей нежности — миллионы матерей, в высшей степени щедрости — миллионы древ желаний, в глубине — миллионы океанов, в сладости — миллионы сущностей нектара, миллионы [молочных напитков] и миллионы сущностей мёда, на поприще шрингара-расы являющий миллионы чудес (многообразие расы), — да славится этот играющий в лилах Гаурахари!</w:t>
       </w:r>
-      <w:r>
-        <w:br/>
-      </w:r>
-      <w:r>
-        <w:rPr>
-          <w:sz w:val="20"/>
-        </w:rPr>
-        <w:t>Из пословного толкования: его красота посрамляет бесчисленных Мадан, а его способность освежать — прохладу бесчисленных лун; «мадхвика» — опьяняющий напиток из мёда; словом «судха» (нектар) здесь указаны бессмертие и небывалость вкуса, словом «кшира» (молоко) — удовлетворение и [питание], словом «мадхвика» — безумие любви; пранайа-раса, явленная Шри Гаурасундарой, в миллионы раз чудеснее сладости шрингара-расы, которую показывали прежние знатоки расы.</w:t>
-      </w:r>
     </w:p>
     <w:p>
       <w:pPr>
@@ -18372,10 +17791,10 @@
           <w:b w:val="0"/>
           <w:i/>
         </w:rPr>
-        <w:t>Пословно:</w:t>
-      </w:r>
-      <w:r>
-        <w:t xml:space="preserve"> сва-пада-амбходжа-эка-пранайа-лахари-садхана-бхритам — держащихся садханы, [ведущей] к несравненной волне любви к его лотосным стопам; шива-брахма-адинам — Шиве, Брахме и прочим; апи ча — даже; су-маха-висмайа-бхритам — доставляющих величайшее изумление; маха-према-авешат — от погружённости в великую любовь; кимапи — неописуемо; нататам — [тех,] кто пляшет; унмадах ива — словно безумный; прабхух — Господь; гаурах — Гаура; джийат — да славится; праката-парама-ашчарья-махима — явивший высшее дивное величие [этих преданных]</w:t>
+        <w:t>Пословно (анвайя Бхактисиддханты):</w:t>
+      </w:r>
+      <w:r>
+        <w:t xml:space="preserve"> сва-пада-амбходжа-ека-пранайа-лахари-садхана-бхритам — (сва-пада-амбходжа — его собственные лотосные стопы; ека — превосходящая всё; пранайа-лахари — волна бхавы; садхана — средство проявить её в сердце; садхана-бхакт, то есть тех садхана-бхакт, что пребывают [в садхане] ради проявления в сердце превосходящей всё волны премы к его лотосным стопам); шива-брахма-адинам апи ча — даже Шивы, Брахмы и прочих; су-маха-висмая-бхритам — доставляющих безмерное изумление; маха-према-авешат — из-за погружённости в махапрему; унмадах ива — как безумные; ким апи натам — дивно танцующих преданных; пракатита-парама-ашчарья-махима — тот, кто явил их высочайшее чудесное величие; прабхух — независимый Владыка; гаурах — Гаурасундара; джият — да славится</w:t>
       </w:r>
     </w:p>
     <w:p>
@@ -18435,15 +17854,6 @@
         </w:rPr>
         <w:t>Да славится с высшим превосходством сам Бхагаван Шри Гаурахари, явивший высочайшее чудесное величие преданных, пребывающих в садхана-бхакти — средстве обрести наивысшую волну према-бхакти к его лотосным стопам, — и преданных, которые, погружённые в махабхаву, дивно танцуют, словно безумные, вызывая величайшее изумление даже у Шивы, Брахмы и других.</w:t>
       </w:r>
-      <w:r>
-        <w:br/>
-      </w:r>
-      <w:r>
-        <w:rPr>
-          <w:sz w:val="20"/>
-        </w:rPr>
-        <w:t>Из пословного толкования: «Прабху» — независимый Владыка.</w:t>
-      </w:r>
     </w:p>
     <w:p>
       <w:pPr>
@@ -18549,10 +17959,10 @@
           <w:b w:val="0"/>
           <w:i/>
         </w:rPr>
-        <w:t>Пословно:</w:t>
-      </w:r>
-      <w:r>
-        <w:t xml:space="preserve"> мадьят-коти-мригендра-хункрити-равах — чей рёв — как рык миллионов опьянённых царей зверей; тигмамшу-коти-чхавих — сияющий, как миллионы солнц; коти-инду-удбхата-шиталах — прохладнее миллионов лун; гати-джита-пронматта-коти-двипах — походкой превзошедший миллионы обезумевших слонов; намна — именем (санкиртаной имён); дургата-коти-нишкрити-карах — избавляющий миллионы несчастных; брахма-ади-коти-ишварах — владыка миллионов Брахм и прочих; коти-адвайта-широманих — венец (высшая вершина постижения) миллионов адвайтистов; виджайате — славится; шри-шри-шачинанданах — Шри Шри сын Шачи</w:t>
+        <w:t>Пословно (анвайя Бхактисиддханты):</w:t>
+      </w:r>
+      <w:r>
+        <w:t xml:space="preserve"> матта-коти-мригендра-хункрити-равах — тот, чей голос подобен рыку миллионов опьянённых львов; тигмамшу-коти-чхавих — обладающий сиянием тела ярче, чем у миллионов солнц; коти-инду-удбхата-шиталах — более прохладный, чем миллионы лун; гати-джита-пронматта-коти-двипах — с походкой прекраснее поступи миллионов опьянённых слонов; намна — именем (махамантрой «Харе Кришна» и прочими либо именами «Кришна-Чайтанья», «Вишвамбхара» и прочими); дургата-коти-нишкрити-карах — спаситель миллионов бедствующих; брахма-ади-коти-ишварах — владыка миллионов и миллионов Брахм и прочих; коти-адвайта-широманих — (венец миллионов и миллионов адвайтавади, почитаемый ими, высшая вершина восприятия безличного Брахмана — Парабрахман, то есть сгущённый Парабрахман в человеческом облике); шри-шри-шачинанданах — Шри Шри Шачинандана; виджаяте — сияет с высшим превосходством</w:t>
       </w:r>
     </w:p>
     <w:p>
@@ -18623,15 +18033,6 @@
         </w:rPr>
         <w:t>Обладающий голосом, глубоким, как рык миллионов опьянённых львов; несущий сияние ярче, чем у миллионов солнц; более прохладный, чем миллионы лун; с походкой прекраснее поступи миллионов обезумевших царей-слонов; санкиртаной имён «Харе Кришна» и прочих спасающий миллионы бедствующих; владыка миллионов Брахм и других; почитаемый миллионами адвайтавади, высшая вершина [постижения] безличного Брахмана — Парабрахман, то есть олицетворение полного постижения адвая-гьяны (недвойственного знания), — да славится особым образом Шри Шри Шачинандана!</w:t>
       </w:r>
-      <w:r>
-        <w:br/>
-      </w:r>
-      <w:r>
-        <w:rPr>
-          <w:sz w:val="20"/>
-        </w:rPr>
-        <w:t>Из пословного толкования: «именем» — махамантрой «Харе Кришна» и т. д. либо именами «Кришна-Чайтанья», «Вишвамбхара» и прочими; «венец миллионов Адвайт» — Парабрахман, высшая вершина безличного восприятия Брахмана, то есть сгущённый Парабрахман в человеческом облике.</w:t>
-      </w:r>
     </w:p>
     <w:p>
       <w:pPr>
@@ -18737,10 +18138,10 @@
           <w:b w:val="0"/>
           <w:i/>
         </w:rPr>
-        <w:t>Пословно:</w:t>
-      </w:r>
-      <w:r>
-        <w:t xml:space="preserve"> ях — который; маргах — путь; дура-шуньях — далёкий (недоступный мирскому разуму) и лишённый [внешней мирской пышности]; бата — увы; иха — здесь; балават-кантаках — [заросший] мощными шипами (сухого знания и привязанности к обрядам); ях — который; ати-дургах — весьма труднопроходимый; митхья-артха-бхрамаках — вводящий в заблуждение ложными смыслами (когда ложную бхакти принимают за бхакти); ях — который; сапади — тотчас; раса-майа-ананда-нихсьяндаках — источающий блаженство, полное расы; ях — который; садьях — сразу; прадьётаян — озаряя; там — его (этот путь); пракатита-махима — явивший [его] величие; снехаван — полный нежности (у светильника — масла); хрид-гухаях — пещеры сердца; ко 'пи — некий, неописуемый; антар-дхванта-ханта — уничтожающий внутреннюю тьму; сах — он; джаяти — славится; навадвипа-дипьят-прадипах — сияющий светильник Навадвипы</w:t>
+        <w:t>Пословно (анвайя Бхактисиддханты):</w:t>
+      </w:r>
+      <w:r>
+        <w:t xml:space="preserve"> иха — в этом мире; ях дура-шуньях — тот, что «дура» — недоступен материальному разуму — и «шунья» — лишён грубой материальной стороны усилий кармы и прочего; [ё ва — или который]; бата — увы (в сожалении); балават-кантаках — перегороженный шипами — сухим знанием и привязанностью к постоянной и случайной карме; [атах — поэтому]; ях ати-дургах — труднопроходимый, крайне тяжёлый; ях митхья-артха-бхрамаках — (митхья-артха — ложный, неистинный предмет; порождающий знание о нём как об истинном, то есть заставляющий даже мудрых (сури) считать «бхакти» ложную бхакти, притворную бхакти и тому подобное); ях сапади раса-мая-ананда-нихсьяндаках — тотчас несущий поток расы блаженства премы; маргах — путь; там — этот [путь бхакти]; садьях — тотчас; прадьётаян — […] озарив; [пракатита-махима — в OCR анвайи не читается; в анувада: «являющий величие бхакти»]; хрид-гухах — пещеры сердца; антар-дхванта-ханта — уничтожающий тьму невежества; снехаван — полный нежной любви (применительно к светильнику «снеха» — масло); навадвипа-дипьят-прадипах — светильник, сияющий в Навадвипе; ко 'пи — некий неописуемый Пуруша; сах джаяти — да славится</w:t>
       </w:r>
     </w:p>
     <w:p>
@@ -18800,15 +18201,6 @@
         </w:rPr>
         <w:t>Путь бхакти недоступен материальному разуму и лишён внешней пышности кармы и прочего; увы, он перегорожен шипами сухого знания и привязанности к карме и потому крайне труднопроходим; он вводит в заблуждение, заставляя принимать ложное за истинное, и тотчас несёт поток расы блаженства премы. Да славится неописуемый Пуруша, полный нежной любви светильник Навадвипы, который, мгновенно озарив этот путь бхакти, уничтожает тьму невежества в пещере сердца и являет величие бхакти!</w:t>
       </w:r>
-      <w:r>
-        <w:br/>
-      </w:r>
-      <w:r>
-        <w:rPr>
-          <w:sz w:val="20"/>
-        </w:rPr>
-        <w:t>Из пословного толкования: «далёкий» — недоступный материальному разуму, «[далёкий от] пустоты» — лишённый грубой материальной стороны усилий кармы и прочего; «вводит в заблуждение ложными целями» — то есть заставляет даже мудрых (сури) считать «бхакти» ложную бхакти, притворную бхакти и тому подобное; «снехаван» — полный любви, а применительно к светильнику «снеха» означает масло.</w:t>
-      </w:r>
     </w:p>
     <w:p>
       <w:pPr>
@@ -18914,10 +18306,10 @@
           <w:b w:val="0"/>
           <w:i/>
         </w:rPr>
-        <w:t>Пословно:</w:t>
-      </w:r>
-      <w:r>
-        <w:t xml:space="preserve"> дурат эва — уже издали; дахан — сжигая; кутарка-шалабхан — мотыльков ложной логики; коти-инду-самшиталах — прохладный, как миллионы лун; джьотих-кандала-садма — обитель скоплений (ростков) света; сат-мадхурима — высшая сладость; бахья-антара-дхванта-хрит — уносящий внешнюю и внутреннюю тьму; са-снеха-ашая-варти-дивья-висарат-теджах — чей дивный свет исходит от фитиля сердца, полного любви (масла); суварна-дьютих — сияющий золотом; карунйат — по милости; иха — здесь; джаджвалити — ярко горит; сах — тот; навадвипа-прадипах — светильник Навадвипы; адбхутах — дивный</w:t>
+        <w:t>Пословно (анвайя Бхактисиддханты):</w:t>
+      </w:r>
+      <w:r>
+        <w:t xml:space="preserve"> кутарка-шалабхан — мотыльков ложной логики; дурат эва — ещё издали; дахан — сжигая; коти-инду-самшиталах — прохладнее миллионов лун; джьотих-кандала-садма — обитель скопления света; сан-мадхурима — (сат — превосходная, мадхурима — сладость, то есть крайне сладостный); бахья-антара-дхванта-хрит — уничтожающий тьму внешнюю и внутреннюю; са-снеха-ашая-варти-дивья-висарат-теджах — (са-снеха — пребывающий вместе со снехой (любовью), а в другом смысле — с топлёным маслом или иным маслом; ашая — сердце, а в другом смысле — сосуд; это и есть варти — фитиль; дивья-висарат-теджах — тот, у кого из него дивно, прекрасно исходит сияние; то есть тот, чьё сияние исходит, когда возжигается фитиль сердца, пребывающего вместе с маслом любви); суварна-дьютих — обладающий золотым сиянием; адбхутах — неземной (апракрита); сах навадвипа-прадипах — этот светильник Навадвипы; карунья — из милости; иха — в этом мире (прапанче); джаджвалити — ярко сияет</w:t>
       </w:r>
     </w:p>
     <w:p>
@@ -18977,15 +18369,6 @@
         </w:rPr>
         <w:t>Тот неземной (апракрита) светильник, который ещё издали сжигает мотыльков ложной логики; который прохладнее миллионов лун и служит обителью скопления света; крайне сладостный; уничтожающий тьму внешнюю и внутреннюю; из фитиля сердца, напитанного маслом любви (снехой), которого исходит дивное сияние; чей блеск подобен золоту, — этот светильник Навадвипы (Гаурасундара) по милости сияет в этом мире.</w:t>
       </w:r>
-      <w:r>
-        <w:br/>
-      </w:r>
-      <w:r>
-        <w:rPr>
-          <w:sz w:val="20"/>
-        </w:rPr>
-        <w:t>Из пословного толкования: слова стиха двузначны — «снеха» означает и любовь, и топлёное масло или иное масло; «ашая» — и сердце, и сосуд; «варти» — фитиль; то есть его сияние исходит, когда возжигается фитиль сердца, пребывающего вместе с маслом любви.</w:t>
-      </w:r>
     </w:p>
     <w:p>
       <w:pPr>
@@ -19091,10 +18474,10 @@
           <w:b w:val="0"/>
           <w:i/>
         </w:rPr>
-        <w:t>Пословно:</w:t>
-      </w:r>
-      <w:r>
-        <w:t xml:space="preserve"> читкараих — криками; даша-дин-мукхам — десять сторон света; мукхараян — оглашая; аттаттахаса-чхата-вичибхих — волнами блеска раскатистого смеха; спхута-кунда-каирава-гана-продбхаси — сияющим, словно от множества распустившихся жасминов и белых кувшинок; курван — делая; набхах — небо; сарва-ангам — всё тело; павана-уччалат-чаладала-прая-пракампам — дрожащее, как листья ашваттхи, колеблемые ветром; дадхат — нося; маттах — опьянённый; према-раса-унмада-аплута-гатих — чья поступь (пляска) захлёстнута хмелем расы любви; гаурах харих — Гаура-Хари; шобхате — сияет</w:t>
+        <w:t>Пословно (анвайя Бхактисиддханты):</w:t>
+      </w:r>
+      <w:r>
+        <w:t xml:space="preserve"> читкараих — криками (звуками, издаваемыми с крайним томлением от радости и печали); даша-дин-мукхам — десять сторон света; мукхараян — оглашая, заставляя отзываться эхом; аттатта-хаса-ччхата-вичибхих — волнами сияния раскатистого смеха; набхах — небосвод; спхута-кунда-кайрава-гана-продбхаси — (словно распустившимися цветами кунды и кумуды крайне ярким [делая]); павана-уччалач-чаладала-прая-пракампам — (павана-уччала — колеблемое ветром; чаладала — дерево ашваттха; прая — подобно ему; пракампа — дрожащее); сарва-ангам — всё тело; дадхат — имея; према-раса-унмада-аплута-гатих — (према-раса-унмада — опьянение, рождённое расой премы; им — аплута-гати: из разных видов движения — удданда, особый танец, то есть, опьянённый радостью, гордостью и прочим, рождёнными расой премы, танцующий, высоко подпрыгивая); маттах гаурах харих — опьянённый Гаурахари; шобхате — сияет с высшим превосходством</w:t>
       </w:r>
     </w:p>
     <w:p>
@@ -19154,15 +18537,6 @@
         </w:rPr>
         <w:t>В крайнем волнении от радости и печали громкими криками заставляя отзываться эхом десять сторон света, волнами сияния раскатистого громкого смеха делая небесный свод ярким, словно от распустившихся цветов кунды и кумуды, обладая телом, дрожащим, как колеблемое ветром дерево ашваттха, — опьянённый радостью, гордостью и прочими состояниями, рождёнными расой премы, танцующий уддандой (высокими прыжками) Гаурахари пребывает в высшем превосходстве.</w:t>
       </w:r>
-      <w:r>
-        <w:br/>
-      </w:r>
-      <w:r>
-        <w:rPr>
-          <w:sz w:val="20"/>
-        </w:rPr>
-        <w:t>Из пословного толкования: «крики» — звуки, издаваемые с крайним томлением от радости и печали; «аплута-гати» — из разных видов движения удданда-нритья, особый танец, когда, опьянённый радостью и гордостью, рождёнными расой премы, он танцует, высоко подпрыгивая.</w:t>
-      </w:r>
     </w:p>
     <w:p>
       <w:pPr>
@@ -19268,10 +18642,10 @@
           <w:b w:val="0"/>
           <w:i/>
         </w:rPr>
-        <w:t>Пословно:</w:t>
-      </w:r>
-      <w:r>
-        <w:t xml:space="preserve"> нирдошах — без изъяна (без пятна; также «не нуждающийся в ночи» — вечно сияющий); чару-нритьях — прекрасно танцующий; видхута-малината-вакра-бхавах — отбросивший нечистоту и кривизну; кадачит — когда-либо (т. е. вовсе); нихшеша-прани-тапа-трая-харана-маха-према-пиюша-варши — изливающий нектар великой любви, снимающий три вида страданий всех без остатка живых существ; удбхутах — поднявшийся; ко 'пи — некий, неописуемый; бхагья-удая-ручира-шачи-гарбха-дугдха-амбу-рашех — из молочного океана лона Шачи, прекрасного восходом счастья; бхактанам — преданных; хрич-чакора-свадита-пада-ручих — чья сладость лучей вкушается птицами-чакорами их сердец; бхати — сияет; гауранга-чандрах — луна Гауранга</w:t>
+        <w:t>Пословно (анвайя Бхактисиддханты):</w:t>
+      </w:r>
+      <w:r>
+        <w:t xml:space="preserve"> нирдошах — (без пятна, либо: тот, кому не нужна «доша» — ночь, тьма, то есть всегда сияющий); чару-нритьях — прекрасно танцующий; видхута-малината-вакра-бхавах — свободный от тусклости и кривизны; нихшеша-пранита-апатрая-харана-маха-према-пиюша-варши — проливающий нектар премы, чтобы устранить тройные страдания всех живых существ; бхактанам хрич-чакора-свадита-пада-ручих — (бхактанам — преданных; хрич-чакора — птицы-чакоры сердец; свадита — вкушаемая; пада — лучи; ручи — сладость; то есть тот, сладость лучей которого вкушают чакоры сердец преданных); ко 'пи гауранга-чандрах — некий неописуемый Пуруша Шри Гаурачандра; бхагья-удая-ручира-шачи-гарбха-дугдха-амбурашех — (бхагья-удая — восход удачи, ручира — прекраснейшая; из молочного океана лона Шачидеви); удбхутах — взошедший; [сан — будучи]; бхати — сияет</w:t>
       </w:r>
     </w:p>
     <w:p>
@@ -19331,15 +18705,6 @@
         </w:rPr>
         <w:t>Безупречный и вечно взошедший, дивно танцующий, лишённый тусклости и кривизны, проливающий нектар премы, чтобы устранить тройные страдания всех живых существ, неописуемый Шри Гаурачандра, сладость лучей которого вкушают птицы-чакоры сердец преданных (то есть сладость его лучей вкушают чакоры сердец преданных), взойдя из молочного океана лона удачливой и прекраснейшей Шри Шачидеви, сияет.</w:t>
       </w:r>
-      <w:r>
-        <w:br/>
-      </w:r>
-      <w:r>
-        <w:rPr>
-          <w:sz w:val="20"/>
-        </w:rPr>
-        <w:t>Из пословного толкования: «нирдоша» — без пятна, либо «тот, кому не нужна ночь (доша) или тьма», то есть всегда сияющий.</w:t>
-      </w:r>
     </w:p>
     <w:p>
       <w:pPr>
@@ -19445,10 +18810,10 @@
           <w:b w:val="0"/>
           <w:i/>
         </w:rPr>
-        <w:t>Пословно:</w:t>
-      </w:r>
-      <w:r>
-        <w:t xml:space="preserve"> синчан синчан — снова и снова орошая; найана-паяса — водой глаз (слезами); панду-ганда-стхала-антам — края бледных щёк; мунчан мунчан — раз за разом испуская; пратимухух — поминутно; ахо — о!; диргха-нихшваса-джатам — множество долгих вздохов; уччаих — громко; крандан — рыдая; каруна-каруна-удгирна-ха-ха-ити-равах — издающий жалобно-жалобные крики «Ха! Ха!»; гаурах — Гаура; ко 'пи — некий, неописуемый; враджа-вирахини-бхава-магнах — погружённый в чувство разлучённой [с Кришной] девушки Враджа (Радхи); чакасти — сияет</w:t>
+        <w:t>Пословно (анвайя Бхактисиддханты):</w:t>
+      </w:r>
+      <w:r>
+        <w:t xml:space="preserve"> враджа-вирахини-бхава-магнах [сан] — погрузившись в океан нектара махабхавы Шримати Радхики, страдающей от разлуки с Кришной; наяна-паяса — потоками слёз; панду-ганда-стхала-антам — край побледневших щёк; синчан синчан — снова и снова орошая; ахо — ах!; дирга-нихшваса-джатам — множество долгих вздохов; пратимухух — каждое мгновение; мунчан мунчан — раз за разом испуская; уччаих крандан — громко рыдая; каруна-каруна-удгирна-ха-ха-ити-равах — тот, кто произносит звуки «ха! ха!», выражающие крайне жалобную расу; ках апи гаурах — некий неописуемый Пуруша Шри Гаурасундара; чакасти — являя своё настроение, сияет с высшим превосходством</w:t>
       </w:r>
     </w:p>
     <w:p>
@@ -19613,10 +18978,10 @@
           <w:b w:val="0"/>
           <w:i/>
         </w:rPr>
-        <w:t>Пословно:</w:t>
-      </w:r>
-      <w:r>
-        <w:t xml:space="preserve"> бибхрат — нося; варнам — цвет; кимапи — неописуемый; дахана-уттирна-сауварна-сарам — [подобный] сути золота, вышедшего из огня; дивья-акарам — дивный облик; кимапи — неописуемый; калаян — принимая; дрипта-гопала-балах — резвый (по B: являющий игры) мальчик-пастушок; авишкурван — являя; квачит авасаре — порою; тат-тад-ашчарья-лилам — те или иные дивные игры; сакшат — воочию; радха-мадхурипу-вапух — тело Радхи и Мадхурипу (Кришны) [в одном]; бхати — сияет; гауранга-чандрах — Гауранга-Луна</w:t>
+        <w:t>Пословно (анвайя Бхактисиддханты):</w:t>
+      </w:r>
+      <w:r>
+        <w:t xml:space="preserve"> дахана-уттирна-саурварна-сарам — подобный сути расплавленного золота, прошедшего через огонь; ким апи варнам — некий неописуемый цвет; бибхрат — приняв; дрипта-гопала-балах [сан] — (дрипта — озарённый, то есть явленный; гопала-бала — лила Бала-Гопалы; то есть являя лилу Бала-Гопалы); ким апи дивья-акарам — некий неописуемый духовный облик (чинмая-виграха); калаян — приняв; квачит авасаре — иногда; тат-тад-ашчарья-лилам — те или иные чрезвычайно чудесные лилы (в анувада — лилы юности, кайшоры); авишкурван — являя; сакшад-радха-мадхурипу-вапух — воочию соединённое тело Радхи и Мадхавы; гауранга-чандрах — Шри Гауранга; бхати — сияет высшей красотой; [как говорит и Шрила Сварупа Госвами, Радха и Кришна — преображение любви, [проявление] силы хладини; по своей сути они едины, но, поскольку таттва лилы вечна, вечно пребывают в двух образах; ныне эти двое явились в одном образе — как таттва Чайтаньи]</w:t>
       </w:r>
     </w:p>
     <w:p>
@@ -19676,15 +19041,6 @@
         </w:rPr>
         <w:t>Приняв некий неописуемый цвет, подобный сути расплавленного золота, прошедшего через огонь, он являет лилы Бала-Гопалы, а иногда в некоем неописуемом духовном облике открывает чрезвычайно чудесные лилы юности (кайшоры), — сияет Шри Гауранга, воочию соединённое тело Радхи и Мадхавы.</w:t>
       </w:r>
-      <w:r>
-        <w:br/>
-      </w:r>
-      <w:r>
-        <w:rPr>
-          <w:sz w:val="20"/>
-        </w:rPr>
-        <w:t>Из пословного толкования: как говорит и Шрила Сварупа Госвами, Радха и Кришна — преображение любви, [проявление] силы хладини; по своей сути они едины, но, поскольку таттва лилы вечна, вечно пребывают в двух образах; ныне эти двое явились в одном образе — как таттва Чайтаньи.</w:t>
-      </w:r>
     </w:p>
     <w:p>
       <w:pPr>
@@ -19798,10 +19154,10 @@
           <w:b w:val="0"/>
           <w:i/>
         </w:rPr>
-        <w:t>Пословно:</w:t>
-      </w:r>
-      <w:r>
-        <w:t xml:space="preserve"> акасмат эва — внезапно; авирбхавати — является; бхагават-нама-лахари — волна Имени Господа; паританам — окружённых; папаих — грехами; апи — даже; пурубхих — многими, тяжкими; эшам — этих; тану-бхритам — воплощённых существ; ахо — о!; ваджра-праям — подобное алмазу (твёрдое); хрит — сердце; апи — даже; наванита-айитам — ставшее как свежее масло; абхут — стало; нринам — людей; локе — в мире; ясмин — когда он; аватарати — нисходит; сах — тот; гаурах — Гаура; мама — моё; гатих — прибежище</w:t>
+        <w:t>Пословно (анвайя Бхактисиддханты):</w:t>
+      </w:r>
+      <w:r>
+        <w:t xml:space="preserve"> нринам локе — в мире людей, то есть в прапанче; ясмин аватарати [сати] — когда он нисходит; ахо — ах!; пурубхих папаих — грудами тяжких грехов; паританам — окружённых; эшам танубхритам апи — даже для этих воплощённых существ; бхагаван-нама-лахари — волна имени Шри Кришны, то есть чередование святых имён «Харе Кришна, Харе Кришна» и т. д.; акасмат эва — внезапно; авирбхавати — явилась; ваджра-праям хрид апи — даже сердце, затвердевшее, как камень, от кармы, гьяны и прочего либо от разнообразных анартх; наванитаитам абхут — стало мягким и растаяло, как свежее масло; сах гаурах — этот Гаурасундара; мама гатих [асту] — да будет моим прибежищем</w:t>
       </w:r>
     </w:p>
     <w:p>
@@ -19861,15 +19217,6 @@
         </w:rPr>
         <w:t>Когда он нисшёл в мир людей, ах, даже для воплощённых существ, окружённых грудами тяжких грехов, внезапно явилась волна имени Шри Кришны, и даже сердце, затвердевшее, как камень, от оскорблений, стало мягким и растаяло, словно свежее масло, — пусть этот Гаурасундара будет моим единственным прибежищем.</w:t>
       </w:r>
-      <w:r>
-        <w:br/>
-      </w:r>
-      <w:r>
-        <w:rPr>
-          <w:sz w:val="20"/>
-        </w:rPr>
-        <w:t>Из пословного толкования: «волна имени Бхагавана» — «Харе Кришна, Харе Кришна» и т. д., чередование святых имён; сердце затвердело от кармы, гьяны и прочего либо от разнообразных анартх.</w:t>
-      </w:r>
     </w:p>
     <w:p>
       <w:pPr>
@@ -19975,10 +19322,10 @@
           <w:b w:val="0"/>
           <w:i/>
         </w:rPr>
-        <w:t>Пословно:</w:t>
-      </w:r>
-      <w:r>
-        <w:t xml:space="preserve"> на — нет; йогах — йоги; на — нет; дхьянам — медитации; на ча — и нет; джапа-тапас-тьяга-нияма — джапы, подвижничества, отречения и обетов; на — нет; ведах — Вед; на — нет; ачарах — благочестия; ква ну — где уж; бата — увы; нишиддха-ади-упаратих — отказ от запретного и прочего; акасмат — внезапно; чайтанье — когда Чайтанья; аватарати — нисходит; дая-сара-хридае — чьё сердце — суть сострадания; пум-артханам — целей человека; маулим — венец; парам — высший; иха — здесь; муда — с радостью; лунтхати — похищает (захватывает); джанах — человек (люди)</w:t>
+        <w:t>Пословно (анвайя Бхактисиддханты):</w:t>
+      </w:r>
+      <w:r>
+        <w:t xml:space="preserve"> акасмат дая-сара-хридае чайтанье иха аватарати [сати] — когда внезапно в этот мир нисшёл предельно милостивый Шри Чайтаньядева; [яся — у кого]; на йогах на дхьянам на ча джапа-тапас-тьяга-ниямах [санти] — нет ни йоги, ни медитации, ни джапы, аскезы, отречения и обетов; на ведах на ачарах — нет ни изучения Вед, ни благонравия; нишиддха-ади-упаратих бата ква ну — увы, где уж там отказ от запретных и прочих дел! — то есть у кого нет даже отказа от греховных дел; [тадришах] джанах — такой человек; пумартханам маулим парам — венец целей человека — высшую прему; муда — с радостным сердцем; лунтхати — расхищает</w:t>
       </w:r>
     </w:p>
     <w:p>
@@ -20143,10 +19490,10 @@
           <w:b w:val="0"/>
           <w:i/>
         </w:rPr>
-        <w:t>Пословно:</w:t>
-      </w:r>
-      <w:r>
-        <w:t xml:space="preserve"> маха-карма-сротах-нипатитам — упавший в поток великой кармы; апи — даже; стхайрьям — устойчивость; аяте — обретает; маха-пашанебхьях — чем великие камни; апи — даже; ати-катхинам — более твёрдый; эти — приходит; драва-дашам — в состояние текучести; натати — пляшет; урдхвам — ввысь (в духовном царстве); нихсадханам — оставив [прежнюю] садхану; апи — даже; маха-йога-манасам — [ум] тех, чей ум занят великой йогой; бхуви — на земле; шри-чайтанье — когда Шри Чайтанья; аватарати — нисходит; манах — ум; читра-вибхаве — дивный своим богатством</w:t>
+        <w:t>Пословно (анвайя Бхактисиддханты):</w:t>
+      </w:r>
+      <w:r>
+        <w:t xml:space="preserve"> читра-вибхаве — (читра — чудесное, вибхава — великолепие; седьмой падеж в значении состояния; наделённый чудесным великолепием); шри-чайтанье бхуви аватарати [сати] — когда Шри Чайтаньядева нисшёл на землю; [карминам — людей кармы]; манах — ум; маха-карма-срото-нипатитам апи — хотя и упавший в поток великой кармы; стхайрьям аяте — обретает устойчивость, получив прему Гаурасундары; [эвам — и]; маха-пашанебхьях апи ати-катхинам апи — хотя бы и твёрже огромных камней; [манах] драва-дашам эти — ум приходит в состояние текучести от расы бхакти; маха-йога-манасам апи — даже тех, чей ум, то есть сознание, устремлён на садхану великой йоги и прочего; [манах — ум]; нихсадханам — отвратившись от йоги и прочего; урдхвам натати — высоко танцует, то есть, оставив садхану йоги и прочего, связанную с чувствами, вкушает блаженство премы в царстве духовных игр Адхокшаджи</w:t>
       </w:r>
     </w:p>
     <w:p>
@@ -20311,10 +19658,10 @@
           <w:b w:val="0"/>
           <w:i/>
         </w:rPr>
-        <w:t>Пословно:</w:t>
-      </w:r>
-      <w:r>
-        <w:t xml:space="preserve"> стри-путра-ади-катхам — разговоры о жене, сыновьях и прочем; джахух — оставили; вишайинах — мирские люди; шастра-правадам — споры о шастрах; будхах — учёные; йоги-индрах — владыки йогов; виджахух — совсем оставили; марун-нияма-джа-клешам — мучения от обуздания дыхания; тапах — подвижничество; тапасах — подвижники; джняна-абхьяса-видхим — правило изучения знания; джахух — оставили; ча — и; ятаях — санньясины; чайтанья-чандре — когда Чайтанья-Луна; парам — высший; авишкурвати — являет; бхакти-йога-падавим — путь бхакти-йоги; на эва — вовсе не; аньях — иной; асит — был; расах — раса</w:t>
+        <w:t>Пословно (анвайя Бхактисиддханты):</w:t>
+      </w:r>
+      <w:r>
+        <w:t xml:space="preserve"> чайтанья-чандре парам бхакти-йога-падавим авишкурвати [сати] — когда Шри Чайтанья-чандра явил высший путь бхакти-йоги, то есть путь бхаджана рагануги; вишаинах — люди, погружённые во вкус материальных объектов; стри-путра-ади-катхам — мирские разговоры о содержании жён, сыновей и прочих; джахух — оставили; будхах — пандиты, то есть философы, знатоки поэтики (аланкарики), логики (наияики) и прочие; шастра-правадам — споры и раздоры о шастрах; [джахух — оставили]; йогиндрах — лучшие из йогов; марун-ниямаджа-клешам — (марут — воздух, нияма — подчинение, джа-клеша — порождённые им тяготы, то есть тяготы садханы при задержке вдоха, выдоха и прочего жизненного воздуха пранаямой, кумбхакой и т. п.); виджахух — полностью оставили; тапасах — подвижники; тапах — аскезу; [джахух — оставили]; ятаях ча — и яти, то есть санньяси, приверженцы знания о безразличном; гьяна-абхьяса-видхим — поиск безразличного Брахмана; джахух — оставили; [тада — тогда]; аньях расах на эва асит — не было никакой иной расы, кроме бхакти-расы (то есть ни мирская раса привязанных к объектам, ни мирская раса шастр у пандитов — аланкариков, философов и прочих, — ни раса Параматмы у йогов, ни раса безличного Брахмана у искателей безразличного знания — ничто не показалось «расой» рядом с расой адвая-гьяны, ибо рядом с той дивной бхакти-расой, которую рождает соединение четырёх составляющих — рати, то есть связанной с Бхагаваном устремлённости, или стхайи-бхавы, а также вибхавы, анубхавы, саттвика[-бхав] и вьябхичари[-бхав], — мирская или частичная раса вообще не может называться «расой»)</w:t>
       </w:r>
     </w:p>
     <w:p>
@@ -20374,15 +19721,6 @@
         </w:rPr>
         <w:t>Когда Шри Чайтанья-чандра явил путь высшей бхакти-йоги, люди, погружённые во вкус материальных объектов, оставили разговоры о жёнах, сыновьях и прочих; пандиты оставили споры и раздоры о шастрах; лучшие из йогов полностью отказались от мучений садханы ради задержки жизненного воздуха; подвижники оставили свои аскезы; [санньяси] оставили поиск безразличного Брахмана; и тогда в мире не стало видно никакой иной «расы», кроме бхакти-расы.</w:t>
       </w:r>
-      <w:r>
-        <w:br/>
-      </w:r>
-      <w:r>
-        <w:rPr>
-          <w:sz w:val="20"/>
-        </w:rPr>
-        <w:t>Из пословного толкования: «высший путь бхакти-йоги» — путь бхаджана рагануги; «мудрецы» — философы, знатоки поэтики (аланкарики), логики (наияики) и прочие; «мучения от обуздания воздуха» — тяготы садханы при задержке вдоха и выдоха пранаямой, кумбхакой и т. п.; «яти» — санньяси, приверженцы знания о безразличном [Брахмане]; ни мирская раса привязанных к объектам, ни мирская раса шастр у пандитов — аланкариков, философов и прочих, — ни раса Параматмы у йогов, ни раса безличного Брахмана у искателей безразличного знания — ничто не показалось «расой» рядом с расой адвая-гьяны, ибо рядом с той дивной бхакти-расой, которую рождает соединение четырёх составляющих — рати, то есть устремлённости к Бхагавану, или стхайи-бхавы, а также вибхавы, анубхавы, саттвика[-бхавы] и вьябхичари[-бхав], — мирская или частичная раса вообще не может называться «расой».</w:t>
-      </w:r>
     </w:p>
     <w:p>
       <w:pPr>
@@ -20488,10 +19826,10 @@
           <w:b w:val="0"/>
           <w:i/>
         </w:rPr>
-        <w:t>Пословно:</w:t>
-      </w:r>
-      <w:r>
-        <w:t xml:space="preserve"> абхут — был, раздался; гехе гехе — в каждом доме; тумула-хари-санкиртана-равах — громкий гул санкиртаны Хари; бабхау — сиял; дехе дехе — в каждом теле; випула-пулака-ашру-вьятикарах — обилие трепета и слёз; апи — и; снехе снехе — в каждой любви (на каждой ступени созревания любви); парама-мадхура-уткарша-падави — высшая, сладостная, превосходнейшая ступень; давияси — далёкая; амнаят — от Вед; апи — даже; джагати — в мире; гауре — когда Гаура; аватарати — нисходит</w:t>
+        <w:t>Пословно (анвайя Бхактисиддханты):</w:t>
+      </w:r>
+      <w:r>
+        <w:t xml:space="preserve"> джагати гауре аватарати [сати] — когда Гаурасундара нисшёл в мир; гехе гехе — в каждом доме; тумула-хари-санкиртана-равах — шум бурной Хари-санкиртаны; абхут — поднялся; дехе дехе — в каждом теле; випула-пулака-ашру-вьятикарах — (випула — обильные, то есть полные; мурашки, слёзы и прочие саттвика-преображения; вьятикара — множество); бабхау — засияло; снехе снехе — (созревшая према — это снеха; с возрастающим усилением густоты према-бхакти); амнаят апи — (амная — шрути, Веды; даже от них); давияси — далёкая, то есть недоступная; парама-мадхура-уткарша-падави апи — даже высшая, сладостная, наилучшая ступень; [пракатабхута — открылась]</w:t>
       </w:r>
     </w:p>
     <w:p>
@@ -20551,15 +19889,6 @@
         </w:rPr>
         <w:t>Когда Шри Гаурачандра нисшёл в мир, в каждом доме поднялся шум бурного Хари-санкиртаны, в каждом теле засияли обильные мурашки, слёзы и прочие [саттвика-бхавы], и с возрастающим усилением густоты према-бхакти открылась даже высочайшая, сладчайшая, лучшая ступень, недоступная шрути.</w:t>
       </w:r>
-      <w:r>
-        <w:br/>
-      </w:r>
-      <w:r>
-        <w:rPr>
-          <w:sz w:val="20"/>
-        </w:rPr>
-        <w:t>Из пословного толкования: снеха — это созревшая према; «амная» — шрути, Веды.</w:t>
-      </w:r>
     </w:p>
     <w:p>
       <w:pPr>
@@ -20665,10 +19994,10 @@
           <w:b w:val="0"/>
           <w:i/>
         </w:rPr>
-        <w:t>Пословно:</w:t>
-      </w:r>
-      <w:r>
-        <w:t xml:space="preserve"> акасмат эва — внезапно; этат — этот; бхуванам — мир; абхитах — со всех сторон; плавитам — затоплен; абхут — был; маха-према-амбходхех — океана великой любви; кимапи — неописуемыми; раса-ваньябхих — паводками расы; акхилам — весь; акасмат — внезапно; ча — и; адришта-ашрута-чара-викараих — невиданными и неслыханными прежде преображениями (проявлениями любви); алам — в высшей степени; абхут — было; чаматкарах — изумление; кришне — когда Кришна; канака-ручира-анге — с телом, прекрасным золотым сиянием; аватарати — нисходит</w:t>
+        <w:t>Пословно (анвайя Бхактисиддханты):</w:t>
+      </w:r>
+      <w:r>
+        <w:t xml:space="preserve"> канака-ручира-анге кришне аватарати [сати] — когда Сам Бхагаван Шри Кришна, притягивающий все сердца, нисшёл, приняв чарующее золотое сияние; маха-према-амбходхех — океана великой премы; ким апи раса-ваньябхих — некими половодьями расы; акхилам этат бхуванам — весь этот мир; абхитах — со всех сторон; акасмат эва плавитам абхут — внезапно был затоплен; акасмат ча адришта-ашрута-чара-викараих — и внезапно невиданными и неслыханными прежде преображениями премы; алам — крайне; чаматкарах абхут — пришёл в изумление</w:t>
       </w:r>
     </w:p>
     <w:p>
@@ -20833,10 +20162,10 @@
           <w:b w:val="0"/>
           <w:i/>
         </w:rPr>
-        <w:t>Пословно:</w:t>
-      </w:r>
-      <w:r>
-        <w:t xml:space="preserve"> удгрихнанти — хватаются (присваивают); самаста-шастрам — все шастры; абхитах — всюду; дурвара-гарвайитах — неудержимо возгордившиеся; дханьям-манья-дхиях — мнящие себя счастливцами; ча — и; карма-тапаса-ади-уччавачешу — в обрядах, подвижничестве и прочих высоких и низких [путях]; стхитах — пребывающие; двитрани — два-три; эва — лишь; джапанти — повторяют; кечана — некоторые; харех — Хари; намани — имена; вама-ашаях — с превратным (лукавым) сердцем; пурвам — прежде; сампрати — теперь; гаура-чандре — когда Гаурачандра; удите — взошёл; према — любовь; апи — даже; садхаранах — общедоступна, обычна</w:t>
+        <w:t>Пословно (анвайя Бхактисиддханты):</w:t>
+      </w:r>
+      <w:r>
+        <w:t xml:space="preserve"> [кечит джанах — некоторые люди]; дурвара-гарваитах — исполненные неудержимой гордыни; самаста-шастрам — все шастры; абхитах — всесторонне; удгрихнанти — собирали, или же гордились: «Мы изучили все шастры, кто выше нас?»; дханьям-манья-дхиях ча — и те, кто считал себя благословенными; карма-тапаса-ади-уччавачешу стхитах — пребывающие на высших и низших ступенях путей постоянных и случайных обрядов, предписанных смрити, аскезы, санкхьи, йоги и прочего; кечана — некоторые [из них]; дви-трани эва — лишь два-три раза; харех намани — имена Хари; джапанти — повторяли; [татрапи те — но и тогда они]; вама-ашаях — с кривым сердцем, то есть преданные пути кармы; [асан — были]; [эвам — так]; пурвам [асит] — было прежде; сампрати — теперь; гаурачандре удите [сати] — когда нисшёл Гаурачандра; према апи садхаранах [абхут] — и према стала общей, то есть её обрели все, от высших до низших</w:t>
       </w:r>
     </w:p>
     <w:p>
@@ -20896,15 +20225,6 @@
         </w:rPr>
         <w:t>Некоторые люди, исполненные неудержимой гордыни, всесторонне собирали [знание] всех шастр, то есть думали: «Я знаю все шастры, нет никого лучше меня». Другие же сами себя считали благословенными. Из этих людей, мнящих себя достигшими цели и пребывающих на высших и низших ступенях путей постоянных и случайных обрядов, предписанных смрити, а также аскезы, санкхьи, йоги и прочего, некоторые лишь два-три раза повторяли имена Хари, но всё же их сердца оставались полны лукавства. Так было прежде; а теперь, когда нисшёл Гаурачандра, и према стала общим достоянием, то есть ею наделены все, от высших до низших.</w:t>
       </w:r>
-      <w:r>
-        <w:br/>
-      </w:r>
-      <w:r>
-        <w:rPr>
-          <w:sz w:val="20"/>
-        </w:rPr>
-        <w:t>Из пословного толкования: «собирали все шастры» — или же гордились: «Мы изучили все шастры, кто выше нас?»; «с кривым сердцем» — преданные пути кармы.</w:t>
-      </w:r>
     </w:p>
     <w:p>
       <w:pPr>
@@ -21010,10 +20330,10 @@
           <w:b w:val="0"/>
           <w:i/>
         </w:rPr>
-        <w:t>Пословно:</w:t>
-      </w:r>
-      <w:r>
-        <w:t xml:space="preserve"> деве — когда Бог; чайтанья-намани — по имени Чайтанья; аватарати — нисходит; сура-прартхья-пада-абджа-севе — служения лотосным стопам которого молят боги; вишвадричих — всепроникающие; правистараяти — когда он простирает; сумадхура-према-пиюша-вичих — сладчайшие волны нектара любви; ках — кто; балах — ребёнок; ках ча — и кто; вриддхах — старик; ках — кто; иха — здесь; джада-матих — тупица; ка — кто; вадхух — женщина; ках — кто; вараках — ничтожный (жалкий); сарвешам — у всех; айкарасьям — единство вкуса (единая раса); кимапи — неописуемое; хари-паде — к стопам Хари; бхакти-бхаджам — причастных бхакти; бабхува — возникло</w:t>
+        <w:t>Пословно (анвайя Бхактисиддханты):</w:t>
+      </w:r>
+      <w:r>
+        <w:t xml:space="preserve"> сура-пратхья-пада-абджа-севе — тот, служения лотосным стопам которого жаждут боги; чайтанья-намани — носящий имя Чайтанья; деве — (лила-пуруша, или тот, кто, приняв настроение Радхики, желает вкусить собственную сладость); аватарати [сати] — когда нисшёл; вишвадричих — всепроникающие; сумадхура-према-пиюша-вичих — сладчайшие волны нектара премы; правистараяти [сати] — когда широко распространил; ках балах ках ча вриддхах — что ребёнок, что старик; ках джадаматих ка вадхух — что тупица, что женщина; ках вараках — что жалкий низкий человек; иха — в этом мире (сансаре); сарвешам бхакти-бхаджам — у всех, наделённых бхакти; хари-паде — к стопам Шри Хари; ким апи айкарасьям бабхува — возникла некая небывалая раса, то есть у всех к стопам Шри Хари пробудилась одна небывалая раса адвая-гьяны</w:t>
       </w:r>
     </w:p>
     <w:p>
@@ -21073,15 +20393,6 @@
         </w:rPr>
         <w:t>Когда лила-пуруша Шри Чайтаньядева, служения лотосным стопам которого жаждут полубоги, нисшёл в этот мир и широко распространил вселенскую сладчайшую волну нектара премы, — будь то ребёнок или старик, женщина или тупоумный, или жалкий низкий человек — у всех в этом мире появилась способность обрести бхакти, и в каждом пробудилась к стопам Шри Хари некая небывалая, дивная раса адвая-гьяны.</w:t>
       </w:r>
-      <w:r>
-        <w:br/>
-      </w:r>
-      <w:r>
-        <w:rPr>
-          <w:sz w:val="20"/>
-        </w:rPr>
-        <w:t>Из пословного толкования: «дэва» — лила-пуруша, или тот, кто, приняв настроение Радхики, желает вкусить собственную сладость.</w:t>
-      </w:r>
     </w:p>
     <w:p>
       <w:pPr>
@@ -21187,10 +20498,10 @@
           <w:b w:val="0"/>
           <w:i/>
         </w:rPr>
-        <w:t>Пословно:</w:t>
-      </w:r>
-      <w:r>
-        <w:t xml:space="preserve"> сарве — все; шанкара-нарада-адаях — Шанкара, Нарада и другие; иха — сюда; айатах — пришли; свайам — сама; шрих — Шри (Лакшми); апи — и; праптах — явилась; дева-халаюдхах — бог Халаюдха (Баларама); апи — и; милитах — соединился [с ним]; джатах — родились; ча — и; те — те [самые]; вришнаях — Вришни (Ядавы); бхуях ким — более того; враджа-васинах — жители Враджа; апи — и; пракатах — явились; гопала-гопи-адаях — пастухи, гопи и другие; пурне — полном; према-раса-ишваре — владыке расы любви; аватарати — когда нисходит; шри-гаура-чандре — Шри Гаурачандра; бхуви — на землю</w:t>
+        <w:t>Пословно (анвайя Бхактисиддханты):</w:t>
+      </w:r>
+      <w:r>
+        <w:t xml:space="preserve"> пурне према-раса-ишваре шри-гаурачандре — когда Сам Бхагаван Гаурачандра, венец знатоков расы премы; бхуви — на землю; аватарати [сати] — нисшёл; сарве шанкара-нарада-адаях — все — Шанкара, Нарада и прочие (в образе Адвайты, Шривасы и других); иха — в этот мир (прапанчу); аятах — пришли; свайам шрих апи — сама Лакшми (в образе Шри Лакшмиприи и Вишнуприи); прапта — явилась; дева-халаюдхах апи — и Баладева — неотличная от Самого Бхагавана его форма-проявление; милитах — пребывал (в образе Нитьянанды); те вришнаях — Ядавы (в образе Шачи, Джаганнатхи Мишры и других); джатах — нисшли; ким бхуях — что ещё сказать; враджа-васинах гопала-гопи-адаях апи — и обитатели Враджа — Нанда и прочие, слуги Рактака, Читрака и прочие, друзья во главе с Субалой, гопи Враджа (словом «и прочие» — также Йогамайя и другие шакти) — все; пракатах — явились, то есть все вечносовершенные преданные лилы Кришны явились в лиле Гауры</w:t>
       </w:r>
     </w:p>
     <w:p>
@@ -21250,15 +20561,6 @@
         </w:rPr>
         <w:t>Когда Сам Бхагаван Гаурачандра, венец знатоков расы премы, нисшёл на землю, пришли все — Шанкара, Нарада и прочие (в образе преданных — Адвайты, Шривасы и других). Сама Лакшми явилась (как Шри Лакшмиприя и Шри Вишнуприя). Баладева — неотличная от Самого Бхагавана его форма-проявление — пребывал (в образе Нитьянанды Раи, сокрушителя безбожников). Явились и Ядавы (в Шачи, Джаганнатхе и других); да что ещё сказать — Нанда и другие обитатели Враджа, слуги Рактака, Читрака и прочие, друзья во главе с Субалой и шакти во главе с гопи — все вечносовершенные спутники лилы Кришны нисшли в лилу Гауры.</w:t>
       </w:r>
-      <w:r>
-        <w:br/>
-      </w:r>
-      <w:r>
-        <w:rPr>
-          <w:sz w:val="20"/>
-        </w:rPr>
-        <w:t>Из пословного толкования: словом «и прочие» обозначены также Йогамайя и другие шакти.</w:t>
-      </w:r>
     </w:p>
     <w:p>
       <w:pPr>
@@ -21364,10 +20666,10 @@
           <w:b w:val="0"/>
           <w:i/>
         </w:rPr>
-        <w:t>Пословно:</w:t>
-      </w:r>
-      <w:r>
-        <w:t xml:space="preserve"> бхритьях — слуги; снигдхах — нежные друзья (по B — сакхи); ати-су-мадхура-проджджвала-удара-бхаджах — причастные сладчайшей, сияющей и щедрой [расе] (по B — возлюбленные, служащие чистой мадхурья-расе); тат-пада-абджа-двитая-савидхе — рядом с его двумя лотосными стопами; сарве эва — все; аватирнах — нисошли; прапух — обрели; пурва-адхикатара-маха-према-пиюша-лакшмим — богатство нектара великой любви, большее, чем прежде; сва-преманам — собственную любовь; витарати — когда раздаёт; джагати — миру; адбхутам — дивную; хема-гауре — золотой Гаура</w:t>
+        <w:t>Пословно (анвайя Бхактисиддханты):</w:t>
+      </w:r>
+      <w:r>
+        <w:t xml:space="preserve"> хема-гауре — Шри Гаурасундара, сияющий, как расплавленное золото; адбхутам — неземную; сва-преманам — свою прему; джагати — на земле; витарати [сати] — когда раздавал; бхритьях — слуги; снигдхах — друзья; ати-сумадхура-проджджвала-удара-бхаджах — (ати-сумадхура — сладость, свободная от представления об айшварье; проджджвала — возвышенная уджвала; удара — чарующая; то есть и возлюбленные, служащие исключительно сладостной, возвышенной, чарующей уджвала-расе); сарве эва — все; тат-пада-абджа-двитая-савидхе — рядом с его двумя лотосными стопами; аватирнах [сантах] — нисшедшие; пурва-адхикатара-маха-према-пиюша-лакшмим — богатство нектара великой премы, большее, чем [вкушение премы] в лиле Кришны; прапух — обрели</w:t>
       </w:r>
     </w:p>
     <w:p>
@@ -21427,15 +20729,6 @@
         </w:rPr>
         <w:t>Когда Шри Гаурасундара, сияющий, как расплавленное золото, раздавал на земле свою неземную прему, слуги, друзья и возлюбленные — вечносовершенные служанки исключительно мадхура-расы, — все они, нисшедшие к его лотосным стопам, обрели богатство нектара великой премы, превосходящее прежнее (в лиле Кришны) вкушение премы.</w:t>
       </w:r>
-      <w:r>
-        <w:br/>
-      </w:r>
-      <w:r>
-        <w:rPr>
-          <w:sz w:val="20"/>
-        </w:rPr>
-        <w:t>Из пословного толкования: «чрезвычайно сладостной» — сладости, свободной от представления о величии (айшварье); «проджджвала» — возвышенной уджвала[-расы]; «удара» — чарующей; то есть возлюбленные, служащие исключительно сладостной, возвышенной, чарующей уджвала-расе.</w:t>
-      </w:r>
     </w:p>
     <w:p>
       <w:pPr>
@@ -21541,10 +20834,10 @@
           <w:b w:val="0"/>
           <w:i/>
         </w:rPr>
-        <w:t>Пословно:</w:t>
-      </w:r>
-      <w:r>
-        <w:t xml:space="preserve"> хасанти — смеются; уччаир уччаих — громко-громко; ахаха — ах!; кула-вадхвах — благородные жёны; апи — даже; паритах — вокруг (по B — со всех сторон, к стр. 2); дравибхавам — текучести; гаччханти — приходят в состояние; апи — даже; кувишая-грава-гхатитах — [сердца,] сложенные из камней дурных чувственных объектов; тираскурванти — посрамляют; аджнях — невежды; апи — даже; сакала-шастра-джня-самитим — собрание знатоков всех шастр; кшитау — на землю; шри-чайтанье — когда Шри Чайтанья; адбхута-махима-саре — суть дивного величия; аватарати — нисходит</w:t>
+        <w:t>Пословно (анвайя Бхактисиддханты):</w:t>
+      </w:r>
+      <w:r>
+        <w:t xml:space="preserve"> адбхута-махима-саре — крайне неземной, наделённый высшим величием; шри-чайтанье — Шри Чайтанья; кшитау — на землю; аватарати [сати] — когда нисшёл; ахаха — ах!; кула-вадхвах апи — даже благородные замужние женщины; уччаих уччаих хасанти — очень громко смеются; ку-вишая-грава-гхатитах апи — (ку-вишая — дурные объекты; грава — камень; гхатита — сложенные из него сердца, то есть твёрдые сердца, сложенные из камней дурных объектов наслаждения); паритах — всецело; драви-бхавам гаччханти — тают; аджнах апи — даже невежды; сакала-шастраджна-самитим — общество знатоков всех шастр; тираскурванти — посрамляют</w:t>
       </w:r>
     </w:p>
     <w:p>
@@ -21709,10 +21002,10 @@
           <w:b w:val="0"/>
           <w:i/>
         </w:rPr>
-        <w:t>Пословно:</w:t>
-      </w:r>
-      <w:r>
-        <w:t xml:space="preserve"> праях — почти; чайтаньям — разумение (сознание, обращённое к служению Кришне); на асит — не было; апи — даже; сакала-видам — у всезнающих; на иха — здесь не; пурвам — прежде; ят — потому что; эшам — их; кхарва — скудный; сарва-артха-саре — на сути всех целей (на према); апи — даже; акрита на хи — вовсе не сделал; падам — шага; кунтхита — косный (затупленный); буддхи-вриттих — работа рассудка; гамбхира-удара-бхава-удджвала-раса-мадхура-према-бхакти-правешах — вхождение в сладостную бхакти любви, в сияющую расу с глубокими и щедрыми чувствами; кешам — у кого; на асит — не было; иданим — теперь; джагати — в мир; карунайа — по милости; гаура-чандре — когда Гаурачандра; аватирне — нисшёл</w:t>
+        <w:t>Пословно (анвайя Бхактисиддханты):</w:t>
+      </w:r>
+      <w:r>
+        <w:t xml:space="preserve"> иха — в этом мире (прапанче); пурвам — до явления Чайтаньи; сакала-видам апи — даже у пандитов, знатоков всех шастр; праях чайтаньям — (функция сознания — служение Кришне — «чайтанья»); на асит — почти не было; ят — поскольку; эшам — их; кхарва кунтхита [ча] — крайне мелкая и склонная к сомнению; буддхи-вриттих — функция разума; сарва-артха-саре апи — (сарва — все, артха — цели человека; суть четырёх целей — пятая цель, кришна-према) даже в ней; падам — (предмет, то есть устремлённость); на хи акрита — не имела; [кинту] иданим — теперь же; гаурачандре — Гаурачандре; каруная — по милости; джагати — в мир; аватирне [сати] — нисшедшему; кешам — у кого; гамбхира-удара-бхава-уджвала-раса-мадхура-према-бхакти-правешах — (гамбхира — непостижимая; удара — чрезвычайно чудесная; бхава — вибхава и анубхава; уджвала-раса — шрингара-раса; мадхура-према-бхакти; вхождение в неё, то есть вхождение в непостижимую према-бхакти, полную возвышенной уджвала-мадхура-расы и напитанную чудеснейшими составляющими — вибхавой, анубхавой и прочими); на асит — не было</w:t>
       </w:r>
     </w:p>
     <w:p>
@@ -21772,15 +21065,6 @@
         </w:rPr>
         <w:t>До явления Чайтаньи в этом мире даже у мнящих себя пандитами знатоков всех шастр функция сознания — служение Кришне — была почти покрыта. Они не стремились к кришна-преме, венцу всех целей человеческой жизни, поскольку их разум был крайне мелок и склонен к сомнению. Но теперь, когда Шри Гаурачандра по милости нисшёл в мир, кто же не вступил в непостижимую према-бхакти, полную возвышенной уджвала-мадхура-расы и напитанную чудеснейшими составляющими — вибхавой, анубхавой и прочими!</w:t>
       </w:r>
-      <w:r>
-        <w:br/>
-      </w:r>
-      <w:r>
-        <w:rPr>
-          <w:sz w:val="20"/>
-        </w:rPr>
-        <w:t>Из пословного толкования: «чайтанья» — функция сознания, служение Кришне; «суть всех целей» — пятая цель человеческой жизни, кришна-према, суть четырёх целей (чатурварги); «бхава» — вибхава и анубхава; «уджвала-раса» — шрингара-раса.</w:t>
-      </w:r>
     </w:p>
     <w:p>
       <w:pPr>
@@ -21886,10 +21170,10 @@
           <w:b w:val="0"/>
           <w:i/>
         </w:rPr>
-        <w:t>Пословно:</w:t>
-      </w:r>
-      <w:r>
-        <w:t xml:space="preserve"> шримад-бхагаватасья — «Шримад-Бхагаватам»; ятра — в котором; парамам — высший; татпарьям — смысл; уттанкитам — лишь отмечен (намечен); шри-вайясакина — Шри Вайясаки (Шукой); дуранвайатая — из-за трудности постижения; раса-прасанге — в рассказе о раса; апи — даже; ят — который; ят — то, что; радха-рати-кели-нагара-раса-асвада-эка-сад-бхаджанам — единственное истинное вместилище вкуса расы галантного героя (Кришны) в любовных играх с Радхой; тат-васту-пратханая — чтобы распространить это сокровище; гаура-вапуша — в облике Гауры; локе — в мир; аватирнах — нисшёл; харих — Хари</w:t>
+        <w:t>Пословно (анвайя Бхактисиддханты):</w:t>
+      </w:r>
+      <w:r>
+        <w:t xml:space="preserve"> шри-вайясакина апи — даже сыном Вьясы Шукадевой; ятра раса-прасанге — в рассказе о раса-лиле; шримад-бхагаватасья — «Шримад-Бхагаватам»; ят парамам татпарьям — тот высший смысл (према — высший смысл расы лил Шри Радхи и Кришны); дуранваятая — из-за трудности постижения, то есть потому, что не было сосуда, способного вкусить расу этих лил и познать их истину; уттанкитам — лишь намечен, не описан подробно; ят [ча] — и то, что; радха-рати-кели-нагара-раса-асвада-эка-сад-бхаджанам — (рати-кели Шримати Радхики — любовные игры в никундже; нагара — венец высших знатоков расы Шри Кришна; единственный наилучший сосуд для вкушения сладости его раса и прочих лил); тад-васту-пратханая — чтобы распространить эти две вещи; харих — Шри Кришна; гаура-вапуша — в теле Гауры; локе — в этот мир; аватирнах — нисшёл</w:t>
       </w:r>
     </w:p>
     <w:p>
@@ -21949,15 +21233,6 @@
         </w:rPr>
         <w:t>Даже сын Вьясы Шрила Шукадева в рассказе о раса-лиле лишь упомянул сокровенный смысл «Шримад-Бхагаватам», не описав его подробно, ибо его нельзя постичь одним лишь изучением шастр. Ради раскрытия двух вещей — этого смысла «Шримад-Бхагаватам» и единственного наилучшего сосуда для вкушения сладости раса-лилы и прочих лил Шри Кришны, венца высших знатоков расы, в любовных играх никунджи — Шри Кришна нисшёл в этот мир в теле Гауры.</w:t>
       </w:r>
-      <w:r>
-        <w:br/>
-      </w:r>
-      <w:r>
-        <w:rPr>
-          <w:sz w:val="20"/>
-        </w:rPr>
-        <w:t>Из пословного толкования: высший смысл «Бхагаватам» — према, высший смысл расы лил Шри Радхи и Кришны; «из-за трудности постижения» — то есть потому, что не было сосуда, способного вкусить расу этих лил и познать их истину; «рати-кели» Шримати Радхики — любовные игры в никундже; «нагара» — Шри Кришна, венец высших знатоков расы.</w:t>
-      </w:r>
     </w:p>
     <w:p>
       <w:pPr>
@@ -22063,10 +21338,10 @@
           <w:b w:val="0"/>
           <w:i/>
         </w:rPr>
-        <w:t>Пословно:</w:t>
-      </w:r>
-      <w:r>
-        <w:t xml:space="preserve"> кечит — некоторые; дасьям — служение; авапух — обрели; уддхава-мукхах — Уддхава и другие; шлагхьям — достойное хвалы; паре — другие; лебхире — обрели; шридама-ади-падам — положение Шридамы и прочих [друзей]; враджа-амбуджа-дришам — лотосооких девушек Враджа; бхавам — чувство; ча — и; бхеджух — обрели; паре — иные; аньйе — иные; дханья-тамах — счастливейшие; дхаянти — пьют; судхиях — мудрые; радха-пада-амбхорухам — [нектар] лотосных стоп Радхи; шри-чайтанья-махапрабхох — Шри Чайтаньи Махапрабху; карунайа — по милости; локасья — миру; ках — какие; сампадах — богатства</w:t>
+        <w:t>Пословно (анвайя Бхактисиддханты):</w:t>
+      </w:r>
+      <w:r>
+        <w:t xml:space="preserve"> шри-чайтанья-махапрабхох — Шри Кришна-Чайтаньи Махапрабху; каруная — милостью; локасья ках сампадах — каких только богатств у людей [не появилось]?; уддхава-мукхах кечит дасьям авапух — из преданных во главе с Уддхавой некоторые обрели настроение служения, как у Рактаки, Патраки и других; паре — другие; шлагхьям шридама-ади-падам лебхире — обрели достойное похвалы положение друзей Шридамы и прочих; паре ча враджа-амбуджа-дришам бхавам бхеджух — а другие обрели настроение враджских гопи; анье дханьятамах судхиях — иные, благословеннейшие и мудрые; радха-пада-амбхорухам — сладость лотосных стоп Шри Радхи; дхаянти — вкушают</w:t>
       </w:r>
     </w:p>
     <w:p>
@@ -22231,10 +21506,10 @@
           <w:b w:val="0"/>
           <w:i/>
         </w:rPr>
-        <w:t>Пословно:</w:t>
-      </w:r>
-      <w:r>
-        <w:t xml:space="preserve"> сарва-джняих — всезнающими; муни-пунгаваих — лучшими из мудрецов; правитате — когда распространены; тат-тан-мате — их собственные учения; юктибхих — доводами; пурвам — прежде; на — не; экатаратра — ни в одном из них; ко 'пи джанах — ни один человек; судридхам — твёрдо; вишвастах — уверен; асит — был; сампрати — теперь; апратима-прабхаве — несравненной силы; удите — когда взошёл; гауранга-чандре — Гауранга-Луна; пунах — вновь; шрути-артхах — смысл шрути; хари-бхактих — преданность Хари; эва — лишь; парамах — высший; каих ва — кем же; на нирдхарьяте — не признаётся (не утверждается)</w:t>
+        <w:t>Пословно (анвайя Бхактисиддханты):</w:t>
+      </w:r>
+      <w:r>
+        <w:t xml:space="preserve"> сарваджнаих — всеведущими; муни-пунгаваих — лучшими из мудрецов; тат-тан-мате — их собственные учения; юктибхих — доводами и рассуждениями; правитате [сати] — когда были широко распространены; пурвам — прежде; ках джанах апи — ни один человек; экатаратра — в одностороннем учении; судридхам вишвастах — твёрдо уверенным; на асит — не был; сампрати — теперь; апратима-прабхаве гауранга-чандре — несравненный по могуществу Шри Гаурачандра; удите [сати] — когда взошёл; пунах — вновь; парамах шрути-артхах — высшая цель, утверждаемая всеми шрути; хари-бхактих эва — одна лишь Хари-бхакти; каих ва — кем же; на нирдхарьяте — не была установлена?; [то есть, хотя взаимно противоречащие учения мудрецов, рождённые умозрением, утверждались казуистическими доводами и прочим, сами их авторы сомневались в своих учениях; но вечная религия бхакти, проповеданная Вечным Пурушей, Самим Бхагаваном Шри Гаурасундарой, — установленная шрути подлинная истина, свободная от всякого обмана]</w:t>
       </w:r>
     </w:p>
     <w:p>
@@ -22294,15 +21569,6 @@
         </w:rPr>
         <w:t>Хотя всеведущие лучшие из мудрецов изложили свои учения, [опираясь на] доводы, прежде никто не был твёрдо уверен в этих пристрастных доводах. Теперь же, когда взошёл несравненный по могуществу Шри Гаурачандра, кто же вновь не убедился в том, что одна лишь Хари-бхакти — высшая цель, утверждаемая Ведами?</w:t>
       </w:r>
-      <w:r>
-        <w:br/>
-      </w:r>
-      <w:r>
-        <w:rPr>
-          <w:sz w:val="20"/>
-        </w:rPr>
-        <w:t>Из пословного толкования: то есть, хотя взаимно противоречащие учения мудрецов, рождённые умозрением, утверждались казуистическими доводами и прочим, сами их авторы сомневались в своих учениях; но вечная религия бхакти, проповеданная Вечным Пурушей, Самим Бхагаваном Шри Гаурасундарой, — установленная шрути подлинная истина, свободная от всякого обмана.</w:t>
-      </w:r>
     </w:p>
     <w:p>
       <w:pPr>
@@ -22408,10 +21674,10 @@
           <w:b w:val="0"/>
           <w:i/>
         </w:rPr>
-        <w:t>Пословно:</w:t>
-      </w:r>
-      <w:r>
-        <w:t xml:space="preserve"> вишвам — мир; маха-пранайа-садху-судха-раса-эка-патхонидхау — в несравненный океан превосходного нектара расы великой любви (махабхавы); сакалам эва — весь; нимаджджаянтам — погружающее; гауранга-чандра-накха-чандра-мани-чхатаях — блеска лунных камней (чандраканта) — ногтей Гауранги-Луны; канчит — некое; вичитрам — дивное; анубхавам — проявление (могущество); ахам — я; смарами — вспоминаю</w:t>
+        <w:t>Пословно (анвайя Бхактисиддханты):</w:t>
+      </w:r>
+      <w:r>
+        <w:t xml:space="preserve"> гауранга-чандра-накха-чандра-мани-ччхатаях — сияния лунных камней — ногтей Гаурангачандры; маха-пранайа-садху-судха-раса-эка-патхонидхау — (по мере созревания премы возникают снеха, мана и пранайя; с ростом пранайи постепенно возникают рага, анурага, бхава и [махабхава]; поэтому «махапранайя» — према в форме махабхавы; садху — превосходный; судха-раса — нектарная раса; эка — главный; патхонидхи — океан; то есть в превосходный нектарный океан махапранайи); сакалам эва вишвам — весь мир; нимаджджаянтам — погружающее; канчит — неописуемое; вичитрам — дивное; анубхавам — могущество; ахам смарами — я вспоминаю</w:t>
       </w:r>
     </w:p>
     <w:p>
@@ -22471,15 +21737,6 @@
         </w:rPr>
         <w:t>Я вспоминаю неописуемое дивное могущество сияния лунных камней ногтей Гаурачандры, которое погружает весь мир в наивысший нектарный океан махапранайи.</w:t>
       </w:r>
-      <w:r>
-        <w:br/>
-      </w:r>
-      <w:r>
-        <w:rPr>
-          <w:sz w:val="20"/>
-        </w:rPr>
-        <w:t>Из пословного толкования: по мере созревания премы возникают снеха, мана и пранайя; с ростом пранайи постепенно возникают рага, анурага, бхава и [махабхава]; поэтому «махапранайя» означает прему в форме махабхавы.</w:t>
-      </w:r>
     </w:p>
     <w:p>
       <w:pPr>
@@ -22545,10 +21802,10 @@
           <w:b w:val="0"/>
           <w:i/>
         </w:rPr>
-        <w:t>Пословно:</w:t>
-      </w:r>
-      <w:r>
-        <w:t xml:space="preserve"> ати-пуньяих — исполненными высших заслуг; ати-сукритаих — исполненными великого благочестия; критартхикритах — приведён к цели (по B — достиг Вайкунтхи); ко 'пи — кто-то, разве кто-то; пурваих — прежними [великими]; эвам — так; каих апи — кем-либо; на критам — не сделано; ят — что; према-абдхау — в океан любви; нимаджджитам — погружён; вишвам — мир</w:t>
+        <w:t>Пословно (анвайя Бхактисиддханты):</w:t>
+      </w:r>
+      <w:r>
+        <w:t xml:space="preserve"> ати-пуньяих — крайне благочестивыми, то есть строго следующими доброму поведению; ати-сукритаих — обладающими особыми сукрити, то есть высшей праведностью; пурваих — такими древними великими личностями; ках апи [джанах] — некоторые люди; критартхи-критах — приведены к цели, то есть достигли Вайкунтхи и других миров; [чайтанья-чандрена — Чайтанья-чандрой]; ят вишвам — так, как мир; према-абдхау — в океан премы; нимаджджитам — погружён; эвам — так; [прак — прежде]; каих апи на критам — никем не было сделано</w:t>
       </w:r>
     </w:p>
     <w:p>
@@ -22713,10 +21970,10 @@
           <w:b w:val="0"/>
           <w:i/>
         </w:rPr>
-        <w:t>Пословно:</w:t>
-      </w:r>
-      <w:r>
-        <w:t xml:space="preserve"> дхарме — в дхарме; ништхам — верность; дадхат — имея; анупамам — несравненную; вишну-бхактим — преданность Вишну; гариштхам — величайшую; самвибхранах — храня; дадхат — нося; иха — здесь; хи — ведь; хрит — сердце; тиштхати — пребывает; ива — словно; ашмасарам — железо (твёрдое, как железо); ничах — низкий; гогхнат — чем убийца коровы; апи — даже; джагат — мир; ахо — о!; плаваяти — затопляет; ашру-пураих — потоками слёз; ках ва — кто же; джанати — знает; ахаха — ах!; гаханам — непостижимую; хема-гауранга-рангам — игру золотого Гауранги</w:t>
+        <w:t>Пословно (анвайя Бхактисиддханты):</w:t>
+      </w:r>
+      <w:r>
+        <w:t xml:space="preserve"> дхарме — в отношении дхармы; анупамам — несравненную; ништхам — твёрдость или веру; дадхат [апи] — даже имея; гариштхам — высшую; вишну-бхактим — бхакти к Шри Вишну, или склонность к служению; самвибхранах [апи] — даже всецело приняв прибежище; ашма-сарам ива — твёрдое, как железо; хрит — сердце; дадхат — имея; иха — в этом мире; тиштхати — пребывает [человек]; [атха ча — а между тем, по милости Шри Гаурасундары]; гогхнат апи нича [джанах] — человек ниже даже убийцы коров, то есть грешник; ахо — ах!; ашру-пураих — потоками слёз; джагат плаваяти — затопляет мир; ахаха — ах!; ках ва — кто же; гаханам хи хема-гауранга-рангам — непостижимую игру золотистого Шри Гаурасундары; джанати — может постичь</w:t>
       </w:r>
     </w:p>
     <w:p>
@@ -22881,10 +22138,10 @@
           <w:b w:val="0"/>
           <w:i/>
         </w:rPr>
-        <w:t>Пословно:</w:t>
-      </w:r>
-      <w:r>
-        <w:t xml:space="preserve"> квачит — порою; кришна-авешат — от погружённости в Кришну; натати — пляшет; баху-бхангим — множество поз; абхинаян — изображая; квачит — порою; радха-авиштах — охваченный [чувством] Радхи; хари хари хари ити — «Хари! Хари! Хари!»; арти-рудитах — плачущий в муке; квачит — порою; ринган — ползая; балах — младенец; квачит апи ча — а порою; гопала-чаритах — ведущий себя как пастушок; джагат — мир; гаурах — Гаура; висмапаяти — изумляет; баху-гамбхира-махима — чьё величие обширно и глубоко</w:t>
+        <w:t>Пословно (анвайя Бхактисиддханты):</w:t>
+      </w:r>
+      <w:r>
+        <w:t xml:space="preserve"> баху-гамбхира-махима — (баху — обширный; гамбхира — непостижимый логикой или труднопроницаемый; тот, у кого такое величие, то есть могущество); [сах — этот]; гаурах — Гаурасундара; джагат висмапаяти — изумляет мир; кришна-авешат — из-за погружённости в Шри Кришну; квачит — иногда; балах [сан] — став ребёнком; ринган — ползает на коленях; квачит апи ча — а иногда; гопала-чаритах [сан] — являя нрав пастушка; квачит — иногда; баху-бхангим — множество поз; абхинаян — изображая; натати — танцует; квачит — иногда; радха-авиштах [сан] — охваченный настроением Шри Радхи в разлуке с Кришной; хари хари хари ити арти-рудитах — произнося «Хари! Хари! Хари!», рыдает с болью, рождённой страданием разлуки</w:t>
       </w:r>
     </w:p>
     <w:p>
@@ -22944,15 +22201,6 @@
         </w:rPr>
         <w:t>Шри Гаурасундара, обладающий обширным и непостижимым могуществом, приводит в изумление вселенную. Из-за погружённости в Шри Кришну он то, проявляя детское [настроение], ползает на коленях, то, являя нрав пастушка, то, изображая множество поз, танцует, а то, охваченный настроением Шри Радхи в разлуке с Кришной, рыдает с болью, рождённой страданием разлуки: «Хари! Хари!! Хари!!!»</w:t>
       </w:r>
-      <w:r>
-        <w:br/>
-      </w:r>
-      <w:r>
-        <w:rPr>
-          <w:sz w:val="20"/>
-        </w:rPr>
-        <w:t>Из пословного толкования: «гамбхира» — непостижимый логикой, или в который трудно проникнуть.</w:t>
-      </w:r>
     </w:p>
     <w:p>
       <w:pPr>
@@ -23058,10 +22306,10 @@
           <w:b w:val="0"/>
           <w:i/>
         </w:rPr>
-        <w:t>Пословно:</w:t>
-      </w:r>
-      <w:r>
-        <w:t xml:space="preserve"> велаям — на берегу; лавана-амбудхех — солёного океана; мадхурима-прагбхава-сара-спхурат-лилаям — в игры, где сияет суть изначального чувства (любви Радхи) к сладости; нава-валлави-раса-нидхех — [Кришны,] сокровищницы расы юной пастушки (Радхи); авешаянти — погружающий; джагат — мир; кхелаям — в забавах; апи — даже; шайшаве — в детстве; ниджа-руча — своим сиянием; вишва-эка-саммохини — единственный чаровник вселенной; муртих — облик; качана — некий, неописуемый; канчана-драва-майи — из расплавленного золота; читтая — сердцу; ме — моему; рочате — мил</w:t>
+        <w:t>Пословно (анвайя Бхактисиддханты):</w:t>
+      </w:r>
+      <w:r>
+        <w:t xml:space="preserve"> лавана-амбудхех — солёного океана; велаям — на берегу; шайшаве апи кхелаям — даже в детских играх; ниджа-руча — собственным сиянием; вишва-эка-саммохини — единственная чаровница вселенной; нава-баллави-раса-нидхех — («нава-баллави» — юная лучшая из гопи Шри Радхика; её раса-нидхи, то есть вместилище её расы, — Шри Кришна, венец знатоков расы); мадхурима-праг-бхава-сара-спхурал-лилаям — (мадхурима — в сладости; прагбхава — прежняя бхава, то есть та высшая чудесная према, которую ашрая-виграха Шримати Радхика питает к вишая-виграхе Кришне; её сутью проявляющаяся лила, то есть лила божественного безумия махабхавы Кришны, царя расы, в настроении Радхи — в неё); джагат — мир, [принявший у него прибежище]; авешаянти — погружающая; качана канчана-драва-майи — некий неописуемый [облик] из расплавленного золота; муртих — облик; ме читтая рочате — по сердцу мне</w:t>
       </w:r>
     </w:p>
     <w:p>
@@ -23121,15 +22369,6 @@
         </w:rPr>
         <w:t>Тот облик Гаурахари, который силой собственного сияния даже в детских играх — единственный чарователь вселенной, принявшей у него прибежище, и который погружает этот мир, [принявший] прибежище, в лилу, проявляющуюся через суть прежней бхавы сладости Шри Кришны, венца знатоков расы, вместилища расы Шри Варшабханави, лучшей из юных [пастушек], (то есть через суть высшей чудесной премы Шримати Радхики, ашрая-виграхи, к Кришне, вишая-виграхе), — то есть в лилу божественного безумия Кришны, царя расы, исполненного махабхавы, в настроении Радхи, — этот дивный облик из расплавленного золота на берегу солёного океана — по сердцу мне.</w:t>
       </w:r>
-      <w:r>
-        <w:br/>
-      </w:r>
-      <w:r>
-        <w:rPr>
-          <w:sz w:val="20"/>
-        </w:rPr>
-        <w:t>Из пословного толкования: «нава-баллави» — юная Шри Радхика, лучшая из гопи.</w:t>
-      </w:r>
     </w:p>
     <w:p>
       <w:pPr>
@@ -23235,10 +22474,10 @@
           <w:b w:val="0"/>
           <w:i/>
         </w:rPr>
-        <w:t>Пословно:</w:t>
-      </w:r>
-      <w:r>
-        <w:t xml:space="preserve"> према нама — называемый премой; адбхута-артхах — дивный предмет (высшая цель); шравана-патха-гатах — достиг пути слуха; касья — чьего; намнам — Имён; махимнах — величия; ках — кто; ветта — знаток; касья — у кого; вриндавана-випина-маха-мадхуришу — в великую сладость лесов Вриндаваны; правешах — вхождение; ках ва — кто же; джанати — знает; радхам — Радху; парама-раса-чаматкара-мадхурья-симам — предел сладости и чуда высшей расы; эках — один; чайтанья-чандрах — Чайтанья-Луна; парама-карунайа — по высшей милости; сарвам — всё; авишчакара — открыл</w:t>
+        <w:t>Пословно (анвайя Бхактисиддханты):</w:t>
+      </w:r>
+      <w:r>
+        <w:t xml:space="preserve"> према нама — называемая премой; адбхута-артхах — высшая цель человека; [прак — прежде]; кася — чьего; шравана-патха-гатах — слуха достигла?; ках [ва] намнам махимнах — величия имён (родительный падеж объекта); ветта [сьят] — знатоком был?; вриндавана-випина-маха-мадхуришу — (в великие сладости лесов Вриндавана — «випина», то есть чащ, в которые трудно проникнуть); кася правешах — у кого было вхождение?; ко ва — кто же; парама-раса-чаматкара-мадхурья-симам радхам — (Радху, в которой — предел чудесной сладости адхирудха-махабхавы, то есть Шримати Радхику, в которой одной в полноте проявлена высшая ступень […] божественного безумия, исполненного неземного служения Кришне, — как объект поклонения); джанати — знал?; эках чайтанья-чандрах — один лишь Шри Чайтанья-чандра (слово «чандра» указывает на уничтожение тьмы лукавства и […]); парама-каруная — по высшей щедрости; сарвам авишчакара — открыл всё это; [Шрила Бхактивинода Тхакур, приведя этот стих в заключении пятой главы книги «Шри Махапрабху-шикша», писал: «Нектарную прему принёс в этот мир один лишь Шри Чайтаньядева, прежде её не приносил никто; чтобы показать это, Шрила Прабодхананда Сарасвати и привёл этот стих»]</w:t>
       </w:r>
     </w:p>
     <w:p>
@@ -23298,15 +22537,6 @@
         </w:rPr>
         <w:t>Кто вообще слышал о высшей цели человеческой жизни, называемой «према»? Кто знал величие святого имени? Кто проникал в непроходимое скопление великих сладостей леса Вриндавана? Кто знал (как объект поклонения) Шри Варшабханави, высшую степень сладости чудеснейшей адхирудха-махабхавы? Один лишь Чайтанья-чандра, явив лилу высшей щедрости, открыл всё это.</w:t>
       </w:r>
-      <w:r>
-        <w:br/>
-      </w:r>
-      <w:r>
-        <w:rPr>
-          <w:sz w:val="20"/>
-        </w:rPr>
-        <w:t>Из пословного толкования: «випина» Вриндавана — чащи, в которые трудно проникнуть; Радха — Шримати Радхика, в которой единственной в полноте проявлена высшая ступень […] божественного безумия, исполненного неземного служения Кришне; слово «чандра» (луна) указывает на уничтожение тьмы лукавства и […]; Шрила Бхактивинода Тхакур, приведя этот стих в заключении пятой главы книги «Шри Махапрабху-шикша», писал: «Нектарную прему принёс в этот мир один лишь Шри Чайтаньядева, прежде её не приносил никто; чтобы показать это, Шрила Прабодхананда Сарасвати и привёл этот стих».</w:t>
-      </w:r>
     </w:p>
     <w:p>
       <w:pPr>
@@ -23420,10 +22650,10 @@
           <w:b w:val="0"/>
           <w:i/>
         </w:rPr>
-        <w:t>Пословно:</w:t>
-      </w:r>
-      <w:r>
-        <w:t xml:space="preserve"> пурна-према-раса-амрита-абдхи-лахари-лола-анга-гаура-чхата-котья-аччхадита-вишвам — покрывший вселенную миллионами золотых отсветов тела, колышущегося на волнах океана нектара расы полной любви; ишвара-видхи-вьяса-адибхих — Владыкой (Шивой), Творцом (Брахмой), Вьясой и другими; самстутам — прославляемый; дурлакшьям — едва различимый; шрути-котибхих — миллионами шрути; пракатаян — являя; муртим — облик; джаган-мохиним — пленяющий мир; ашчарьям — о чудо!; лаванода-родхаси — на берегу солёного океана; парам брахма — Высший Брахман; свайам — сам; нритьяти — пляшет</w:t>
+        <w:t>Пословно (анвайя Бхактисиддханты):</w:t>
+      </w:r>
+      <w:r>
+        <w:t xml:space="preserve"> пурна-према-раса-амрита-абдхи-лахари-лола-анга-гаура-ччхата-коти-аччхадита-вишвам — (тот Пуруша, которым вселенная покрыта миллионами золотых лучей его тела, колеблемого волнами океана нектара расы совершенной премы); ишвара-видхи-вьяса-адибхих самстутам — («Ишвара» — Махешвара, бог богов; «Видхи» — Брахма; и мудрецами во главе с Вьясой всецело восхваляемый); шрути-котибхих дурлакшьям — сокрытую от множества шрути; джаган-мохиним муртим — чарующий мир облик; пракатаят — явив; ашчарьям парам брахма — изумляющий мир Высший Брахман, Шри Бхагаван; лаванода-родхаси — на берегу солёного океана; свайам нритьяти — сам танцует</w:t>
       </w:r>
     </w:p>
     <w:p>
@@ -23483,15 +22713,6 @@
         </w:rPr>
         <w:t>Тот, кто покрыл вселенную миллионами лучей своего золотого сияния, колеблемого волнами океана нектара расы совершенной премы, и кого непрестанно восхваляют мудрецы — Шива, Брахма, Вьяса и другие, — этот дивный Высший Брахман Шри Гаурасундара, явив чарующий мир облик, сокрытый от миллионов шрути, сам танцует на берегу солёного океана.</w:t>
       </w:r>
-      <w:r>
-        <w:br/>
-      </w:r>
-      <w:r>
-        <w:rPr>
-          <w:sz w:val="20"/>
-        </w:rPr>
-        <w:t>Из пословного толкования: «Ишвара» — Махешвара, бог богов; «Видхи» — Брахма.</w:t>
-      </w:r>
     </w:p>
     <w:p>
       <w:pPr>
@@ -23597,10 +22818,10 @@
           <w:b w:val="0"/>
           <w:i/>
         </w:rPr>
-        <w:t>Пословно:</w:t>
-      </w:r>
-      <w:r>
-        <w:t xml:space="preserve"> ко 'ям — кто этот; патта-дхати-вираджита-кати-дешах — чьи бёдра украшены шёлковой тканью; каре — на руке; канканам — браслет; харам — ожерелье; вакшаси — на груди; кундалам — серьги; шраванайох — в ушах; бибхрат — нося; паде — на ногах; нупурам — ножные колокольчики; урдхвикритья — подняв; нибаддха-кунтала-бхара-протпхулла-малли-срага-апидах — увенчанный гирляндой распустившегося жасмина на связанных пышных кудрях; кридати — играет; гаура-нагара-варах — Гаура, лучший из галантных героев; нритьян — танцуя; ниджаих — своими; намабхих — с именами</w:t>
+        <w:t>Пословно (анвайя Бхактисиддханты):</w:t>
+      </w:r>
+      <w:r>
+        <w:t xml:space="preserve"> патта-дхати-вираджита-кати-дешах — тот, на чьём поясе сияет шёлковая ткань; каре канканам — на руке браслет; вакшаси харам — на груди ожерелье; шраванаёх кундалам — в ушах серьги; паде нупурам — на ногах ножные колокольчики; бибхрат — нося; урдхви-критья нибаддха-кунтала-бхара-протпхулла-малли-срак-апидах — тот, у кого на высоко подвязанных вьющихся волосах — венец, украшенный гирляндой распустившейся маллики; ках аям гаура-нагара-варах — кто этот неописуемый («Гаура» — золотистого цвета; «нагара-вара» — венец высших знатоков расы, то есть Гаура — это сам Кришна, венец знатоков расы, разыгрывающий лилу на стороне ашраи); ниджаих намабхих — с киртаном своих имён; нритьян — танцуя; кридати — играет</w:t>
       </w:r>
     </w:p>
     <w:p>
@@ -23660,15 +22881,6 @@
         </w:rPr>
         <w:t>Кто этот золотистый Пуруша, высший нагара, венец высших знатоков расы, который, облачённый в шёлк на поясе, с браслетами на руках, ожерельем на груди, серьгами в ушах, ножными колокольчиками на стопах и венцом из распустившихся гирлянд жасмина (маллики) на высоко подвязанных вьющихся волосах, играет, танцуя под киртан своих имён?</w:t>
       </w:r>
-      <w:r>
-        <w:br/>
-      </w:r>
-      <w:r>
-        <w:rPr>
-          <w:sz w:val="20"/>
-        </w:rPr>
-        <w:t>Из пословного толкования: «Гаура» — золотистого цвета, «нагара-вара» — венец высших знатоков расы, то есть Гаура — это сам Кришна, венец знатоков расы, разыгрывающий лилу на стороне ашраи.</w:t>
-      </w:r>
     </w:p>
     <w:p>
       <w:pPr>
@@ -23774,10 +22986,10 @@
           <w:b w:val="0"/>
           <w:i/>
         </w:rPr>
-        <w:t>Пословно:</w:t>
-      </w:r>
-      <w:r>
-        <w:t xml:space="preserve"> девах — боги; дундубхи-ваданам — игру на литаврах; видадхире — устроили; гандхарва-мукхьях — лучшие из гандхарвов; джагух — пели; сиддхах — сиддхи; сантата-пушпа-вриштибхих — непрерывными дождями цветов; имам — эту; притхвим — землю; самаччхадаян — покрыли; дивья-стотра-парах — преданные дивным хвалам; махарши-нибахах — сонмы великих риши; притья — с любовью; упатастхух — предстали (славя); ниджа-према-унмадини — обезумевшем от собственной любви; тандавам — неистовый танец; рачаяти — когда исполнял; шри-гаура-чандре — Шри Гаурачандра; бхуви — на земле</w:t>
+        <w:t>Пословно (анвайя Бхактисиддханты):</w:t>
+      </w:r>
+      <w:r>
+        <w:t xml:space="preserve"> ниджа-према-унмадини шри-гаурачандре — когда Шри Гаурачандра, обезумевший от собственной премы; бхуви — на земле; тандавам — танец; рачаяти [сати] — исполнил, то есть явил; девах — полубоги; дундубхи-ваданам — игру на дундубхах; видадхире — исполнили; гандхарва-мукхьях — главные гандхарвы; джагух — пели; сиддхах — сиддхи; сантата-пушпа-вриштибхих — непрестанным дождём цветов; имам притхвим — эту землю; самаччхадаян — всецело покрыли; дивья-стотра-парах — искусные в чтении чарующих гимнов; махарши-нивахах — сонмы великих риши; притья — с любовью; упатастхух — восхваляли</w:t>
       </w:r>
     </w:p>
     <w:p>
@@ -23942,10 +23154,10 @@
           <w:b w:val="0"/>
           <w:i/>
         </w:rPr>
-        <w:t>Пословно:</w:t>
-      </w:r>
-      <w:r>
-        <w:t xml:space="preserve"> кшанам — то (на миг); хасати — смеётся; родити — плачет; кшанам — то; атха — и; кшанам — то; мурччхати — лишается чувств; кшанам — то; лутхати — катается по земле; дхавати — бежит; кшанам атха кшанам — то… то; нритьяти — пляшет; кшанам — то; швасити — вздыхает; мунчати — издаёт; кшанам — то; удара-ха-ха-рутим — громкие крики «Ха! Ха!»; маха-пранайа-сидхуна — хмелем великой любви (махабхавы); вихарати — играет; иха — здесь; гаурах харих — Гаура-Хари</w:t>
+        <w:t>Пословно (анвайя Бхактисиддханты):</w:t>
+      </w:r>
+      <w:r>
+        <w:t xml:space="preserve"> маха-пранайа-сидхуна гаурах харих — (махапранайя — махабхава; сидху — нектарная раса; отмеченный ею, то есть исполненный махабхавы Гаурахари; творительный падеж признака); иха — в этом мире; вихарати — играет; кшанам хасати — то смеётся; кшанам родити — то плачет; атха кшанам мурччхати — то лишается чувств; кшанам лутхати — то катается по земле; кшанам дхавати — то бежит; атха кшанам нритьяти — то танцует; кшанам швасити — то испускает долгие вздохи; кшанам удара-хаха-рутим мунчати — то издаёт громкие (великие) возгласы «ха! ха!»</w:t>
       </w:r>
     </w:p>
     <w:p>
@@ -24005,15 +23217,6 @@
         </w:rPr>
         <w:t>Погружённый в нектарную расу махабхавы, Шри Гаурахари то смеётся, то плачет, то лишается чувств, то катается по земле, то быстро бежит, а то снова танцует, то испускает долгие вздохи, а то издаёт громкие возгласы «ха! ха!» — (так, в разных состояниях) он играет в этом мире.</w:t>
       </w:r>
-      <w:r>
-        <w:br/>
-      </w:r>
-      <w:r>
-        <w:rPr>
-          <w:sz w:val="20"/>
-        </w:rPr>
-        <w:t>Из пословного толкования: «махапранайя» — махабхава, «сидху» — нектарная раса.</w:t>
-      </w:r>
     </w:p>
     <w:p>
       <w:pPr>
@@ -24119,10 +23322,10 @@
           <w:b w:val="0"/>
           <w:i/>
         </w:rPr>
-        <w:t>Пословно:</w:t>
-      </w:r>
-      <w:r>
-        <w:t xml:space="preserve"> ашрунам — слёз; кимапи — неописуемыми; праваха-нивахаих — множеством потоков; кшауним — землю; пурах — перед собой; панкилам — грязной; курван — делая; пани-тале — на ладонь; нидхая — положив; бадара-пандум — бледную, как плод бадари; каполастхалим — щёку; ашчарьям — дивное (по B — к «одежде»); лаванода-родхаси — на берегу солёного океана; васан — пребывая; шонам — алую; дадханах — нося; амшукам — одежду; гаури-бхуя — став золотым (Гаурой); харих — Хари; свайам — сам; витануте — распространяет; радха-пада-абдже — к лотосным стопам Радхи; ратим — любовь</w:t>
+        <w:t>Пословно (анвайя Бхактисиддханты):</w:t>
+      </w:r>
+      <w:r>
+        <w:t xml:space="preserve"> лаванода-родхаси — на берегу солёного океана; васан — сидя; ашчарьям — дивную; шонам амшукам — («шона» — алый, «амшука» — одежда); дадханах — нося (в шастрах говорится, что и Шримати Радхика носит одежды алого цвета — цвета анураги к Кришне); пани-тале — на ладонь; бадара-пандум — слегка бледную, как плод бадари; каполастхалим — щёку; нидхая — положив; ашрунам — слёз; ким апи праваха-нивахаих — какими-то дивными потоками; пурах кшаиним — землю перед собой; панкилам — грязной; курван — делая; свайам харих — Сам Бхагаван Шри Кришна; гаури-бхуя — став Гаурангой; радха-пада-абдже — к лотосным стопам Радхи; ратим витануте — распространяет рати</w:t>
       </w:r>
     </w:p>
     <w:p>
@@ -24182,15 +23385,6 @@
         </w:rPr>
         <w:t>Сам Шри Кришна, приняв бхаву со стороны ашраи, в облике Гауранги сидит на берегу солёного океана, облачённый в шафрановые одежды, и, положив на ладонь свою щёку, слегка побледневшую, как плод бадари (что указывает на вайварнью — изменение цвета), потоками слёз превращая землю перед собой в грязь, распространяет рати к лотосным стопам Радхи.</w:t>
       </w:r>
-      <w:r>
-        <w:br/>
-      </w:r>
-      <w:r>
-        <w:rPr>
-          <w:sz w:val="20"/>
-        </w:rPr>
-        <w:t>Из пословного толкования: «шона» — алый, «ангшука» — одежда; в шастрах говорится, что и Шримати Радхика носит одежды алого цвета — цвета анураги к Кришне.</w:t>
-      </w:r>
     </w:p>
     <w:p>
       <w:pPr>
@@ -24296,10 +23490,10 @@
           <w:b w:val="0"/>
           <w:i/>
         </w:rPr>
-        <w:t>Пословно:</w:t>
-      </w:r>
-      <w:r>
-        <w:t xml:space="preserve"> пада-агхата-раваих — звуками ударов стоп; дишах — стороны света; мукхараян — оглашая; нетра-амбхасам — слёз; биндубхих — каплями; кшауним — землю; панкилаян — превращая в грязь; ахо — о!; вишадаян — делая светлым (белым); аттаттахасаих — раскатами смеха; набхах — небо; чандра-джьотих — сияющий, как луна; удара-сундара-кати-вьялола-шона-амбарах — с алым одеянием, колышущимся на прекрасных, изящных бёдрах; ках — какой; девах — Бог; лаванода-кула-кусума-удьяне — в цветущем саду на берегу солёного океана; муда — радостно; нритьяти — пляшет</w:t>
+        <w:t>Пословно (анвайя Бхактисиддханты):</w:t>
+      </w:r>
+      <w:r>
+        <w:t xml:space="preserve"> ахо — ах!; пада-агхата-раваих — звуками ударов стоп, то есть притопыванием в танце; дишах — десять сторон света; мукхараян — оглашая; нетра-амбхасам — слёз; биндубхих — каплями; кшаиним — землю; панкилаян — делая грязной; аттатта-хасаих — раскатами громкого смеха; набхах — небосвод; вишадаян — делая белым; чандра-джьотих — с золотым сиянием, подобным сиянию луны; удара-сундара-кати-вьялола-шона-амбарах — носящий чарующие шафрановые одежды, свисающие с прекрасного стана; лаванода-кула-кусума-удьяне — в цветущем саду на берегу солёного океана; ках девах — какой лила-пуруша; муда — с радостью (с блаженством); нритьяти — танцует</w:t>
       </w:r>
     </w:p>
     <w:p>
@@ -24359,15 +23553,6 @@
         </w:rPr>
         <w:t>Ах! Какой это играющий в лилах Пуруша, сияющий золотом, как луна, в чарующих шафрановых одеждах, свисающих с прекрасного стана, танцует в цветущем саду на берегу солёного океана, звуком ударов своих стоп заставляя звенеть десять сторон света, каплями слёз превращая землю в грязь и раскатами громкого смеха делая белым небосвод?</w:t>
       </w:r>
-      <w:r>
-        <w:br/>
-      </w:r>
-      <w:r>
-        <w:rPr>
-          <w:sz w:val="20"/>
-        </w:rPr>
-        <w:t>Из пословного толкования: «удары стоп» — притопывание в танце; «в радости» — он танцует с блаженством.</w:t>
-      </w:r>
     </w:p>
     <w:p>
       <w:pPr>
@@ -24481,10 +23666,10 @@
           <w:b w:val="0"/>
           <w:i/>
         </w:rPr>
-        <w:t>Пословно:</w:t>
-      </w:r>
-      <w:r>
-        <w:t xml:space="preserve"> сарваих — всеми; амнайа-чуда-манибхих — венцами-самоцветами Вед (упанишадами); апи — даже; на самлакшьяте — не постигается; ят-сварупам — чья сущность; шри-иша-брахма-ади-агамья — недоступный Лакшми, Шиве, Брахме и другим (по B — основателям четырёх сампрадай); сумадхура-падави — сладчайший путь; капи — некий, неописуемый; ясья — чей; ати-рамья — весьма прекрасный (легко доступный его преданным); йена — кем; акасмат — внезапно; джагат — мир; шри-хари-раса-мадира-маттам — опьянённым вином расы Шри (Радхи) и Хари; этат — этот; вьядхайи — сделан; шримач-чайтанья-чандрах — Шри Чайтанья-Луна; сах — тот; ким у — разве; мама — моих; гирам — слов; гочарах — доступен; четасах — ума; ва — или</w:t>
+        <w:t>Пословно (анвайя Бхактисиддханты):</w:t>
+      </w:r>
+      <w:r>
+        <w:t xml:space="preserve"> сарваих амная-чудаманибхих апи — даже всеми драгоценными венцами шрути, то есть Упанишадами — вершиной Вед; ят-сварупам — чья сущность; на самлакшьяте — не может быть в полноте познана; яся — чей; капи — никогда прежде не дарованный; сумадхура-падави — крайне вкусный путь, то есть путь наставлений; шри-иша-брахма-ади-агамья — («Шри» — Лакшми, коренной гуру [Шри-]сампрадаи, почитаемая Шри Рамануджачарьей, учителем вишишта-адвайты; «Иша» — Рудра, почитаемый Шри Вишнусвами, учителем шуддха-адвайты; «Брахма» — коренной гуру Брахма-сампрадаи, почитаемый Шриман Мадхвачарьей, учителем шуддха-двайты; «и прочие» — Санака, Санандана и другие, коренные гуру Чатухсана-сампрадаи, почитаемые Нимбадитьей; недоступный даже им, то есть путь, на который не смогли вступить даже они); [атха ча — и всё же]; ати-рамья — легко проходимый, то есть весьма доступный преданным Гауры; йена — тем Гаурасундарой; акасмат — неожиданно; этат джагат — этот мир; шри-хари-раса-мадира-маттам вьядхайи — («Шри» — Шримати Радхика, воплощение всех Лакшми, «Хари» — Кришна; опьянён вином расы премы Шри Шри Радхи-Кришны); сах шримат чайтанья-чандрах — этот Шри Чайтанья-чандра; мама гирам четасах ва — моих речей и ума; гочарах киму [сьят] — станет ли доступен?</w:t>
       </w:r>
     </w:p>
     <w:p>
@@ -24544,15 +23729,6 @@
         </w:rPr>
         <w:t>Тот, чью сущность не могут в полноте указать даже Упанишады — драгоценное ожерелье на венце всех шрути; тот, чей никогда прежде не дарованный, крайне вкусный путь трудно постичь даже Шри, Брахме, Рудре и другим, — то есть пути возвышенной уджвала-премы не знают не то что основатели сампрадай Шри, Брахмы, Рудры и Санаки, но даже их коренные гуру, — но который весьма легко [пройти] тем, кто получил его милостивый взгляд, то есть который весьма доступен преданным Гауры; тот, кто внезапно опьянил этот мир вином расы премы Шри Радхи и Кришны, — разве этот Чайтанья-чандра, источающий высшую красоту, станет доступен моим словам и уму?</w:t>
       </w:r>
-      <w:r>
-        <w:br/>
-      </w:r>
-      <w:r>
-        <w:rPr>
-          <w:sz w:val="20"/>
-        </w:rPr>
-        <w:t>Из пословного толкования: «Шри» — Лакшми, коренной гуру [Шри-]сампрадаи, почитаемая Шри Рамануджачарьей, учителем вишишта-адвайты; «Иша» — Рудра, почитаемый Шри Вишнусвами, учителем шуддха-адвайты; «Брахма» — коренной гуру Брахма-сампрадаи, почитаемый Шриман Мадхвачарьей, учителем шуддха-двайты; «и прочие» — Санака, Санандана и другие, коренные гуру Чатухсана-сампрадаи, почитаемые Нимбадитьей; «Шри-Хари»: «Шри» — Шримати Радхика, воплощение всех Лакшми, «Хари» — Кришна.</w:t>
-      </w:r>
     </w:p>
     <w:p>
       <w:pPr>
@@ -24658,10 +23834,10 @@
           <w:b w:val="0"/>
           <w:i/>
         </w:rPr>
-        <w:t>Пословно:</w:t>
-      </w:r>
-      <w:r>
-        <w:t xml:space="preserve"> джадьям — косность; кармасу — в обрядах; кутрачит — где-то; джапа-тапо-йога-адикам — джапа, подвижничество, йога и прочее; кутрачит — где-то; говинда-арчана-викрийах — обрядовое поклонение Говинде (по B — поклонение по правилам арчаны); квачит апи — где-то; джняна-абхиманах — гордость знанием; квачит — где-то; шри-бхактих — святая бхакти; квачит — где-то; удджвала — сияющая; апи ча — хоть и; харех — Хари; ван-матре — лишь на словах; эва — только; стхита — осталась; ха — ах; чайтанья — Чайтанья; кутах — куда; гатах аси — ты ушёл; падави — путь; кутра апи — нигде; те — твой; на икшьяте — не виден</w:t>
+        <w:t>Пословно (анвайя Бхактисиддханты):</w:t>
+      </w:r>
+      <w:r>
+        <w:t xml:space="preserve"> ха чайтанья — о Шри Чайтанья!; кутах гатах аси — куда ты ушёл?; те падави — твой (чистый, сокровенный путь бхакти возвышенной уджвала-расы); кутрапи — ни в одной сампрадае; на икшьяте — не виден; кутрачит — в одной сампрадае; кармасу джадьям — косность кармы; кутрачит джапа-тапо-йога-адикам — в другой сампрадае — аскеза, джапа, йога и прочее; квачит апи говинда-арчана-викриях — в иной — правила поклонения Говинде на пути арчаны; квачит гьяна-абхиманах — в иной — бхакти, смешанная со знанием; квачит ча — и где-то; харех — Шри Хари; уджвала апи шри-бхактих — даже уджвала-бхакти; ваг-матре эва стхита — пребывает лишь на словах, то есть никто не исполняет бхакти на деле</w:t>
       </w:r>
     </w:p>
     <w:p>
@@ -24721,15 +23897,6 @@
         </w:rPr>
         <w:t>О Шри Чайтанья! Куда ты ушёл! Твой чистый, сокровенный путь бхакти возвышенной уджвала-расы больше не виден ни в одной сампрадае. В одной сампрадае — косность кармы, в другой — аскеза, джапа, йога и прочее, в третьей — правила поклонения Говинде на пути арчаны, в четвёртой — бхакти, смешанная со знанием, а где-то и уджвала-бхакти пребывает лишь на словах, без практики.</w:t>
       </w:r>
-      <w:r>
-        <w:br/>
-      </w:r>
-      <w:r>
-        <w:rPr>
-          <w:sz w:val="20"/>
-        </w:rPr>
-        <w:t>Из пословного толкования: то есть никто не исполняет бхакти на деле.</w:t>
-      </w:r>
     </w:p>
     <w:p>
       <w:pPr>
@@ -24835,10 +24002,10 @@
           <w:b w:val="0"/>
           <w:i/>
         </w:rPr>
-        <w:t>Пословно:</w:t>
-      </w:r>
-      <w:r>
-        <w:t xml:space="preserve"> абхивьяктах — явленный; ятра — когда; друта-канака-гаурах — золотой, как расплавленное золото; харих — Хари; абхут — стал; махимна — величием; тасья эва — его же; пранайа-раса-магнам — погружённым в расу любви; джагат — мир; абхут — стал; абхут — была; уччаир уччаих — громко-громко; тумула-хари-санкиртана-видхих — гремящая санкиртана Хари; сах — то; калах — время; ким — разве; бхуях апи — снова; ахаха — ах!; паривартета — вернётся; мадхурах — сладкое</w:t>
+        <w:t>Пословно (анвайя Бхактисиддханты):</w:t>
+      </w:r>
+      <w:r>
+        <w:t xml:space="preserve"> ятра — в то время, когда; друта-канака-гаурах харих — Шри Гаурахари, золотистый, как расплавленное золото; абхивьяктах абхут — стал зрим в этом мире; [тада — тогда]; тасья эва махимна — его же величием; джагат — земля; пранайа-раса-магнам абхут — погрузилась в расу премы; [ча] уччаих уччаих тумула-хари-санкиртана-видхих — громко звучащий бурный Кришна-санкиртан; абхут — возник; ахаха — увы!; сах мадхурах калах — то сладостное время; апи ким бхуях паривартета — вернётся ли снова?</w:t>
       </w:r>
     </w:p>
     <w:p>
@@ -25003,10 +24170,10 @@
           <w:b w:val="0"/>
           <w:i/>
         </w:rPr>
-        <w:t>Пословно:</w:t>
-      </w:r>
-      <w:r>
-        <w:t xml:space="preserve"> са эва иям — та же самая; бхуви — на земле; дханья-гауда-нагари — благословенная столица Гауды; вела — берег; апи — и; са эва — тот же; амбудхех — океана; со 'ям — тот же; шри-пурушоттамах — Шри Пурушоттама (Джаганнатха); мадхупатех — Мадхупати (Кришны); тани эва — те же; намани — имена; ту — же; но — не; кутра апи — нигде; нирикшьяте — видится; хари хари — увы (Хари, Хари!); према-утсавах — праздник любви; тадришах — такой; ха — ах; чайтанья — Чайтанья; крипа-нидхана — сокровищница милости; тава — твоё; ким — разве; викшье — увижу; пунах — снова; вайбхавам — величие</w:t>
+        <w:t>Пословно (анвайя Бхактисиддханты):</w:t>
+      </w:r>
+      <w:r>
+        <w:t xml:space="preserve"> бхуви — на земле; са эва иям дханья-гауда-нагари — тот же этот благословенный град Гауда; са эва амбудхех вела апи — тот же берег океана с садами и рощами; сах аям шри-пурушоттамах — тот же Шри Пурушоттама — Шри Джаганнатхадева; мадхупатех — Шри Кришны; тани эва намани ту — те же имена «Харе Кришна» и прочие; [вартате — существуют]; хари хари — Хари! Хари! (возглас скорби); кутрапи — нигде; тадришах према-утсавах — того праздника блаженства премы; но нирикшьяте — не видно; ха чайтанья [ха] крипа-нидхана — о Чайтанья! о сокровищница милости!; тава вайбхавам — твоё великолепие; пунах ким викшье — увижу ли вновь?</w:t>
       </w:r>
     </w:p>
     <w:p>
@@ -25066,15 +24233,6 @@
         </w:rPr>
         <w:t>На земле — тот же благословенный град Гауда, тот же берег океана с садами и рощами, тот же Шри Пурушоттама, существуют и те же имена Шри Кришны — «Харе Кришна» и другие. Хари! Хари! Но нигде не видно того праздника блаженства премы. О Чайтанья, о сокровищница милости, узрят ли вновь мои глаза твоё великолепие?</w:t>
       </w:r>
-      <w:r>
-        <w:br/>
-      </w:r>
-      <w:r>
-        <w:rPr>
-          <w:sz w:val="20"/>
-        </w:rPr>
-        <w:t>Из пословного толкования: Шри Пурушоттама — Шри Джаганнатхадева; «Хари! Хари!» — возглас скорби.</w:t>
-      </w:r>
     </w:p>
     <w:p>
       <w:pPr>
@@ -25180,10 +24338,10 @@
           <w:b w:val="0"/>
           <w:i/>
         </w:rPr>
-        <w:t>Пословно:</w:t>
-      </w:r>
-      <w:r>
-        <w:t xml:space="preserve"> яди — если; нигадита-мина-ади-амша-ват — подобен упомянутым [в шрути] частичным воплощениям — Рыбе и прочим; гаура-чандрах — Гаурачандра; на тат — [он] не то; апи — же; сах — то (частичное воплощение); хи — ведь; каш-чит — некое [лишь]; шакти-лила-викашах — проявление [отдельной] силы и игры; атула-сакала-шакти-ашчарья-лила-пракашаих — явлением дивных игр со всеми несравненными силами; анадхигата-махаттвах — чьё величие непостижимо; пурнах — полный; эва — именно; аватирнах — нисшёл</w:t>
+        <w:t>Пословно (анвайя Бхактисиддханты):</w:t>
+      </w:r>
+      <w:r>
+        <w:t xml:space="preserve"> гаурачандрах нигадита-мина-ади-амшават яди апи [сьят] — если скажешь, что Гаурачандра подобен частичным аватарам — Рыбе, Вепрю и прочим, о которых говорят шрути; тат на хи — он, несомненно, не таков; сах — те (частичные аватары — Матсья и прочие); кашчит шакти-лила-викашах — проявление некой особой силы и лилы; [аям гаурачандрах — этот Гаурачандра]; анадхигата-махаттвах — тот, чьё величие непознанно; атула-сакала-шакти-ашчарья-лила-пракашаих — (атула — несравненный; явлением чудесных лил, наделённых всеми силами); пурнах эва — несомненно в полноте; аватирнах — нисшёл</w:t>
       </w:r>
     </w:p>
     <w:p>
@@ -25308,10 +24466,10 @@
           <w:b w:val="0"/>
           <w:i/>
         </w:rPr>
-        <w:t>Пословно:</w:t>
-      </w:r>
-      <w:r>
-        <w:t xml:space="preserve"> брахма-иша-ади-маха-ашчарья-махима — чьё величие дивнее, чем у Изначального [Нараяны] — источника Брахмы и Шивы (по B; также: превосходящее Брахму, Шиву и прочих); апи — хотя; махапрабхух — Махапрабху; мугдха-бала-удитам — лепет несмышлёного ребёнка; шрутва — услышав; снигдхах — ласков; авашьям — непременно; бхавишьяти — будет</w:t>
+        <w:t>Пословно (анвайя Бхактисиддханты):</w:t>
+      </w:r>
+      <w:r>
+        <w:t xml:space="preserve"> брахма-иша-ади-маха-ашчарья-махима апи — тот, чьё могущество, не имеющее ни равного, ни высшего, чудеснее даже, чем у Шри Нараяны — изначального [источника] Брахмы и Махешвары; махапрабхух — Шриман Махапрабху; мугдха-бала-удитам — речи, подобающие глупому ребёнку; шрутва — услышав; авашьям — непременно; снигдхах бхавишьяти — станет ласков, то есть по милости одарит меня нежной любовью</w:t>
       </w:r>
     </w:p>
     <w:p>
@@ -25476,10 +24634,10 @@
           <w:b w:val="0"/>
           <w:i/>
         </w:rPr>
-        <w:t>Пословно:</w:t>
-      </w:r>
-      <w:r>
-        <w:t xml:space="preserve"> дриштам — видены; на — не; шастрам — шастры; гуравах — гуру; на — не; дриштах — видены; вивечитам — обсуждено; на апи — и не; будхаих — с мудрыми; су-буддхья — здравым разумом; ятха татха — как бы то ни было; джалпату — пусть лепечет [моя речь]; бала-бхават — по-детски; татха эва — всё равно; ме — ко мне; гаура-харих — Гаура-Хари; прасидату — пусть будет милостив</w:t>
+        <w:t>Пословно (анвайя Бхактисиддханты):</w:t>
+      </w:r>
+      <w:r>
+        <w:t xml:space="preserve"> [мая — мною]; шастрам на дриштам — шастры не видены (не изучены); гуравах — наставники многих сампрадай; на дриштах — не видены, то есть я не принимал от них наставлений; [су]буддхья — […] разумом; будхаих апи — даже с пандитами, знатоками шастр; на вивечитам — не обсуждалось; [татхапи шри-гаурахари-вишаяртха мама вани — и всё же мои слова о Гаурахари]; бала-бхават — по детскости (в анувада — по глупости); ятха татха [ва] джалпату — пусть говорят что угодно (как бы ни описывали); гаурахарих — Гаурасундара; татха эва — тем же самым; ме прасидату — да будет доволен мною</w:t>
       </w:r>
     </w:p>
     <w:p>
@@ -25538,15 +24696,6 @@
           <w:sz w:val="20"/>
         </w:rPr>
         <w:t>Я не видел [шастр], не получил наставлений и от многих наставников, не вёл бесед о шастрах с пандитами-знатоками шастр; и всё же как бы ни описывали Гаурахари мои слова, сказанные по глупости, пусть Шри Гаурахари будет мною доволен.</w:t>
-      </w:r>
-      <w:r>
-        <w:br/>
-      </w:r>
-      <w:r>
-        <w:rPr>
-          <w:sz w:val="20"/>
-        </w:rPr>
-        <w:t>Из пословного толкования: «гуру» — наставники многих сампрадай.</w:t>
       </w:r>
     </w:p>
     <w:p>

</xml_diff>

<commit_message>
Chaitanya-chandramrita: align 17 verses with Bhaktisiddhanta's interpretation
Co-Authored-By: Claude Opus 5.5 <noreply@anthropic.com>
Claude-Session: https://claude.ai/code/session_01KGC2T1PiSRGJe48WTtGST9
</commit_message>
<xml_diff>
--- a/chaitanya-chandramrita/Chaitanya-Chandramrita-ru-full.docx
+++ b/chaitanya-chandramrita/Chaitanya-Chandramrita-ru-full.docx
@@ -1493,7 +1493,7 @@
         <w:t>2.</w:t>
       </w:r>
       <w:r>
-        <w:t xml:space="preserve"> Человек, ни разу не коснувшийся дхармы, всегда погружённый в беззаконие, ни разу не попавший на глаза святым и нигде не бывший среди них, — опьянённый вкусом нектара Хари-расы, который даровал этот Господь, он пляшет, громко поёт и катается по земле. Славлю этого неописуемого Владыку.</w:t>
+        <w:t xml:space="preserve"> Человек, ни разу не коснувшийся дхармы, всегда погружённый в беззаконие, ни разу не попавший на глаза святым и нигде не бывший среди них, — опьянённый вкусом нектара Шри-Хари-расы — любовной расы Радхи и Кришны, — который даровал этот Господь, он пляшет, громко поёт и катается по земле. Славлю этого неописуемого Владыку.</w:t>
       </w:r>
     </w:p>
     <w:p>
@@ -2333,7 +2333,7 @@
         <w:t>7.</w:t>
       </w:r>
       <w:r>
-        <w:t xml:space="preserve"> Что особенного в том, что был истреблён род ракшасов и дайтьев? Что особенного в том, что был явлен путь йоги и прочих практик? Что особенного в сотворении мира и прочем, в спасении земли и прочем? Мы славим лишь облик Господа — Чайтанью, проложившего путь великой бхакти, сияющей любовью.</w:t>
+        <w:t xml:space="preserve"> Что особенного в том, что был истреблён род ракшасов и дайтьев? Что особенного в том, что был явлен путь йоги и прочих практик? Что особенного в сотворении мира и прочем, в спасении земли и прочем? Мы славим лишь облик Чайтаньи, явивший путь высшей бхакти к Бхагавану, сияющей премой.</w:t>
       </w:r>
     </w:p>
     <w:p>
@@ -3908,7 +3908,7 @@
         <w:t>16.</w:t>
       </w:r>
       <w:r>
-        <w:t xml:space="preserve"> Чтобы считать имена «Харе Кришна», несущие благо его миру, он, повторяя их, завязывает узелки на поясном шнуре рукой, дрожащей от избытка любви; лицо его омыто слезами; он ходит туда и обратно, желая увидеть самого себя — Джаганнатху</w:t>
+        <w:t xml:space="preserve"> Чтобы считать свои имена «Харе Кришна» — благо всего мира, он, повторяя их, завязывает узелки на поясном шнуре рукой, дрожащей от избытка любви; лицо его омыто слезами; он ходит туда и обратно, желая увидеть самого себя — Джаганнатху</w:t>
       </w:r>
       <w:r>
         <w:rPr>
@@ -4985,7 +4985,7 @@
         <w:t>22.</w:t>
       </w:r>
       <w:r>
-        <w:t xml:space="preserve"> Можно исполнять дхарму, служить Вишну, обходить святые места, изучать Веды, — но без служения стопам любимцев Гауры не познать той ступени, что недоступна даже Ведам.</w:t>
+        <w:t xml:space="preserve"> Можно исполнять дхарму, служить Вишну, обходить святые места, изучать Веды, — но без служения стопам любимцев Гауры не познать обители, труднодостижимой даже через Веды, — Вриндавана, подножия Шри Радха-Говинды.</w:t>
       </w:r>
     </w:p>
     <w:p>
@@ -5153,7 +5153,7 @@
         <w:t>23.</w:t>
       </w:r>
       <w:r>
-        <w:t xml:space="preserve"> Если бы, долго пахтая безбрежный океан нектара, удалось добыть некую высшую, несравненную суть, — даже она покажется горькой и резкой тем, кого коснулся свет стоп Мадана-Гопалы в облике Шри Гауры.</w:t>
+        <w:t xml:space="preserve"> Если бы, долго пахтая безбрежный океан нектара, удалось добыть некую высшую, несравненную суть, — даже она покажется горькой и резкой тем, кого коснулся свет стоп Мадана-Гопалы, ставшего золотым от сияния Шри Радхи.</w:t>
       </w:r>
     </w:p>
     <w:p>
@@ -5321,7 +5321,7 @@
         <w:t>24.</w:t>
       </w:r>
       <w:r>
-        <w:t xml:space="preserve"> Смирение ниже травы, от природы кроткий и чистый облик, речь, сладкая, как нектар, отвращение даже к запаху чувственных предметов, ум, ни на что не опирающийся, неописуемо охваченный любовью к Хари, — вот какие благие качества бывают в мире у тех, кто предан Гауре.</w:t>
+        <w:t xml:space="preserve"> Смирение ниже травы, от природы кроткий и чистый облик, речь, сладкая, как нектар, отвращение даже к запаху чувственных предметов, ум, ни на что не опирающийся, неописуемо охваченный любовью к Хари, — такие благие качества бывают в мире только у преданных Гауры.</w:t>
       </w:r>
     </w:p>
     <w:p>
@@ -5657,7 +5657,7 @@
         <w:t>26.</w:t>
       </w:r>
       <w:r>
-        <w:t xml:space="preserve"> Пусть будут миллионы видов отречения, миллионы видов сдержанности, самообуздания, терпения, дружелюбия и прочего, миллионы созерцаний истины и даже миллионы вайшнавских бхакти — всё это не сравнится и с миллионной долей тех качеств, что сами собой пребывают в тех, кто наслаждается благоуханием сияния ногтей на любимых стопах Шри Чайтаньи-Луны.</w:t>
+        <w:t xml:space="preserve"> Пусть будут миллионы видов отречения, миллионы видов сдержанности, самообуздания, терпения, дружелюбия и прочего, миллионы созерцаний истины и даже миллионы вайшнавских бхакти — всё это не сравнится и с миллионной долей тех качеств, что сами собой пребывают в тех, кто наслаждается благоуханием сияния ногтей на стопах дорогих преданных Шри Чайтаньи-Луны.</w:t>
       </w:r>
     </w:p>
     <w:p>
@@ -6284,7 +6284,7 @@
         <w:t>29.</w:t>
       </w:r>
       <w:r>
-        <w:t xml:space="preserve"> О, какое великое счастье проявило себя здесь, сделав видимым глазу сына Шачи — того, кого ищут венцы всего множества Вед! Он изгоняет гордыню владык богов и мудрецов, которые мнят себя великими и не знают его лотосных стоп.</w:t>
+        <w:t xml:space="preserve"> О, кто же этот великий счастливец в мире, что сделал зримым даже для такого, как я, сына Шачи — того, кого ищут венцы всего множества Вед! Он изгоняет гордыню владык богов и мудрецов, которые мнят себя великими и не знают его лотосных стоп.</w:t>
       </w:r>
     </w:p>
     <w:p>
@@ -6708,7 +6708,7 @@
         <w:t>32.</w:t>
       </w:r>
       <w:r>
-        <w:t xml:space="preserve"> Позор, позор привязанным к обрядам, позор суровым подвижникам и аскетам-йогам! Позор тупицам, чьи лица расцветают от слов «я — Брахман»! Да и стоит ли нам горевать о двуногих животных, опьянённых вкусом чувственных удовольствий? Увы, никому из них не досталось и капли мёда Гауры.</w:t>
+        <w:t xml:space="preserve"> Позор, позор привязанным к обрядам, а потому тупоумным, позор суровым подвижникам и аскетам-йогам! Позор тем, чьи лица расцветают от одних слов «я — Брахман»! Да и стоит ли нам горевать о двуногих животных, опьянённых вкусом чувственных удовольствий? Увы, никому из них не досталось и капли мёда Гауры.</w:t>
       </w:r>
     </w:p>
     <w:p>
@@ -7004,7 +7004,7 @@
         <w:t>34.</w:t>
       </w:r>
       <w:r>
-        <w:t xml:space="preserve"> Когда снизошёл Гаурачандра и разлился океан любви, полный ярко сияющих самоцветов, — кто остался бедным, тот поистине бедняк.</w:t>
+        <w:t xml:space="preserve"> Когда снизошёл Гаурачандра и разлился океан любви, а его самоцветы (девять видов бхакти и прочее) засияли, озарённые им, — кто остался бедным, тот поистине бедняк.</w:t>
       </w:r>
     </w:p>
     <w:p>
@@ -10799,7 +10799,7 @@
         <w:t>58.</w:t>
       </w:r>
       <w:r>
-        <w:t xml:space="preserve"> Если кто-то через бхакти к Мурари — слушание, размышление, воспевание и прочее — достигает высшей цели человека, — благо ему. А мне достойна поклонения неописуемая тайна расы того, чья обитель — Гаура</w:t>
+        <w:t xml:space="preserve"> Если кто-то через бхакти к Мурари — слушание, размышление, воспевание и прочее — достигает высшей цели человека, — благо ему. А мне достойна поклонения неописуемая тайна расы Хари, облечённого золотым сиянием</w:t>
       </w:r>
       <w:r>
         <w:rPr>
@@ -10810,7 +10810,7 @@
         <w:t>1</w:t>
       </w:r>
       <w:r>
-        <w:t>, океана нектара высшей любви, не знающего берегов.</w:t>
+        <w:t>, — океана нектара высшей любви, не знающего берегов.</w:t>
       </w:r>
     </w:p>
     <w:p>
@@ -12282,7 +12282,7 @@
         <w:t>67.</w:t>
       </w:r>
       <w:r>
-        <w:t xml:space="preserve"> «Чайтанья! Милостивый! Высший щедрец! Ты, наполнивший сердца всех существ любовью разных видов! Обитель чудес! Гауранга! Океан достоинств! Воплощение расы! Ты, любящий свои имена!» — молю, чтобы так, неустанно повторяя, я провёл эту жизнь.</w:t>
+        <w:t xml:space="preserve"> «Чайтанья! Милостивый! Высший щедрец! Ты, наполнивший сердца всех существ любовью разных видов! Ты, чьё дивное сияние — как раскалённое золото! Гауранга! Океан достоинств! Воплощение расы! Ты, любящий свои имена!» — молю, чтобы так, неустанно повторяя, я провёл эту жизнь.</w:t>
       </w:r>
     </w:p>
     <w:p>
@@ -16213,7 +16213,7 @@
         <w:t>91.</w:t>
       </w:r>
       <w:r>
-        <w:t xml:space="preserve"> Поклоняйтесь лотосным стопам Чайтаньи, исполнитесь расой истинной бхакти и радуйте три мира разнообразной сладостью, удачей, состраданием, терпением и прочим.</w:t>
+        <w:t xml:space="preserve"> Поклоняйтесь лотосным стопам Чайтаньи, исполнитесь расой истинной бхакти и радуйте три мира разнообразной сладостью, высочайшим вкушением премы, состраданием, терпением и прочим.</w:t>
       </w:r>
     </w:p>
     <w:p>
@@ -16645,7 +16645,7 @@
         <w:t>94.</w:t>
       </w:r>
       <w:r>
-        <w:t xml:space="preserve"> Если этот мир не поклоняется Чайтанье — Владыке, которому поклоняются лучшие из богов, — он лишён сознания (а-чайтанья), и всюду его ждёт смерть.</w:t>
+        <w:t xml:space="preserve"> Этот мир, лишённый сознания (а-чайтанья, то есть лишённый бхакти к Кришне), если не поклоняется Чайтанье — Владыке, которому поклоняются лучшие из богов, — всюду обретает смерть.</w:t>
       </w:r>
     </w:p>
     <w:p>
@@ -17313,7 +17313,7 @@
         <w:rPr>
           <w:sz w:val="18"/>
         </w:rPr>
-        <w:t xml:space="preserve"> — «того, чья обитель (или сияние) — Гаура», т. е. Кришны в облике Гауры.</w:t>
+        <w:t xml:space="preserve"> — по Бхактисиддханте, «обладающего золотым сиянием (гаура-канти)», т. е. Шри Хари в облике Гауры; буквально возможно и «того, чья обитель — Гаура».</w:t>
       </w:r>
     </w:p>
     <w:p>
@@ -18493,7 +18493,7 @@
         <w:t>105.</w:t>
       </w:r>
       <w:r>
-        <w:t xml:space="preserve"> Криками оглашая все стороны света, волнами раскатистого смеха делая небо белым, словно от распустившихся жасминов и кувшинок, всем телом дрожа, как листья ашваттхи на ветру, опьянённый, с поступью, захлёстнутой хмелем расы любви, — сияет Гаура-Хари.</w:t>
+        <w:t xml:space="preserve"> Криками оглашая все стороны света, волнами раскатистого смеха делая небо белым, словно от распустившихся жасминов и кувшинок, всем телом дрожа, как листья ашваттхи на ветру, опьянённый расой любви, танцуя с высокими прыжками, — сияет Гаура-Хари.</w:t>
       </w:r>
     </w:p>
     <w:p>
@@ -21189,7 +21189,7 @@
         <w:t>121.</w:t>
       </w:r>
       <w:r>
-        <w:t xml:space="preserve"> Высший смысл «Шримад-Бхагаватам», который Шри Вайясаки (Шука) запечатлел даже в рассказе о раса — так, что трудно уловить связь; то, что есть единственное истинное вместилище вкуса расы галантного героя игр любви Радхи, — чтобы распространить это сокровище, Хари нисшёл в мир в облике Гауры.</w:t>
+        <w:t xml:space="preserve"> Высший смысл «Шримад-Бхагаватам», который Шри Вайясаки (Шука) даже в рассказе о раса лишь наметил, не раскрыв, ибо его трудно постичь; то, что есть единственное истинное вместилище вкуса расы галантного героя игр любви Радхи, — чтобы распространить это сокровище, Хари нисшёл в мир в облике Гауры.</w:t>
       </w:r>
     </w:p>
     <w:p>
@@ -23685,7 +23685,7 @@
         <w:t>136.</w:t>
       </w:r>
       <w:r>
-        <w:t xml:space="preserve"> Его природу не могут разглядеть даже венцы всех Вед; неописуемо прекрасен его сладчайший путь, недоступный даже Лакшми, Шиве, Брахме и другим; он внезапно опьянил этот мир вином расы Шри Радхи и Хари, — разве этот Шри Чайтанья-Луна доступен моим словам или уму?</w:t>
+        <w:t xml:space="preserve"> Его природу не могут разглядеть даже венцы всех Вед; его сладчайший путь, недоступный даже Лакшми, Шиве, Брахме и другим, всё же неописуемо прекрасен и легко доступен тем, на кого упал его милостивый взгляд; он внезапно опьянил этот мир вином расы Шри Радхи и Хари, — разве этот Шри Чайтанья-Луна доступен моим словам или уму?</w:t>
       </w:r>
     </w:p>
     <w:p>

</xml_diff>

<commit_message>
Chaitanya-chandramrita: English book built (en, en-full), build.py ru|en, README, review/en-pass; RU rebuilt (131)
Co-Authored-By: Claude Opus 5.5 <noreply@anthropic.com>
Claude-Session: https://claude.ai/code/session_01KGC2T1PiSRGJe48WTtGST9
</commit_message>
<xml_diff>
--- a/chaitanya-chandramrita/Chaitanya-Chandramrita-ru-full.docx
+++ b/chaitanya-chandramrita/Chaitanya-Chandramrita-ru-full.docx
@@ -22837,7 +22837,18 @@
         <w:t>131.</w:t>
       </w:r>
       <w:r>
-        <w:t xml:space="preserve"> Кто этот лучший из галантных героев — Гаура? Его бёдра украшены шёлковой тканью, на руке браслет, на груди ожерелье, в ушах серьги, на ногах ножные колокольчики; он поднял и связал пышные кудри, увенчав их гирляндой из распустившегося жасмина, — он играет, танцуя под свои же имена.</w:t>
+        <w:t xml:space="preserve"> Кто этот Гаура — лучший из нагар, венец знатоков расы?</w:t>
+      </w:r>
+      <w:r>
+        <w:rPr>
+          <w:b w:val="0"/>
+          <w:i w:val="0"/>
+          <w:vertAlign w:val="superscript"/>
+        </w:rPr>
+        <w:t>2</w:t>
+      </w:r>
+      <w:r>
+        <w:t xml:space="preserve"> Его бёдра украшены шёлковой тканью, на руке браслет, на груди ожерелье, в ушах серьги, на ногах ножные колокольчики; он поднял и связал пышные кудри, увенчав их гирляндой из распустившегося жасмина, — он играет, танцуя под свои же имена.</w:t>
       </w:r>
     </w:p>
     <w:p>
@@ -24755,6 +24766,40 @@
           <w:sz w:val="18"/>
         </w:rPr>
         <w:t xml:space="preserve"> «Адвайтисты» — знатоки недвойственности (адвайта-веданты); так толкует это слово и Бхактисиддханта.</w:t>
+      </w:r>
+    </w:p>
+    <w:p>
+      <w:pPr>
+        <w:spacing w:after="60"/>
+        <w:ind w:left="283"/>
+      </w:pPr>
+      <w:r>
+        <w:rPr>
+          <w:b/>
+          <w:i w:val="0"/>
+          <w:sz w:val="18"/>
+        </w:rPr>
+        <w:t>2.</w:t>
+      </w:r>
+      <w:r>
+        <w:rPr>
+          <w:sz w:val="18"/>
+        </w:rPr>
+        <w:t xml:space="preserve"> </w:t>
+      </w:r>
+      <w:r>
+        <w:rPr>
+          <w:b w:val="0"/>
+          <w:i/>
+          <w:sz w:val="18"/>
+        </w:rPr>
+        <w:t>Нагара-вара</w:t>
+      </w:r>
+      <w:r>
+        <w:rPr>
+          <w:sz w:val="18"/>
+        </w:rPr>
+        <w:t xml:space="preserve"> — по Бхактисиддханте, «венец высших знатоков расы»: Гаура — сам Кришна, разыгрывающий лилу на стороне ашраи (вкушающий чувства Радхи). Это не мирское «галантный герой» и не учение гаура-нагари, которое Бхактисиддханта отвергал.</w:t>
       </w:r>
     </w:p>
     <w:sectPr>

</xml_diff>

<commit_message>
Chaitanya-chandramrita: EN-full with Gaudiya-bhashya, anvaya and preface; RU-full rebuilt with RU fixes; README, PLAN p.10
Co-Authored-By: Claude Opus 5.5 <noreply@anthropic.com>
Claude-Session: https://claude.ai/code/session_01KGC2T1PiSRGJe48WTtGST9
</commit_message>
<xml_diff>
--- a/chaitanya-chandramrita/Chaitanya-Chandramrita-ru-full.docx
+++ b/chaitanya-chandramrita/Chaitanya-Chandramrita-ru-full.docx
@@ -408,7 +408,7 @@
           <w:b w:val="0"/>
           <w:i/>
         </w:rPr>
-        <w:t>«Шри Шри Чайтанья-чандрамритам» и «Шри Шри Навадвипа-шатакам», сочинения венца трищанди-госвами, странствующего ачарьи, лучшего из спутников Гауры Шрилы Прабодхананды Сарасвати Госвамипады, — с «Гаудия-бхашьей» и бенгальским переводом Бхактисиддханты Сарасвати, отвергающими все ложные выводы. Издал Шри Атиндранатха Девашарма Бандьопадхьяя, Гаудия Матх (1, Ультадинги Джанкшн-роуд, Калькутта). Первое издание; подаяние — полторы рупии. Отпечатано Анантой Васудевой Брахмачари, B.A., в типографии Gaudiya Printing Works (243/2, Аппер-Серкьюлар-роуд, Калькутта).</w:t>
+        <w:t>«Шри Шри Чайтанья-чандрамритам» и «Шри Шри Навадвипа-шатакам», сочинения венца триданди-госвами, странствующего ачарьи, лучшего из спутников Гауры Шрилы Прабодхананды Сарасвати Госвамипады, — с «Гаудия-бхашьей» и бенгальским переводом Бхактисиддханты Сарасвати, отвергающими все ложные выводы. Издал Шри Атиндранатха Девашарма Бандьопадхьяя, Гаудия Матх (1, Ультадинги Джанкшн-роуд, Калькутта). Первое издание; подаяние — полторы рупии. Отпечатано Анантой Васудевой Брахмачари, B.A., в типографии Gaudiya Printing Works (243/2, Аппер-Серкьюлар-роуд, Калькутта).</w:t>
       </w:r>
     </w:p>
     <w:p>
@@ -8380,7 +8380,7 @@
         <w:t>Пословно (анвайя Бхактисиддханты):</w:t>
       </w:r>
       <w:r>
-        <w:t xml:space="preserve"> удджвалам кулам дхик — позор знатному роду (позор рождению в праведном роду, исполненном благочестивого поведения); вагмитам апи дхик — позор и красноречию (многословию); яшах [ча] дхик асту — позор славе, или почёту; адхьяянам дхик — позор изучению шрути и прочего; акритим навам ваях шриям [ча] дхик асту — позор красивому сложению рук, ног и прочих членов, полной юности (пурна-кайшоре), неистощимому богатству; двиджатвам апи дхик — позор и тому, чтобы, приняв предписанные таинства — упанаяну и прочие, — получить наставление в Гаятри и прочем; парам вималам ашрама-адьям ча дхик — позор и высшему, чистому брахмачарье и прочим ашрамам (словом «ади» указываются также [жертвоприношения] (OCR неясно), практика йоги, отречение и прочее, — позор и им); чет — если; калау — в век Кали; праката-гаура-гопипатих — явленный Гаура — возлюбленный гопи (возлюбленный гопи, воплощение сладости (мадхурьи) Кришна, который, приняв настроение и сияние «гауры», то есть золотой Шри Радхи, явился как воплощение расы випраламбхи); на паричитах [бхавет] — не почитаем (не становится предметом поклонения).</w:t>
+        <w:t xml:space="preserve"> удджвалам кулам дхик — позор знатному роду (позор рождению в праведном роду, исполненном благочестивого поведения); вагмитам апи дхик — позор и красноречию (многословию); яшах [ча] дхик асту — позор славе, или почёту; адхьяянам дхик — позор изучению шрути и прочего; акритим навам ваях шриям [ча] дхик асту — позор красивому сложению рук, ног и прочих членов, полной юности (пурна-кайшоре), неистощимому богатству; двиджатвам апи дхик — позор и тому, чтобы, приняв предписанные таинства — упанаяну и прочие, — получить наставление в Гаятри и прочем; парам вималам ашрама-адьям ча дхик — позор и высшему, чистому брахмачарье и прочим ашрамам (словом «ади» указываются также жертвоприношения (яга), практика йоги, отречение и прочее, — позор и им); чет — если; калау — в век Кали; праката-гаура-гопипатих — явленный Гаура — возлюбленный гопи (возлюбленный гопи, воплощение сладости (мадхурьи) Кришна, который, приняв настроение и сияние «гауры», то есть золотой Шри Радхи, явился как воплощение расы випраламбхи); на паричитах [бхавет] — не почитаем (не становится предметом поклонения).</w:t>
       </w:r>
     </w:p>
     <w:p>
@@ -9078,7 +9078,7 @@
         <w:rPr>
           <w:sz w:val="20"/>
         </w:rPr>
-        <w:t>Когда земля была осенена пыльцой с лотосных стоп Шри Гауры, кто только не обрёл «без практики» (без усилий) прему — венец всех целей человека? Но увы, увы, по своему крайнему злосчастью я не смог обрести и крупицы этой премы! Позор моей жизни, позор моей учёности, позор моему высшему ашраму — триданда-санньясе!</w:t>
+        <w:t>Когда земля была осенена пыльцой с лотосных стоп Шри Гауры, кто только не обрёл «без практики» (без усилий) прему — венец всех целей человека? Но увы, увы, по своему крайнему злосчастью я не смог обрести и крупицы этой премы! Позор моей жизни, позор моей учёности, позор моему четвёртому ашраму — триданда-санньясе!</w:t>
       </w:r>
     </w:p>
     <w:p>
@@ -15141,7 +15141,7 @@
         <w:t>Пословно (анвайя Бхактисиддханты):</w:t>
       </w:r>
       <w:r>
-        <w:t xml:space="preserve"> кармасу — в постоянных и периодических обрядах; вритхавешам — напрасную увлечённость; апанайата — отбросьте прочь; адхьятма-сараних — адхьятма — рассуждение «нети, нети» сторонников восходящего пути (ароха-вади), сарани — его путь; манак вартам апи — даже малейшего разговора; квачана — когда-либо; карнабхьярне апи — даже к окрестности ушей; на найата — не подпускайте; дехадау — в теле и прочем (слово «и прочее» означает […], страну, общество и все прочие вещи); мохам на бхаджата — не предавайтесь заблуждению; [тада — тогда]; парамашчарья-мадхурах — обладающий высочайшей, вызывающей изумление особой сладостью; пумартханам маулих — венец целей человека — пятая цель, према; бхаватам — вами; гаура-крипайа — по милости Гаурасундары; милати — будет обретён (настоящее время в значении близкого будущего)</w:t>
+        <w:t xml:space="preserve"> кармасу — в постоянных и периодических обрядах; вритхавешам — напрасную увлечённость; апанайата — отбросьте прочь; адхьятма-сараних — адхьятма — рассуждение «нети, нети» сторонников восходящего пути (ароха-вади), сарани — его путь; манак вартам апи — даже малейшего разговора; квачана — когда-либо; карнабхьярне апи — даже к окрестности ушей; на найата — не подпускайте; дехадау — в теле и прочем (слово «и прочее» означает дом, семью, страну, общество и все прочие вещи); мохам на бхаджата — не предавайтесь заблуждению; [тада — тогда]; парамашчарья-мадхурах — обладающий высочайшей, вызывающей изумление особой сладостью; пумартханам маулих — венец целей человека — пятая цель, према; бхаватам — вами; гаура-крипайа — по милости Гаурасундары; милати — будет обретён (настоящее время в значении близкого будущего)</w:t>
       </w:r>
     </w:p>
     <w:p>
@@ -18645,7 +18645,7 @@
         <w:t>Пословно (анвайя Бхактисиддханты):</w:t>
       </w:r>
       <w:r>
-        <w:t xml:space="preserve"> нирдошах — (без пятна, либо: тот, кому не нужна «доша» — ночь, тьма, то есть всегда сияющий); чару-нритьях — прекрасно танцующий; видхута-малината-вакра-бхавах — свободный от тусклости и кривизны; нихшеша-пранита-апатрая-харана-маха-према-пиюша-варши — проливающий нектар премы, чтобы устранить тройные страдания всех живых существ; бхактанам хрич-чакора-свадита-пада-ручих — (бхактанам — преданных; хрич-чакора — птицы-чакоры сердец; свадита — вкушаемая; пада — лучи; ручи — сладость; то есть тот, сладость лучей которого вкушают чакоры сердец преданных); ко 'пи гауранга-чандрах — некий неописуемый Пуруша Шри Гаурачандра; бхагья-удая-ручира-шачи-гарбха-дугдха-амбурашех — (бхагья-удая — восход удачи, ручира — прекраснейшая; из молочного океана лона Шачидеви); удбхутах — взошедший; [сан — будучи]; бхати — сияет</w:t>
+        <w:t xml:space="preserve"> нирдошах — (без пятна, либо: тот, кому не нужна «доша» — ночь, тьма, то есть всегда сияющий); чару-нритьях — прекрасно танцующий; видхута-малината-вакра-бхавах — свободный от тусклости и кривизны; нихшеша-прани-тапа-трая-харана-маха-према-пиюша-варши — проливающий нектар премы, чтобы устранить тройные страдания всех живых существ; бхактанам хрич-чакора-свадита-пада-ручих — (бхактанам — преданных; хрич-чакора — птицы-чакоры сердец; свадита — вкушаемая; пада — лучи; ручи — сладость; то есть тот, сладость лучей которого вкушают чакоры сердец преданных); ко 'пи гауранга-чандрах — некий неописуемый Пуруша Шри Гаурачандра; бхагья-удая-ручира-шачи-гарбха-дугдха-амбурашех — (бхагья-удая — восход удачи, ручира — прекраснейшая; из молочного океана лона Шачидеви); удбхутах — взошедший; [сан — будучи]; бхати — сияет</w:t>
       </w:r>
     </w:p>
     <w:p>

</xml_diff>